<commit_message>
In the On-Spec Production Percentage KPI solved
In the On-Spec Production Percentage KPI  works now.
There are 3 new  problems when generating the bluebook. The Unit of Measure, Reporting Source, and the Comments. Unit disappear now and shown sentence as shown below. The comments desappear show anything at all.
output from the table:
Unit of Measure	:See calculation and context for the most appropriate unit.
Reporting Source:	Typically sourced from process historians, production logs, or execution systems.
Comments:
</commit_message>
<xml_diff>
--- a/help/Technical Document.docx
+++ b/help/Technical Document.docx
@@ -683,27 +683,7 @@
           <w:sz w:val="18"/>
           <w:szCs w:val="18"/>
         </w:rPr>
-        <w:t xml:space="preserve">Figure. </w:t>
-      </w:r>
-      <w:r>
-        <w:rPr>
-          <w:b/>
-          <w:bCs/>
-          <w:color w:val="000000"/>
-          <w:sz w:val="18"/>
-          <w:szCs w:val="18"/>
-        </w:rPr>
-        <w:t>2</w:t>
-      </w:r>
-      <w:r>
-        <w:rPr>
-          <w:b/>
-          <w:bCs/>
-          <w:color w:val="000000"/>
-          <w:sz w:val="18"/>
-          <w:szCs w:val="18"/>
-        </w:rPr>
-        <w:t>.</w:t>
+        <w:t>Figure. 2.</w:t>
       </w:r>
       <w:r>
         <w:rPr>
@@ -743,15 +723,7 @@
           <w:sz w:val="18"/>
           <w:szCs w:val="18"/>
         </w:rPr>
-        <w:t xml:space="preserve"> </w:t>
-      </w:r>
-      <w:r>
-        <w:rPr>
-          <w:color w:val="000000"/>
-          <w:sz w:val="18"/>
-          <w:szCs w:val="18"/>
-        </w:rPr>
-        <w:t xml:space="preserve">KPI generated by &amp; interactive bluebook that was generated by </w:t>
+        <w:t xml:space="preserve"> KPI generated by &amp; interactive bluebook that was generated by </w:t>
       </w:r>
       <w:r>
         <w:rPr>
@@ -851,27 +823,7 @@
           <w:sz w:val="18"/>
           <w:szCs w:val="18"/>
         </w:rPr>
-        <w:t xml:space="preserve">Figure. </w:t>
-      </w:r>
-      <w:r>
-        <w:rPr>
-          <w:b/>
-          <w:bCs/>
-          <w:color w:val="000000"/>
-          <w:sz w:val="18"/>
-          <w:szCs w:val="18"/>
-        </w:rPr>
-        <w:t>3</w:t>
-      </w:r>
-      <w:r>
-        <w:rPr>
-          <w:b/>
-          <w:bCs/>
-          <w:color w:val="000000"/>
-          <w:sz w:val="18"/>
-          <w:szCs w:val="18"/>
-        </w:rPr>
-        <w:t>.</w:t>
+        <w:t>Figure. 3.</w:t>
       </w:r>
       <w:r>
         <w:rPr>
@@ -887,31 +839,7 @@
           <w:sz w:val="18"/>
           <w:szCs w:val="18"/>
         </w:rPr>
-        <w:t xml:space="preserve"> </w:t>
-      </w:r>
-      <w:r>
-        <w:rPr>
-          <w:color w:val="000000"/>
-          <w:sz w:val="18"/>
-          <w:szCs w:val="18"/>
-        </w:rPr>
-        <w:t>[</w:t>
-      </w:r>
-      <w:r>
-        <w:rPr>
-          <w:color w:val="000000"/>
-          <w:sz w:val="18"/>
-          <w:szCs w:val="18"/>
-        </w:rPr>
-        <w:t>Daily Feedstock Throughput (tons/day)</w:t>
-      </w:r>
-      <w:r>
-        <w:rPr>
-          <w:color w:val="000000"/>
-          <w:sz w:val="18"/>
-          <w:szCs w:val="18"/>
-        </w:rPr>
-        <w:t xml:space="preserve">] </w:t>
+        <w:t xml:space="preserve"> [Daily Feedstock Throughput (tons/day)] </w:t>
       </w:r>
       <w:r>
         <w:rPr>
@@ -3129,10 +3057,193 @@
     </w:p>
     <w:p/>
     <w:p>
-      <w:r>
+      <w:pPr>
         <w:rPr>
           <w:highlight w:val="yellow"/>
         </w:rPr>
+      </w:pPr>
+    </w:p>
+    <w:p>
+      <w:pPr>
+        <w:rPr>
+          <w:highlight w:val="yellow"/>
+        </w:rPr>
+      </w:pPr>
+    </w:p>
+    <w:p>
+      <w:pPr>
+        <w:rPr>
+          <w:highlight w:val="yellow"/>
+        </w:rPr>
+      </w:pPr>
+    </w:p>
+    <w:p>
+      <w:pPr>
+        <w:rPr>
+          <w:highlight w:val="yellow"/>
+        </w:rPr>
+      </w:pPr>
+    </w:p>
+    <w:p>
+      <w:pPr>
+        <w:rPr>
+          <w:highlight w:val="yellow"/>
+        </w:rPr>
+      </w:pPr>
+    </w:p>
+    <w:p>
+      <w:pPr>
+        <w:rPr>
+          <w:highlight w:val="yellow"/>
+        </w:rPr>
+      </w:pPr>
+    </w:p>
+    <w:p>
+      <w:pPr>
+        <w:rPr>
+          <w:highlight w:val="yellow"/>
+        </w:rPr>
+      </w:pPr>
+    </w:p>
+    <w:p>
+      <w:pPr>
+        <w:rPr>
+          <w:highlight w:val="yellow"/>
+        </w:rPr>
+      </w:pPr>
+    </w:p>
+    <w:p>
+      <w:pPr>
+        <w:rPr>
+          <w:highlight w:val="yellow"/>
+        </w:rPr>
+      </w:pPr>
+    </w:p>
+    <w:p>
+      <w:pPr>
+        <w:rPr>
+          <w:highlight w:val="yellow"/>
+        </w:rPr>
+      </w:pPr>
+    </w:p>
+    <w:p>
+      <w:pPr>
+        <w:rPr>
+          <w:highlight w:val="yellow"/>
+        </w:rPr>
+      </w:pPr>
+    </w:p>
+    <w:p>
+      <w:pPr>
+        <w:rPr>
+          <w:highlight w:val="yellow"/>
+        </w:rPr>
+      </w:pPr>
+    </w:p>
+    <w:p>
+      <w:pPr>
+        <w:rPr>
+          <w:highlight w:val="yellow"/>
+        </w:rPr>
+      </w:pPr>
+    </w:p>
+    <w:p>
+      <w:pPr>
+        <w:rPr>
+          <w:highlight w:val="yellow"/>
+        </w:rPr>
+      </w:pPr>
+    </w:p>
+    <w:p>
+      <w:pPr>
+        <w:rPr>
+          <w:highlight w:val="yellow"/>
+        </w:rPr>
+      </w:pPr>
+    </w:p>
+    <w:p>
+      <w:pPr>
+        <w:rPr>
+          <w:highlight w:val="yellow"/>
+        </w:rPr>
+      </w:pPr>
+    </w:p>
+    <w:p>
+      <w:pPr>
+        <w:rPr>
+          <w:highlight w:val="yellow"/>
+        </w:rPr>
+      </w:pPr>
+    </w:p>
+    <w:p>
+      <w:pPr>
+        <w:rPr>
+          <w:highlight w:val="yellow"/>
+        </w:rPr>
+      </w:pPr>
+    </w:p>
+    <w:p>
+      <w:pPr>
+        <w:rPr>
+          <w:highlight w:val="yellow"/>
+        </w:rPr>
+      </w:pPr>
+    </w:p>
+    <w:p>
+      <w:pPr>
+        <w:rPr>
+          <w:highlight w:val="yellow"/>
+        </w:rPr>
+      </w:pPr>
+    </w:p>
+    <w:p>
+      <w:pPr>
+        <w:rPr>
+          <w:highlight w:val="yellow"/>
+        </w:rPr>
+      </w:pPr>
+    </w:p>
+    <w:p>
+      <w:pPr>
+        <w:rPr>
+          <w:highlight w:val="yellow"/>
+        </w:rPr>
+      </w:pPr>
+    </w:p>
+    <w:p>
+      <w:pPr>
+        <w:rPr>
+          <w:highlight w:val="yellow"/>
+        </w:rPr>
+      </w:pPr>
+    </w:p>
+    <w:p>
+      <w:pPr>
+        <w:rPr>
+          <w:highlight w:val="yellow"/>
+        </w:rPr>
+      </w:pPr>
+    </w:p>
+    <w:p>
+      <w:pPr>
+        <w:rPr>
+          <w:highlight w:val="yellow"/>
+        </w:rPr>
+      </w:pPr>
+    </w:p>
+    <w:p>
+      <w:pPr>
+        <w:rPr>
+          <w:highlight w:val="yellow"/>
+        </w:rPr>
+      </w:pPr>
+    </w:p>
+    <w:p>
+      <w:r>
+        <w:rPr>
+          <w:highlight w:val="yellow"/>
+        </w:rPr>
+        <w:lastRenderedPageBreak/>
         <w:t xml:space="preserve">Option B by </w:t>
       </w:r>
       <w:r>
@@ -3141,6 +3252,9 @@
         </w:rPr>
         <w:t>PyCharm</w:t>
       </w:r>
+      <w:r>
+        <w:t xml:space="preserve"> CLI</w:t>
+      </w:r>
     </w:p>
     <w:p>
       <w:pPr>
@@ -3152,178 +3266,2095 @@
     </w:p>
     <w:p>
       <w:pPr>
-        <w:numPr>
-          <w:ilvl w:val="0"/>
-          <w:numId w:val="12"/>
-        </w:numPr>
         <w:spacing w:before="100" w:beforeAutospacing="1" w:after="100" w:afterAutospacing="1"/>
-      </w:pPr>
-      <w:r>
-        <w:t xml:space="preserve">bluebook_generator/ Python package </w:t>
-      </w:r>
-    </w:p>
-    <w:p>
-      <w:pPr>
-        <w:numPr>
-          <w:ilvl w:val="1"/>
-          <w:numId w:val="12"/>
-        </w:numPr>
-        <w:spacing w:before="100" w:beforeAutospacing="1" w:after="100" w:afterAutospacing="1"/>
-      </w:pPr>
-      <w:r>
-        <w:rPr>
-          <w:rStyle w:val="Strong"/>
-          <w:rFonts w:eastAsiaTheme="majorEastAsia"/>
-        </w:rPr>
-        <w:t>init</w:t>
-      </w:r>
-      <w:r>
+        <w:rPr>
+          <w:color w:val="000000"/>
+        </w:rPr>
+      </w:pPr>
+      <w:r>
+        <w:rPr>
+          <w:color w:val="000000"/>
+        </w:rPr>
+        <w:t xml:space="preserve">This </w:t>
+      </w:r>
+      <w:r>
+        <w:rPr>
+          <w:color w:val="000000"/>
+        </w:rPr>
+        <w:t>section</w:t>
+      </w:r>
+      <w:r>
+        <w:rPr>
+          <w:color w:val="000000"/>
+        </w:rPr>
+        <w:t xml:space="preserve"> the definitive, </w:t>
+      </w:r>
+      <w:r>
+        <w:rPr>
+          <w:color w:val="000000"/>
+        </w:rPr>
+        <w:t>and</w:t>
+      </w:r>
+      <w:r>
+        <w:rPr>
+          <w:color w:val="000000"/>
+        </w:rPr>
+        <w:t xml:space="preserve"> functional structure for the entire project.</w:t>
+      </w:r>
+    </w:p>
+    <w:p>
+      <w:pPr>
+        <w:tabs>
+          <w:tab w:val="left" w:pos="916"/>
+          <w:tab w:val="left" w:pos="1832"/>
+          <w:tab w:val="left" w:pos="2748"/>
+          <w:tab w:val="left" w:pos="3664"/>
+          <w:tab w:val="left" w:pos="4580"/>
+          <w:tab w:val="left" w:pos="5496"/>
+          <w:tab w:val="left" w:pos="6412"/>
+          <w:tab w:val="left" w:pos="7328"/>
+          <w:tab w:val="left" w:pos="8244"/>
+          <w:tab w:val="left" w:pos="9160"/>
+          <w:tab w:val="left" w:pos="10076"/>
+          <w:tab w:val="left" w:pos="10992"/>
+          <w:tab w:val="left" w:pos="11908"/>
+          <w:tab w:val="left" w:pos="12824"/>
+          <w:tab w:val="left" w:pos="13740"/>
+          <w:tab w:val="left" w:pos="14656"/>
+        </w:tabs>
+        <w:rPr>
+          <w:rFonts w:ascii="Courier New" w:hAnsi="Courier New" w:cs="Courier New"/>
+          <w:color w:val="000000" w:themeColor="text1"/>
+          <w:sz w:val="18"/>
+          <w:szCs w:val="18"/>
+        </w:rPr>
+      </w:pPr>
+      <w:r>
+        <w:rPr>
+          <w:rFonts w:ascii="Courier New" w:hAnsi="Courier New" w:cs="Courier New"/>
+          <w:color w:val="000000" w:themeColor="text1"/>
+          <w:sz w:val="18"/>
+          <w:szCs w:val="18"/>
+        </w:rPr>
+        <w:t>AI-Powered_KPI_Extractor_Interactive_Bluebook_Generator</w:t>
+      </w:r>
+      <w:r>
+        <w:rPr>
+          <w:rFonts w:ascii="Courier New" w:hAnsi="Courier New" w:cs="Courier New"/>
+          <w:color w:val="000000" w:themeColor="text1"/>
+          <w:sz w:val="18"/>
+          <w:szCs w:val="18"/>
+        </w:rPr>
+        <w:t>/</w:t>
+      </w:r>
+    </w:p>
+    <w:p>
+      <w:pPr>
+        <w:tabs>
+          <w:tab w:val="left" w:pos="916"/>
+          <w:tab w:val="left" w:pos="1832"/>
+          <w:tab w:val="left" w:pos="2748"/>
+          <w:tab w:val="left" w:pos="3664"/>
+          <w:tab w:val="left" w:pos="4580"/>
+          <w:tab w:val="left" w:pos="5496"/>
+          <w:tab w:val="left" w:pos="6412"/>
+          <w:tab w:val="left" w:pos="7328"/>
+          <w:tab w:val="left" w:pos="8244"/>
+          <w:tab w:val="left" w:pos="9160"/>
+          <w:tab w:val="left" w:pos="10076"/>
+          <w:tab w:val="left" w:pos="10992"/>
+          <w:tab w:val="left" w:pos="11908"/>
+          <w:tab w:val="left" w:pos="12824"/>
+          <w:tab w:val="left" w:pos="13740"/>
+          <w:tab w:val="left" w:pos="14656"/>
+        </w:tabs>
+        <w:rPr>
+          <w:rFonts w:ascii="Courier New" w:hAnsi="Courier New" w:cs="Courier New"/>
+          <w:color w:val="000000" w:themeColor="text1"/>
+          <w:sz w:val="18"/>
+          <w:szCs w:val="18"/>
+        </w:rPr>
+      </w:pPr>
+      <w:r>
+        <w:rPr>
+          <w:rFonts w:ascii="Courier New" w:hAnsi="Courier New" w:cs="Courier New"/>
+          <w:color w:val="000000" w:themeColor="text1"/>
+          <w:sz w:val="18"/>
+          <w:szCs w:val="18"/>
+        </w:rPr>
+        <w:t>├── .env</w:t>
+      </w:r>
+      <w:r>
+        <w:rPr>
+          <w:rFonts w:ascii="Courier New" w:hAnsi="Courier New" w:cs="Courier New"/>
+          <w:color w:val="000000" w:themeColor="text1"/>
+          <w:sz w:val="18"/>
+          <w:szCs w:val="18"/>
+        </w:rPr>
+        <w:tab/>
+      </w:r>
+      <w:r>
+        <w:rPr>
+          <w:rFonts w:ascii="Courier New" w:hAnsi="Courier New" w:cs="Courier New"/>
+          <w:color w:val="000000" w:themeColor="text1"/>
+          <w:sz w:val="18"/>
+          <w:szCs w:val="18"/>
+        </w:rPr>
+        <w:tab/>
+      </w:r>
+      <w:r>
+        <w:rPr>
+          <w:rFonts w:ascii="Courier New" w:hAnsi="Courier New" w:cs="Courier New"/>
+          <w:color w:val="000000" w:themeColor="text1"/>
+          <w:sz w:val="18"/>
+          <w:szCs w:val="18"/>
+        </w:rPr>
+        <w:tab/>
+      </w:r>
+      <w:r>
+        <w:rPr>
+          <w:rFonts w:ascii="Courier New" w:hAnsi="Courier New" w:cs="Courier New"/>
+          <w:color w:val="000000" w:themeColor="text1"/>
+          <w:sz w:val="18"/>
+          <w:szCs w:val="18"/>
+        </w:rPr>
+        <w:tab/>
+        <w:t xml:space="preserve">  </w:t>
+      </w:r>
+      <w:r>
+        <w:rPr>
+          <w:rFonts w:ascii="Courier New" w:hAnsi="Courier New" w:cs="Courier New"/>
+          <w:sz w:val="18"/>
+          <w:szCs w:val="18"/>
+        </w:rPr>
+        <w:t># Stores your secret OpenAI API key.</w:t>
+      </w:r>
+    </w:p>
+    <w:p>
+      <w:pPr>
+        <w:tabs>
+          <w:tab w:val="left" w:pos="916"/>
+          <w:tab w:val="left" w:pos="1832"/>
+          <w:tab w:val="left" w:pos="2748"/>
+          <w:tab w:val="left" w:pos="3664"/>
+          <w:tab w:val="left" w:pos="4580"/>
+          <w:tab w:val="left" w:pos="5496"/>
+          <w:tab w:val="left" w:pos="6412"/>
+          <w:tab w:val="left" w:pos="7328"/>
+          <w:tab w:val="left" w:pos="8244"/>
+          <w:tab w:val="left" w:pos="9160"/>
+          <w:tab w:val="left" w:pos="10076"/>
+          <w:tab w:val="left" w:pos="10992"/>
+          <w:tab w:val="left" w:pos="11908"/>
+          <w:tab w:val="left" w:pos="12824"/>
+          <w:tab w:val="left" w:pos="13740"/>
+          <w:tab w:val="left" w:pos="14656"/>
+        </w:tabs>
+        <w:rPr>
+          <w:rFonts w:ascii="Courier New" w:hAnsi="Courier New" w:cs="Courier New"/>
+          <w:color w:val="000000" w:themeColor="text1"/>
+          <w:sz w:val="18"/>
+          <w:szCs w:val="18"/>
+        </w:rPr>
+      </w:pPr>
+      <w:r>
+        <w:rPr>
+          <w:rFonts w:ascii="Courier New" w:hAnsi="Courier New" w:cs="Courier New"/>
+          <w:color w:val="000000" w:themeColor="text1"/>
+          <w:sz w:val="18"/>
+          <w:szCs w:val="18"/>
+        </w:rPr>
+        <w:t>├── .venv/</w:t>
+      </w:r>
+      <w:r>
+        <w:rPr>
+          <w:rFonts w:ascii="Courier New" w:hAnsi="Courier New" w:cs="Courier New"/>
+          <w:color w:val="000000" w:themeColor="text1"/>
+          <w:sz w:val="18"/>
+          <w:szCs w:val="18"/>
+        </w:rPr>
+        <w:tab/>
+      </w:r>
+      <w:r>
+        <w:rPr>
+          <w:rFonts w:ascii="Courier New" w:hAnsi="Courier New" w:cs="Courier New"/>
+          <w:color w:val="000000" w:themeColor="text1"/>
+          <w:sz w:val="18"/>
+          <w:szCs w:val="18"/>
+        </w:rPr>
+        <w:tab/>
+      </w:r>
+      <w:r>
+        <w:rPr>
+          <w:rFonts w:ascii="Courier New" w:hAnsi="Courier New" w:cs="Courier New"/>
+          <w:color w:val="000000" w:themeColor="text1"/>
+          <w:sz w:val="18"/>
+          <w:szCs w:val="18"/>
+        </w:rPr>
+        <w:tab/>
+        <w:t xml:space="preserve">  </w:t>
+      </w:r>
+      <w:r>
+        <w:rPr>
+          <w:rFonts w:ascii="Courier New" w:hAnsi="Courier New" w:cs="Courier New"/>
+          <w:sz w:val="18"/>
+          <w:szCs w:val="18"/>
+        </w:rPr>
+        <w:t># Your Python virtual environment folder.</w:t>
+      </w:r>
+    </w:p>
+    <w:p>
+      <w:pPr>
+        <w:tabs>
+          <w:tab w:val="left" w:pos="916"/>
+          <w:tab w:val="left" w:pos="1832"/>
+          <w:tab w:val="left" w:pos="2748"/>
+          <w:tab w:val="left" w:pos="3664"/>
+          <w:tab w:val="left" w:pos="4580"/>
+          <w:tab w:val="left" w:pos="5496"/>
+          <w:tab w:val="left" w:pos="6412"/>
+          <w:tab w:val="left" w:pos="7328"/>
+          <w:tab w:val="left" w:pos="8244"/>
+          <w:tab w:val="left" w:pos="9160"/>
+          <w:tab w:val="left" w:pos="10076"/>
+          <w:tab w:val="left" w:pos="10992"/>
+          <w:tab w:val="left" w:pos="11908"/>
+          <w:tab w:val="left" w:pos="12824"/>
+          <w:tab w:val="left" w:pos="13740"/>
+          <w:tab w:val="left" w:pos="14656"/>
+        </w:tabs>
+        <w:rPr>
+          <w:rFonts w:ascii="Courier New" w:hAnsi="Courier New" w:cs="Courier New"/>
+          <w:color w:val="000000" w:themeColor="text1"/>
+          <w:sz w:val="18"/>
+          <w:szCs w:val="18"/>
+        </w:rPr>
+      </w:pPr>
+      <w:r>
+        <w:rPr>
+          <w:rFonts w:ascii="Courier New" w:hAnsi="Courier New" w:cs="Courier New"/>
+          <w:color w:val="000000" w:themeColor="text1"/>
+          <w:sz w:val="18"/>
+          <w:szCs w:val="18"/>
+        </w:rPr>
+        <w:t xml:space="preserve">├── app.py                          </w:t>
+      </w:r>
+      <w:r>
+        <w:rPr>
+          <w:rFonts w:ascii="Courier New" w:hAnsi="Courier New" w:cs="Courier New"/>
+          <w:sz w:val="18"/>
+          <w:szCs w:val="18"/>
+        </w:rPr>
+        <w:t># The main Flask web application that you run.</w:t>
+      </w:r>
+    </w:p>
+    <w:p>
+      <w:pPr>
+        <w:tabs>
+          <w:tab w:val="left" w:pos="916"/>
+          <w:tab w:val="left" w:pos="1832"/>
+          <w:tab w:val="left" w:pos="2748"/>
+          <w:tab w:val="left" w:pos="3664"/>
+          <w:tab w:val="left" w:pos="4580"/>
+          <w:tab w:val="left" w:pos="5496"/>
+          <w:tab w:val="left" w:pos="6412"/>
+          <w:tab w:val="left" w:pos="7328"/>
+          <w:tab w:val="left" w:pos="8244"/>
+          <w:tab w:val="left" w:pos="9160"/>
+          <w:tab w:val="left" w:pos="10076"/>
+          <w:tab w:val="left" w:pos="10992"/>
+          <w:tab w:val="left" w:pos="11908"/>
+          <w:tab w:val="left" w:pos="12824"/>
+          <w:tab w:val="left" w:pos="13740"/>
+          <w:tab w:val="left" w:pos="14656"/>
+        </w:tabs>
+        <w:rPr>
+          <w:rFonts w:ascii="Courier New" w:hAnsi="Courier New" w:cs="Courier New"/>
+          <w:color w:val="000000" w:themeColor="text1"/>
+          <w:sz w:val="18"/>
+          <w:szCs w:val="18"/>
+        </w:rPr>
+      </w:pPr>
+      <w:r>
+        <w:rPr>
+          <w:rFonts w:ascii="Courier New" w:hAnsi="Courier New" w:cs="Courier New"/>
+          <w:color w:val="000000" w:themeColor="text1"/>
+          <w:sz w:val="18"/>
+          <w:szCs w:val="18"/>
+        </w:rPr>
+        <w:t>├── bluebook_generator/</w:t>
+      </w:r>
+      <w:r>
+        <w:rPr>
+          <w:rFonts w:ascii="Courier New" w:hAnsi="Courier New" w:cs="Courier New"/>
+          <w:color w:val="000000" w:themeColor="text1"/>
+          <w:sz w:val="18"/>
+          <w:szCs w:val="18"/>
+        </w:rPr>
+        <w:tab/>
+      </w:r>
+      <w:r>
+        <w:rPr>
+          <w:rFonts w:ascii="Courier New" w:hAnsi="Courier New" w:cs="Courier New"/>
+          <w:color w:val="000000" w:themeColor="text1"/>
+          <w:sz w:val="18"/>
+          <w:szCs w:val="18"/>
+        </w:rPr>
+        <w:tab/>
+        <w:t xml:space="preserve">  </w:t>
+      </w:r>
+      <w:r>
+        <w:rPr>
+          <w:rFonts w:ascii="Courier New" w:hAnsi="Courier New" w:cs="Courier New"/>
+          <w:sz w:val="18"/>
+          <w:szCs w:val="18"/>
+        </w:rPr>
+        <w:t># The core Python package for the generator logic.</w:t>
+      </w:r>
+    </w:p>
+    <w:p>
+      <w:pPr>
+        <w:tabs>
+          <w:tab w:val="left" w:pos="916"/>
+          <w:tab w:val="left" w:pos="1832"/>
+          <w:tab w:val="left" w:pos="2748"/>
+          <w:tab w:val="left" w:pos="3664"/>
+          <w:tab w:val="left" w:pos="4580"/>
+          <w:tab w:val="left" w:pos="5496"/>
+          <w:tab w:val="left" w:pos="6412"/>
+          <w:tab w:val="left" w:pos="7328"/>
+          <w:tab w:val="left" w:pos="8244"/>
+          <w:tab w:val="left" w:pos="9160"/>
+          <w:tab w:val="left" w:pos="10076"/>
+          <w:tab w:val="left" w:pos="10992"/>
+          <w:tab w:val="left" w:pos="11908"/>
+          <w:tab w:val="left" w:pos="12824"/>
+          <w:tab w:val="left" w:pos="13740"/>
+          <w:tab w:val="left" w:pos="14656"/>
+        </w:tabs>
+        <w:rPr>
+          <w:rFonts w:ascii="Courier New" w:hAnsi="Courier New" w:cs="Courier New"/>
+          <w:color w:val="000000" w:themeColor="text1"/>
+          <w:sz w:val="18"/>
+          <w:szCs w:val="18"/>
+        </w:rPr>
+      </w:pPr>
+      <w:r>
+        <w:rPr>
+          <w:rFonts w:ascii="Courier New" w:hAnsi="Courier New" w:cs="Courier New"/>
+          <w:color w:val="000000" w:themeColor="text1"/>
+          <w:sz w:val="18"/>
+          <w:szCs w:val="18"/>
+        </w:rPr>
+        <w:t>│   ├── __init__.py</w:t>
+      </w:r>
+      <w:r>
+        <w:rPr>
+          <w:rFonts w:ascii="Courier New" w:hAnsi="Courier New" w:cs="Courier New"/>
+          <w:color w:val="000000" w:themeColor="text1"/>
+          <w:sz w:val="18"/>
+          <w:szCs w:val="18"/>
+        </w:rPr>
+        <w:tab/>
+      </w:r>
+      <w:r>
+        <w:rPr>
+          <w:rFonts w:ascii="Courier New" w:hAnsi="Courier New" w:cs="Courier New"/>
+          <w:color w:val="000000" w:themeColor="text1"/>
+          <w:sz w:val="18"/>
+          <w:szCs w:val="18"/>
+        </w:rPr>
+        <w:tab/>
+        <w:t xml:space="preserve">  </w:t>
+      </w:r>
+      <w:r>
+        <w:rPr>
+          <w:rFonts w:ascii="Courier New" w:hAnsi="Courier New" w:cs="Courier New"/>
+          <w:sz w:val="18"/>
+          <w:szCs w:val="18"/>
+        </w:rPr>
+        <w:t># Makes this folder a Python package.</w:t>
+      </w:r>
+    </w:p>
+    <w:p>
+      <w:pPr>
+        <w:tabs>
+          <w:tab w:val="left" w:pos="916"/>
+          <w:tab w:val="left" w:pos="1832"/>
+          <w:tab w:val="left" w:pos="2748"/>
+          <w:tab w:val="left" w:pos="3664"/>
+          <w:tab w:val="left" w:pos="4580"/>
+          <w:tab w:val="left" w:pos="5496"/>
+          <w:tab w:val="left" w:pos="6412"/>
+          <w:tab w:val="left" w:pos="7328"/>
+          <w:tab w:val="left" w:pos="8244"/>
+          <w:tab w:val="left" w:pos="9160"/>
+          <w:tab w:val="left" w:pos="10076"/>
+          <w:tab w:val="left" w:pos="10992"/>
+          <w:tab w:val="left" w:pos="11908"/>
+          <w:tab w:val="left" w:pos="12824"/>
+          <w:tab w:val="left" w:pos="13740"/>
+          <w:tab w:val="left" w:pos="14656"/>
+        </w:tabs>
+        <w:rPr>
+          <w:rFonts w:ascii="Courier New" w:hAnsi="Courier New" w:cs="Courier New"/>
+          <w:color w:val="000000" w:themeColor="text1"/>
+          <w:sz w:val="18"/>
+          <w:szCs w:val="18"/>
+        </w:rPr>
+      </w:pPr>
+      <w:r>
+        <w:rPr>
+          <w:rFonts w:ascii="Courier New" w:hAnsi="Courier New" w:cs="Courier New"/>
+          <w:color w:val="000000" w:themeColor="text1"/>
+          <w:sz w:val="18"/>
+          <w:szCs w:val="18"/>
+        </w:rPr>
+        <w:t xml:space="preserve">│   ├── </w:t>
+      </w:r>
+      <w:r>
+        <w:rPr>
+          <w:rFonts w:ascii="Courier New" w:hAnsi="Courier New" w:cs="Courier New"/>
+          <w:color w:val="000000" w:themeColor="text1"/>
+          <w:sz w:val="18"/>
+          <w:szCs w:val="18"/>
+        </w:rPr>
+        <w:t>Version</w:t>
+      </w:r>
+      <w:r>
+        <w:rPr>
+          <w:rFonts w:ascii="Courier New" w:hAnsi="Courier New" w:cs="Courier New"/>
+          <w:color w:val="000000" w:themeColor="text1"/>
+          <w:sz w:val="18"/>
+          <w:szCs w:val="18"/>
+        </w:rPr>
         <w:t>.py</w:t>
       </w:r>
-    </w:p>
-    <w:p>
-      <w:pPr>
-        <w:numPr>
-          <w:ilvl w:val="1"/>
-          <w:numId w:val="12"/>
-        </w:numPr>
-        <w:spacing w:before="100" w:beforeAutospacing="1" w:after="100" w:afterAutospacing="1"/>
-      </w:pPr>
-      <w:r>
-        <w:t>version.py</w:t>
-      </w:r>
-    </w:p>
-    <w:p>
-      <w:pPr>
-        <w:numPr>
-          <w:ilvl w:val="1"/>
-          <w:numId w:val="12"/>
-        </w:numPr>
-        <w:spacing w:before="100" w:beforeAutospacing="1" w:after="100" w:afterAutospacing="1"/>
-      </w:pPr>
-      <w:r>
-        <w:t>cli.py CLI entrypoint (bluebook)</w:t>
-      </w:r>
-    </w:p>
-    <w:p>
-      <w:pPr>
-        <w:numPr>
-          <w:ilvl w:val="1"/>
-          <w:numId w:val="12"/>
-        </w:numPr>
-        <w:spacing w:before="100" w:beforeAutospacing="1" w:after="100" w:afterAutospacing="1"/>
-      </w:pPr>
-      <w:r>
-        <w:t>main.py Orchestrates extraction → AI → render → build</w:t>
-      </w:r>
-    </w:p>
-    <w:p>
-      <w:pPr>
-        <w:numPr>
-          <w:ilvl w:val="1"/>
-          <w:numId w:val="12"/>
-        </w:numPr>
-        <w:spacing w:before="100" w:beforeAutospacing="1" w:after="100" w:afterAutospacing="1"/>
-      </w:pPr>
-      <w:r>
-        <w:t>ai_generator.py AI content (text) + unit inference</w:t>
-      </w:r>
-    </w:p>
-    <w:p>
-      <w:pPr>
-        <w:numPr>
-          <w:ilvl w:val="1"/>
-          <w:numId w:val="12"/>
-        </w:numPr>
-        <w:spacing w:before="100" w:beforeAutospacing="1" w:after="100" w:afterAutospacing="1"/>
-      </w:pPr>
-      <w:r>
-        <w:t>kpi_extractor.py Finds KPI blocks in source code</w:t>
-      </w:r>
-    </w:p>
-    <w:p>
-      <w:pPr>
-        <w:numPr>
-          <w:ilvl w:val="1"/>
-          <w:numId w:val="12"/>
-        </w:numPr>
-        <w:spacing w:before="100" w:beforeAutospacing="1" w:after="100" w:afterAutospacing="1"/>
-      </w:pPr>
-      <w:r>
-        <w:t>utils.py Helpers (formatters, IO)</w:t>
-      </w:r>
-    </w:p>
-    <w:p>
-      <w:pPr>
-        <w:numPr>
-          <w:ilvl w:val="0"/>
-          <w:numId w:val="12"/>
-        </w:numPr>
-        <w:spacing w:before="100" w:beforeAutospacing="1" w:after="100" w:afterAutospacing="1"/>
-      </w:pPr>
-      <w:r>
-        <w:t xml:space="preserve">templates/ </w:t>
-      </w:r>
-    </w:p>
-    <w:p>
-      <w:pPr>
-        <w:numPr>
-          <w:ilvl w:val="1"/>
-          <w:numId w:val="12"/>
-        </w:numPr>
-        <w:spacing w:before="100" w:beforeAutospacing="1" w:after="100" w:afterAutospacing="1"/>
-      </w:pPr>
-      <w:r>
-        <w:t>kpi_template.rst.j2 Sphinx/RST template for each KPI page</w:t>
-      </w:r>
-    </w:p>
-    <w:p>
-      <w:pPr>
-        <w:numPr>
-          <w:ilvl w:val="0"/>
-          <w:numId w:val="12"/>
-        </w:numPr>
-        <w:spacing w:before="100" w:beforeAutospacing="1" w:after="100" w:afterAutospacing="1"/>
-      </w:pPr>
-      <w:r>
-        <w:t xml:space="preserve">docs/ </w:t>
-      </w:r>
-    </w:p>
-    <w:p>
-      <w:pPr>
-        <w:numPr>
-          <w:ilvl w:val="1"/>
-          <w:numId w:val="12"/>
-        </w:numPr>
-        <w:spacing w:before="100" w:beforeAutospacing="1" w:after="100" w:afterAutospacing="1"/>
-      </w:pPr>
-      <w:r>
-        <w:t>index.rst Auto-updated by generator</w:t>
-      </w:r>
-    </w:p>
-    <w:p>
-      <w:pPr>
-        <w:numPr>
-          <w:ilvl w:val="0"/>
-          <w:numId w:val="12"/>
-        </w:numPr>
-        <w:spacing w:before="100" w:beforeAutospacing="1" w:after="100" w:afterAutospacing="1"/>
-      </w:pPr>
-      <w:r>
-        <w:t>KPI_Inrctive_Bluebook.plantuml UML + Flowchart</w:t>
-      </w:r>
-    </w:p>
-    <w:p>
-      <w:pPr>
-        <w:numPr>
-          <w:ilvl w:val="0"/>
-          <w:numId w:val="12"/>
-        </w:numPr>
-        <w:spacing w:before="100" w:beforeAutospacing="1" w:after="100" w:afterAutospacing="1"/>
-      </w:pPr>
-      <w:r>
-        <w:t>README.md Cookbook + Technical intro</w:t>
-      </w:r>
+      <w:r>
+        <w:rPr>
+          <w:rFonts w:ascii="Courier New" w:hAnsi="Courier New" w:cs="Courier New"/>
+          <w:color w:val="000000" w:themeColor="text1"/>
+          <w:sz w:val="18"/>
+          <w:szCs w:val="18"/>
+        </w:rPr>
+        <w:tab/>
+      </w:r>
+      <w:r>
+        <w:rPr>
+          <w:rFonts w:ascii="Courier New" w:hAnsi="Courier New" w:cs="Courier New"/>
+          <w:color w:val="000000" w:themeColor="text1"/>
+          <w:sz w:val="18"/>
+          <w:szCs w:val="18"/>
+        </w:rPr>
+        <w:tab/>
+        <w:t xml:space="preserve">  </w:t>
+      </w:r>
+      <w:r>
+        <w:rPr>
+          <w:rFonts w:ascii="Courier New" w:hAnsi="Courier New" w:cs="Courier New"/>
+          <w:sz w:val="18"/>
+          <w:szCs w:val="18"/>
+        </w:rPr>
+        <w:t xml:space="preserve"># </w:t>
+      </w:r>
+    </w:p>
+    <w:p>
+      <w:pPr>
+        <w:tabs>
+          <w:tab w:val="left" w:pos="916"/>
+          <w:tab w:val="left" w:pos="1832"/>
+          <w:tab w:val="left" w:pos="2748"/>
+          <w:tab w:val="left" w:pos="3664"/>
+          <w:tab w:val="left" w:pos="4580"/>
+          <w:tab w:val="left" w:pos="5496"/>
+          <w:tab w:val="left" w:pos="6412"/>
+          <w:tab w:val="left" w:pos="7328"/>
+          <w:tab w:val="left" w:pos="8244"/>
+          <w:tab w:val="left" w:pos="9160"/>
+          <w:tab w:val="left" w:pos="10076"/>
+          <w:tab w:val="left" w:pos="10992"/>
+          <w:tab w:val="left" w:pos="11908"/>
+          <w:tab w:val="left" w:pos="12824"/>
+          <w:tab w:val="left" w:pos="13740"/>
+          <w:tab w:val="left" w:pos="14656"/>
+        </w:tabs>
+        <w:rPr>
+          <w:rFonts w:ascii="Courier New" w:hAnsi="Courier New" w:cs="Courier New"/>
+          <w:color w:val="000000" w:themeColor="text1"/>
+          <w:sz w:val="18"/>
+          <w:szCs w:val="18"/>
+        </w:rPr>
+      </w:pPr>
+      <w:r>
+        <w:rPr>
+          <w:rFonts w:ascii="Courier New" w:hAnsi="Courier New" w:cs="Courier New"/>
+          <w:color w:val="000000" w:themeColor="text1"/>
+          <w:sz w:val="18"/>
+          <w:szCs w:val="18"/>
+        </w:rPr>
+        <w:t xml:space="preserve">│   ├── </w:t>
+      </w:r>
+      <w:r>
+        <w:rPr>
+          <w:rFonts w:ascii="Courier New" w:hAnsi="Courier New" w:cs="Courier New"/>
+          <w:color w:val="000000" w:themeColor="text1"/>
+          <w:sz w:val="18"/>
+          <w:szCs w:val="18"/>
+        </w:rPr>
+        <w:t>cli</w:t>
+      </w:r>
+      <w:r>
+        <w:rPr>
+          <w:rFonts w:ascii="Courier New" w:hAnsi="Courier New" w:cs="Courier New"/>
+          <w:color w:val="000000" w:themeColor="text1"/>
+          <w:sz w:val="18"/>
+          <w:szCs w:val="18"/>
+        </w:rPr>
+        <w:t>.py</w:t>
+      </w:r>
+      <w:r>
+        <w:rPr>
+          <w:rFonts w:ascii="Courier New" w:hAnsi="Courier New" w:cs="Courier New"/>
+          <w:color w:val="000000" w:themeColor="text1"/>
+          <w:sz w:val="18"/>
+          <w:szCs w:val="18"/>
+        </w:rPr>
+        <w:tab/>
+      </w:r>
+      <w:r>
+        <w:rPr>
+          <w:rFonts w:ascii="Courier New" w:hAnsi="Courier New" w:cs="Courier New"/>
+          <w:color w:val="000000" w:themeColor="text1"/>
+          <w:sz w:val="18"/>
+          <w:szCs w:val="18"/>
+        </w:rPr>
+        <w:tab/>
+        <w:t xml:space="preserve"> </w:t>
+      </w:r>
+      <w:r>
+        <w:rPr>
+          <w:rFonts w:ascii="Courier New" w:hAnsi="Courier New" w:cs="Courier New"/>
+          <w:color w:val="000000" w:themeColor="text1"/>
+          <w:sz w:val="18"/>
+          <w:szCs w:val="18"/>
+        </w:rPr>
+        <w:tab/>
+        <w:t xml:space="preserve"> </w:t>
+      </w:r>
+      <w:r>
+        <w:rPr>
+          <w:rFonts w:ascii="Courier New" w:hAnsi="Courier New" w:cs="Courier New"/>
+          <w:color w:val="000000" w:themeColor="text1"/>
+          <w:sz w:val="18"/>
+          <w:szCs w:val="18"/>
+        </w:rPr>
+        <w:t xml:space="preserve"> </w:t>
+      </w:r>
+      <w:r>
+        <w:rPr>
+          <w:rFonts w:ascii="Courier New" w:hAnsi="Courier New" w:cs="Courier New"/>
+          <w:sz w:val="18"/>
+          <w:szCs w:val="18"/>
+        </w:rPr>
+        <w:t xml:space="preserve"># </w:t>
+      </w:r>
+      <w:r>
+        <w:rPr>
+          <w:rFonts w:ascii="Courier New" w:hAnsi="Courier New" w:cs="Courier New"/>
+          <w:sz w:val="18"/>
+          <w:szCs w:val="18"/>
+        </w:rPr>
+        <w:t>CLI entrypoint (bluebook)</w:t>
+      </w:r>
+    </w:p>
+    <w:p>
+      <w:pPr>
+        <w:tabs>
+          <w:tab w:val="left" w:pos="916"/>
+          <w:tab w:val="left" w:pos="1832"/>
+          <w:tab w:val="left" w:pos="2748"/>
+          <w:tab w:val="left" w:pos="3664"/>
+          <w:tab w:val="left" w:pos="4580"/>
+          <w:tab w:val="left" w:pos="5496"/>
+          <w:tab w:val="left" w:pos="6412"/>
+          <w:tab w:val="left" w:pos="7328"/>
+          <w:tab w:val="left" w:pos="8244"/>
+          <w:tab w:val="left" w:pos="9160"/>
+          <w:tab w:val="left" w:pos="10076"/>
+          <w:tab w:val="left" w:pos="10992"/>
+          <w:tab w:val="left" w:pos="11908"/>
+          <w:tab w:val="left" w:pos="12824"/>
+          <w:tab w:val="left" w:pos="13740"/>
+          <w:tab w:val="left" w:pos="14656"/>
+        </w:tabs>
+        <w:rPr>
+          <w:rFonts w:ascii="Courier New" w:hAnsi="Courier New" w:cs="Courier New"/>
+          <w:color w:val="000000" w:themeColor="text1"/>
+          <w:sz w:val="18"/>
+          <w:szCs w:val="18"/>
+        </w:rPr>
+      </w:pPr>
+      <w:r>
+        <w:rPr>
+          <w:rFonts w:ascii="Courier New" w:hAnsi="Courier New" w:cs="Courier New"/>
+          <w:color w:val="000000" w:themeColor="text1"/>
+          <w:sz w:val="18"/>
+          <w:szCs w:val="18"/>
+        </w:rPr>
+        <w:t xml:space="preserve">│   ├── </w:t>
+      </w:r>
+      <w:r>
+        <w:rPr>
+          <w:rFonts w:ascii="Courier New" w:hAnsi="Courier New" w:cs="Courier New"/>
+          <w:color w:val="000000" w:themeColor="text1"/>
+          <w:sz w:val="18"/>
+          <w:szCs w:val="18"/>
+        </w:rPr>
+        <w:t>Version</w:t>
+      </w:r>
+      <w:r>
+        <w:rPr>
+          <w:rFonts w:ascii="Courier New" w:hAnsi="Courier New" w:cs="Courier New"/>
+          <w:color w:val="000000" w:themeColor="text1"/>
+          <w:sz w:val="18"/>
+          <w:szCs w:val="18"/>
+        </w:rPr>
+        <w:t>.py</w:t>
+      </w:r>
+      <w:r>
+        <w:rPr>
+          <w:rFonts w:ascii="Courier New" w:hAnsi="Courier New" w:cs="Courier New"/>
+          <w:color w:val="000000" w:themeColor="text1"/>
+          <w:sz w:val="18"/>
+          <w:szCs w:val="18"/>
+        </w:rPr>
+        <w:tab/>
+      </w:r>
+      <w:r>
+        <w:rPr>
+          <w:rFonts w:ascii="Courier New" w:hAnsi="Courier New" w:cs="Courier New"/>
+          <w:color w:val="000000" w:themeColor="text1"/>
+          <w:sz w:val="18"/>
+          <w:szCs w:val="18"/>
+        </w:rPr>
+        <w:tab/>
+        <w:t xml:space="preserve">  </w:t>
+      </w:r>
+      <w:r>
+        <w:rPr>
+          <w:rFonts w:ascii="Courier New" w:hAnsi="Courier New" w:cs="Courier New"/>
+          <w:sz w:val="18"/>
+          <w:szCs w:val="18"/>
+        </w:rPr>
+        <w:t>#.</w:t>
+      </w:r>
+    </w:p>
+    <w:p>
+      <w:pPr>
+        <w:tabs>
+          <w:tab w:val="left" w:pos="916"/>
+          <w:tab w:val="left" w:pos="1832"/>
+          <w:tab w:val="left" w:pos="2748"/>
+          <w:tab w:val="left" w:pos="3664"/>
+          <w:tab w:val="left" w:pos="4580"/>
+          <w:tab w:val="left" w:pos="5496"/>
+          <w:tab w:val="left" w:pos="6412"/>
+          <w:tab w:val="left" w:pos="7328"/>
+          <w:tab w:val="left" w:pos="8244"/>
+          <w:tab w:val="left" w:pos="9160"/>
+          <w:tab w:val="left" w:pos="10076"/>
+          <w:tab w:val="left" w:pos="10992"/>
+          <w:tab w:val="left" w:pos="11908"/>
+          <w:tab w:val="left" w:pos="12824"/>
+          <w:tab w:val="left" w:pos="13740"/>
+          <w:tab w:val="left" w:pos="14656"/>
+        </w:tabs>
+        <w:rPr>
+          <w:rFonts w:ascii="Courier New" w:hAnsi="Courier New" w:cs="Courier New"/>
+          <w:color w:val="000000" w:themeColor="text1"/>
+          <w:sz w:val="18"/>
+          <w:szCs w:val="18"/>
+        </w:rPr>
+      </w:pPr>
+      <w:r>
+        <w:rPr>
+          <w:rFonts w:ascii="Courier New" w:hAnsi="Courier New" w:cs="Courier New"/>
+          <w:color w:val="000000" w:themeColor="text1"/>
+          <w:sz w:val="18"/>
+          <w:szCs w:val="18"/>
+        </w:rPr>
+        <w:t xml:space="preserve">│   ├── </w:t>
+      </w:r>
+      <w:r>
+        <w:rPr>
+          <w:rFonts w:ascii="Courier New" w:hAnsi="Courier New" w:cs="Courier New"/>
+          <w:color w:val="000000" w:themeColor="text1"/>
+          <w:sz w:val="18"/>
+          <w:szCs w:val="18"/>
+        </w:rPr>
+        <w:t>utils</w:t>
+      </w:r>
+      <w:r>
+        <w:rPr>
+          <w:rFonts w:ascii="Courier New" w:hAnsi="Courier New" w:cs="Courier New"/>
+          <w:color w:val="000000" w:themeColor="text1"/>
+          <w:sz w:val="18"/>
+          <w:szCs w:val="18"/>
+        </w:rPr>
+        <w:t>.py</w:t>
+      </w:r>
+      <w:r>
+        <w:rPr>
+          <w:rFonts w:ascii="Courier New" w:hAnsi="Courier New" w:cs="Courier New"/>
+          <w:color w:val="000000" w:themeColor="text1"/>
+          <w:sz w:val="18"/>
+          <w:szCs w:val="18"/>
+        </w:rPr>
+        <w:tab/>
+      </w:r>
+      <w:r>
+        <w:rPr>
+          <w:rFonts w:ascii="Courier New" w:hAnsi="Courier New" w:cs="Courier New"/>
+          <w:color w:val="000000" w:themeColor="text1"/>
+          <w:sz w:val="18"/>
+          <w:szCs w:val="18"/>
+        </w:rPr>
+        <w:tab/>
+        <w:t xml:space="preserve"> </w:t>
+      </w:r>
+      <w:r>
+        <w:rPr>
+          <w:rFonts w:ascii="Courier New" w:hAnsi="Courier New" w:cs="Courier New"/>
+          <w:color w:val="000000" w:themeColor="text1"/>
+          <w:sz w:val="18"/>
+          <w:szCs w:val="18"/>
+        </w:rPr>
+        <w:tab/>
+        <w:t xml:space="preserve"> </w:t>
+      </w:r>
+      <w:r>
+        <w:rPr>
+          <w:rFonts w:ascii="Courier New" w:hAnsi="Courier New" w:cs="Courier New"/>
+          <w:color w:val="000000" w:themeColor="text1"/>
+          <w:sz w:val="18"/>
+          <w:szCs w:val="18"/>
+        </w:rPr>
+        <w:t xml:space="preserve"> </w:t>
+      </w:r>
+      <w:r>
+        <w:rPr>
+          <w:rFonts w:ascii="Courier New" w:hAnsi="Courier New" w:cs="Courier New"/>
+          <w:sz w:val="18"/>
+          <w:szCs w:val="18"/>
+        </w:rPr>
+        <w:t>#</w:t>
+      </w:r>
+      <w:r>
+        <w:rPr>
+          <w:rFonts w:ascii="Courier New" w:hAnsi="Courier New" w:cs="Courier New"/>
+          <w:sz w:val="18"/>
+          <w:szCs w:val="18"/>
+        </w:rPr>
+        <w:t xml:space="preserve"> </w:t>
+      </w:r>
+      <w:r>
+        <w:rPr>
+          <w:rFonts w:ascii="Courier New" w:hAnsi="Courier New" w:cs="Courier New"/>
+          <w:sz w:val="18"/>
+          <w:szCs w:val="18"/>
+        </w:rPr>
+        <w:t>Helpers (formatters, IO)</w:t>
+      </w:r>
+    </w:p>
+    <w:p>
+      <w:pPr>
+        <w:tabs>
+          <w:tab w:val="left" w:pos="916"/>
+          <w:tab w:val="left" w:pos="1832"/>
+          <w:tab w:val="left" w:pos="2748"/>
+          <w:tab w:val="left" w:pos="3664"/>
+          <w:tab w:val="left" w:pos="4580"/>
+          <w:tab w:val="left" w:pos="5496"/>
+          <w:tab w:val="left" w:pos="6412"/>
+          <w:tab w:val="left" w:pos="7328"/>
+          <w:tab w:val="left" w:pos="8244"/>
+          <w:tab w:val="left" w:pos="9160"/>
+          <w:tab w:val="left" w:pos="10076"/>
+          <w:tab w:val="left" w:pos="10992"/>
+          <w:tab w:val="left" w:pos="11908"/>
+          <w:tab w:val="left" w:pos="12824"/>
+          <w:tab w:val="left" w:pos="13740"/>
+          <w:tab w:val="left" w:pos="14656"/>
+        </w:tabs>
+      </w:pPr>
+      <w:r>
+        <w:rPr>
+          <w:rFonts w:ascii="Courier New" w:hAnsi="Courier New" w:cs="Courier New"/>
+          <w:color w:val="000000" w:themeColor="text1"/>
+          <w:sz w:val="18"/>
+          <w:szCs w:val="18"/>
+        </w:rPr>
+        <w:t>│   ├── ai_generator.py</w:t>
+      </w:r>
+      <w:r>
+        <w:rPr>
+          <w:rFonts w:ascii="Courier New" w:hAnsi="Courier New" w:cs="Courier New"/>
+          <w:color w:val="000000" w:themeColor="text1"/>
+          <w:sz w:val="18"/>
+          <w:szCs w:val="18"/>
+        </w:rPr>
+        <w:tab/>
+      </w:r>
+      <w:r>
+        <w:rPr>
+          <w:rFonts w:ascii="Courier New" w:hAnsi="Courier New" w:cs="Courier New"/>
+          <w:color w:val="000000" w:themeColor="text1"/>
+          <w:sz w:val="18"/>
+          <w:szCs w:val="18"/>
+        </w:rPr>
+        <w:tab/>
+        <w:t xml:space="preserve">  </w:t>
+      </w:r>
+      <w:r>
+        <w:rPr>
+          <w:rFonts w:ascii="Courier New" w:hAnsi="Courier New" w:cs="Courier New"/>
+          <w:sz w:val="18"/>
+          <w:szCs w:val="18"/>
+        </w:rPr>
+        <w:t># Handles all interaction with the OpenAI API</w:t>
+      </w:r>
+      <w:r>
+        <w:t xml:space="preserve"> </w:t>
+      </w:r>
+    </w:p>
+    <w:p>
+      <w:pPr>
+        <w:tabs>
+          <w:tab w:val="left" w:pos="916"/>
+          <w:tab w:val="left" w:pos="1832"/>
+          <w:tab w:val="left" w:pos="2748"/>
+          <w:tab w:val="left" w:pos="3664"/>
+          <w:tab w:val="left" w:pos="4580"/>
+          <w:tab w:val="left" w:pos="5496"/>
+          <w:tab w:val="left" w:pos="6412"/>
+          <w:tab w:val="left" w:pos="7328"/>
+          <w:tab w:val="left" w:pos="8244"/>
+          <w:tab w:val="left" w:pos="9160"/>
+          <w:tab w:val="left" w:pos="10076"/>
+          <w:tab w:val="left" w:pos="10992"/>
+          <w:tab w:val="left" w:pos="11908"/>
+          <w:tab w:val="left" w:pos="12824"/>
+          <w:tab w:val="left" w:pos="13740"/>
+          <w:tab w:val="left" w:pos="14656"/>
+        </w:tabs>
+        <w:rPr>
+          <w:rFonts w:ascii="Courier New" w:hAnsi="Courier New" w:cs="Courier New"/>
+          <w:color w:val="000000" w:themeColor="text1"/>
+          <w:sz w:val="18"/>
+          <w:szCs w:val="18"/>
+        </w:rPr>
+      </w:pPr>
+      <w:r>
+        <w:rPr>
+          <w:rFonts w:ascii="Courier New" w:hAnsi="Courier New" w:cs="Courier New"/>
+          <w:color w:val="000000" w:themeColor="text1"/>
+          <w:sz w:val="18"/>
+          <w:szCs w:val="18"/>
+        </w:rPr>
+        <w:t>│</w:t>
+      </w:r>
+      <w:r>
+        <w:rPr>
+          <w:rFonts w:ascii="Courier New" w:hAnsi="Courier New" w:cs="Courier New"/>
+          <w:color w:val="000000" w:themeColor="text1"/>
+          <w:sz w:val="18"/>
+          <w:szCs w:val="18"/>
+        </w:rPr>
+        <w:t xml:space="preserve">   </w:t>
+      </w:r>
+      <w:r>
+        <w:rPr>
+          <w:rFonts w:ascii="Courier New" w:hAnsi="Courier New" w:cs="Courier New"/>
+          <w:color w:val="000000" w:themeColor="text1"/>
+          <w:sz w:val="18"/>
+          <w:szCs w:val="18"/>
+        </w:rPr>
+        <w:t>│</w:t>
+      </w:r>
+      <w:r>
+        <w:tab/>
+      </w:r>
+      <w:r>
+        <w:tab/>
+      </w:r>
+      <w:r>
+        <w:tab/>
+      </w:r>
+      <w:r>
+        <w:tab/>
+      </w:r>
+      <w:r>
+        <w:tab/>
+      </w:r>
+      <w:r>
+        <w:rPr>
+          <w:rFonts w:ascii="Courier New" w:hAnsi="Courier New" w:cs="Courier New"/>
+          <w:i/>
+          <w:iCs/>
+          <w:sz w:val="18"/>
+          <w:szCs w:val="18"/>
+        </w:rPr>
+        <w:t>AI content (text) + unit inference</w:t>
+      </w:r>
+    </w:p>
+    <w:p>
+      <w:pPr>
+        <w:tabs>
+          <w:tab w:val="left" w:pos="916"/>
+          <w:tab w:val="left" w:pos="1832"/>
+          <w:tab w:val="left" w:pos="2748"/>
+          <w:tab w:val="left" w:pos="3664"/>
+          <w:tab w:val="left" w:pos="4580"/>
+          <w:tab w:val="left" w:pos="5496"/>
+          <w:tab w:val="left" w:pos="6412"/>
+          <w:tab w:val="left" w:pos="7328"/>
+          <w:tab w:val="left" w:pos="8244"/>
+          <w:tab w:val="left" w:pos="9160"/>
+          <w:tab w:val="left" w:pos="10076"/>
+          <w:tab w:val="left" w:pos="10992"/>
+          <w:tab w:val="left" w:pos="11908"/>
+          <w:tab w:val="left" w:pos="12824"/>
+          <w:tab w:val="left" w:pos="13740"/>
+          <w:tab w:val="left" w:pos="14656"/>
+        </w:tabs>
+        <w:rPr>
+          <w:rFonts w:ascii="Courier New" w:hAnsi="Courier New" w:cs="Courier New"/>
+          <w:sz w:val="18"/>
+          <w:szCs w:val="18"/>
+        </w:rPr>
+      </w:pPr>
+      <w:r>
+        <w:rPr>
+          <w:rFonts w:ascii="Courier New" w:hAnsi="Courier New" w:cs="Courier New"/>
+          <w:color w:val="000000" w:themeColor="text1"/>
+          <w:sz w:val="18"/>
+          <w:szCs w:val="18"/>
+        </w:rPr>
+        <w:t>│   ├── kpi_extractor.py</w:t>
+      </w:r>
+      <w:r>
+        <w:rPr>
+          <w:rFonts w:ascii="Courier New" w:hAnsi="Courier New" w:cs="Courier New"/>
+          <w:color w:val="000000" w:themeColor="text1"/>
+          <w:sz w:val="18"/>
+          <w:szCs w:val="18"/>
+        </w:rPr>
+        <w:tab/>
+      </w:r>
+      <w:r>
+        <w:rPr>
+          <w:rFonts w:ascii="Courier New" w:hAnsi="Courier New" w:cs="Courier New"/>
+          <w:color w:val="000000" w:themeColor="text1"/>
+          <w:sz w:val="18"/>
+          <w:szCs w:val="18"/>
+        </w:rPr>
+        <w:tab/>
+        <w:t xml:space="preserve">  </w:t>
+      </w:r>
+      <w:r>
+        <w:rPr>
+          <w:rFonts w:ascii="Courier New" w:hAnsi="Courier New" w:cs="Courier New"/>
+          <w:sz w:val="18"/>
+          <w:szCs w:val="18"/>
+        </w:rPr>
+        <w:t xml:space="preserve"># Scans source code to find KPI </w:t>
+      </w:r>
+      <w:r>
+        <w:rPr>
+          <w:rFonts w:ascii="Courier New" w:hAnsi="Courier New" w:cs="Courier New"/>
+          <w:sz w:val="18"/>
+          <w:szCs w:val="18"/>
+        </w:rPr>
+        <w:t>blocks in source code</w:t>
+      </w:r>
+      <w:r>
+        <w:rPr>
+          <w:rFonts w:ascii="Courier New" w:hAnsi="Courier New" w:cs="Courier New"/>
+          <w:sz w:val="18"/>
+          <w:szCs w:val="18"/>
+        </w:rPr>
+        <w:t>.</w:t>
+      </w:r>
+    </w:p>
+    <w:p>
+      <w:pPr>
+        <w:tabs>
+          <w:tab w:val="left" w:pos="916"/>
+          <w:tab w:val="left" w:pos="1832"/>
+          <w:tab w:val="left" w:pos="2748"/>
+          <w:tab w:val="left" w:pos="3664"/>
+          <w:tab w:val="left" w:pos="4580"/>
+          <w:tab w:val="left" w:pos="5496"/>
+          <w:tab w:val="left" w:pos="6412"/>
+          <w:tab w:val="left" w:pos="7328"/>
+          <w:tab w:val="left" w:pos="8244"/>
+          <w:tab w:val="left" w:pos="9160"/>
+          <w:tab w:val="left" w:pos="10076"/>
+          <w:tab w:val="left" w:pos="10992"/>
+          <w:tab w:val="left" w:pos="11908"/>
+          <w:tab w:val="left" w:pos="12824"/>
+          <w:tab w:val="left" w:pos="13740"/>
+          <w:tab w:val="left" w:pos="14656"/>
+        </w:tabs>
+      </w:pPr>
+      <w:r>
+        <w:rPr>
+          <w:rFonts w:ascii="Courier New" w:hAnsi="Courier New" w:cs="Courier New"/>
+          <w:color w:val="000000" w:themeColor="text1"/>
+          <w:sz w:val="18"/>
+          <w:szCs w:val="18"/>
+        </w:rPr>
+        <w:t xml:space="preserve">│   └── main.py                 </w:t>
+      </w:r>
+      <w:r>
+        <w:rPr>
+          <w:rFonts w:ascii="Courier New" w:hAnsi="Courier New" w:cs="Courier New"/>
+          <w:color w:val="000000" w:themeColor="text1"/>
+          <w:sz w:val="18"/>
+          <w:szCs w:val="18"/>
+        </w:rPr>
+        <w:tab/>
+      </w:r>
+      <w:r>
+        <w:rPr>
+          <w:rFonts w:ascii="Courier New" w:hAnsi="Courier New" w:cs="Courier New"/>
+          <w:color w:val="000000" w:themeColor="text1"/>
+          <w:sz w:val="18"/>
+          <w:szCs w:val="18"/>
+        </w:rPr>
+        <w:t xml:space="preserve">  </w:t>
+      </w:r>
+      <w:r>
+        <w:rPr>
+          <w:rFonts w:ascii="Courier New" w:hAnsi="Courier New" w:cs="Courier New"/>
+          <w:sz w:val="18"/>
+          <w:szCs w:val="18"/>
+        </w:rPr>
+        <w:t># The main logic for generating the bluebook.</w:t>
+      </w:r>
+      <w:r>
+        <w:t xml:space="preserve"> </w:t>
+      </w:r>
+    </w:p>
+    <w:p>
+      <w:pPr>
+        <w:tabs>
+          <w:tab w:val="left" w:pos="916"/>
+          <w:tab w:val="left" w:pos="1832"/>
+          <w:tab w:val="left" w:pos="2748"/>
+          <w:tab w:val="left" w:pos="3664"/>
+          <w:tab w:val="left" w:pos="4580"/>
+          <w:tab w:val="left" w:pos="5496"/>
+          <w:tab w:val="left" w:pos="6412"/>
+          <w:tab w:val="left" w:pos="7328"/>
+          <w:tab w:val="left" w:pos="8244"/>
+          <w:tab w:val="left" w:pos="9160"/>
+          <w:tab w:val="left" w:pos="10076"/>
+          <w:tab w:val="left" w:pos="10992"/>
+          <w:tab w:val="left" w:pos="11908"/>
+          <w:tab w:val="left" w:pos="12824"/>
+          <w:tab w:val="left" w:pos="13740"/>
+          <w:tab w:val="left" w:pos="14656"/>
+        </w:tabs>
+        <w:rPr>
+          <w:rFonts w:ascii="Courier New" w:hAnsi="Courier New" w:cs="Courier New"/>
+          <w:color w:val="000000" w:themeColor="text1"/>
+          <w:sz w:val="18"/>
+          <w:szCs w:val="18"/>
+        </w:rPr>
+      </w:pPr>
+      <w:r>
+        <w:rPr>
+          <w:rFonts w:ascii="Courier New" w:hAnsi="Courier New" w:cs="Courier New"/>
+          <w:color w:val="000000" w:themeColor="text1"/>
+          <w:sz w:val="18"/>
+          <w:szCs w:val="18"/>
+        </w:rPr>
+        <w:t>│</w:t>
+      </w:r>
+      <w:r>
+        <w:tab/>
+      </w:r>
+      <w:r>
+        <w:tab/>
+      </w:r>
+      <w:r>
+        <w:tab/>
+      </w:r>
+      <w:r>
+        <w:tab/>
+      </w:r>
+      <w:r>
+        <w:rPr>
+          <w:rFonts w:ascii="Courier New" w:hAnsi="Courier New" w:cs="Courier New"/>
+          <w:sz w:val="18"/>
+          <w:szCs w:val="18"/>
+        </w:rPr>
+        <w:tab/>
+      </w:r>
+      <w:r>
+        <w:rPr>
+          <w:rFonts w:ascii="Courier New" w:hAnsi="Courier New" w:cs="Courier New"/>
+          <w:i/>
+          <w:iCs/>
+          <w:sz w:val="18"/>
+          <w:szCs w:val="18"/>
+        </w:rPr>
+        <w:t>Orchestrates extraction → AI → render → build</w:t>
+      </w:r>
+    </w:p>
+    <w:p>
+      <w:pPr>
+        <w:tabs>
+          <w:tab w:val="left" w:pos="916"/>
+          <w:tab w:val="left" w:pos="1832"/>
+          <w:tab w:val="left" w:pos="2748"/>
+          <w:tab w:val="left" w:pos="3664"/>
+          <w:tab w:val="left" w:pos="4580"/>
+          <w:tab w:val="left" w:pos="5496"/>
+          <w:tab w:val="left" w:pos="6412"/>
+          <w:tab w:val="left" w:pos="7328"/>
+          <w:tab w:val="left" w:pos="8244"/>
+          <w:tab w:val="left" w:pos="9160"/>
+          <w:tab w:val="left" w:pos="10076"/>
+          <w:tab w:val="left" w:pos="10992"/>
+          <w:tab w:val="left" w:pos="11908"/>
+          <w:tab w:val="left" w:pos="12824"/>
+          <w:tab w:val="left" w:pos="13740"/>
+          <w:tab w:val="left" w:pos="14656"/>
+        </w:tabs>
+        <w:rPr>
+          <w:rFonts w:ascii="Courier New" w:hAnsi="Courier New" w:cs="Courier New"/>
+          <w:color w:val="000000" w:themeColor="text1"/>
+          <w:sz w:val="18"/>
+          <w:szCs w:val="18"/>
+        </w:rPr>
+      </w:pPr>
+      <w:r>
+        <w:rPr>
+          <w:rFonts w:ascii="Courier New" w:hAnsi="Courier New" w:cs="Courier New"/>
+          <w:color w:val="000000" w:themeColor="text1"/>
+          <w:sz w:val="18"/>
+          <w:szCs w:val="18"/>
+        </w:rPr>
+        <w:t>│</w:t>
+      </w:r>
+    </w:p>
+    <w:p>
+      <w:pPr>
+        <w:tabs>
+          <w:tab w:val="left" w:pos="916"/>
+          <w:tab w:val="left" w:pos="1832"/>
+          <w:tab w:val="left" w:pos="2748"/>
+          <w:tab w:val="left" w:pos="3664"/>
+          <w:tab w:val="left" w:pos="4580"/>
+          <w:tab w:val="left" w:pos="5496"/>
+          <w:tab w:val="left" w:pos="6412"/>
+          <w:tab w:val="left" w:pos="7328"/>
+          <w:tab w:val="left" w:pos="8244"/>
+          <w:tab w:val="left" w:pos="9160"/>
+          <w:tab w:val="left" w:pos="10076"/>
+          <w:tab w:val="left" w:pos="10992"/>
+          <w:tab w:val="left" w:pos="11908"/>
+          <w:tab w:val="left" w:pos="12824"/>
+          <w:tab w:val="left" w:pos="13740"/>
+          <w:tab w:val="left" w:pos="14656"/>
+        </w:tabs>
+        <w:rPr>
+          <w:rFonts w:ascii="Courier New" w:hAnsi="Courier New" w:cs="Courier New"/>
+          <w:sz w:val="18"/>
+          <w:szCs w:val="18"/>
+        </w:rPr>
+      </w:pPr>
+      <w:r>
+        <w:rPr>
+          <w:rFonts w:ascii="Courier New" w:hAnsi="Courier New" w:cs="Courier New"/>
+          <w:sz w:val="18"/>
+          <w:szCs w:val="18"/>
+        </w:rPr>
+        <w:t>├── docs/                           # The source folder for the Sphinx documentation.</w:t>
+      </w:r>
+    </w:p>
+    <w:p>
+      <w:pPr>
+        <w:tabs>
+          <w:tab w:val="left" w:pos="916"/>
+          <w:tab w:val="left" w:pos="1832"/>
+          <w:tab w:val="left" w:pos="2748"/>
+          <w:tab w:val="left" w:pos="3664"/>
+          <w:tab w:val="left" w:pos="4580"/>
+          <w:tab w:val="left" w:pos="5496"/>
+          <w:tab w:val="left" w:pos="6412"/>
+          <w:tab w:val="left" w:pos="7328"/>
+          <w:tab w:val="left" w:pos="8244"/>
+          <w:tab w:val="left" w:pos="9160"/>
+          <w:tab w:val="left" w:pos="10076"/>
+          <w:tab w:val="left" w:pos="10992"/>
+          <w:tab w:val="left" w:pos="11908"/>
+          <w:tab w:val="left" w:pos="12824"/>
+          <w:tab w:val="left" w:pos="13740"/>
+          <w:tab w:val="left" w:pos="14656"/>
+        </w:tabs>
+        <w:rPr>
+          <w:rFonts w:ascii="Courier New" w:hAnsi="Courier New" w:cs="Courier New"/>
+          <w:sz w:val="18"/>
+          <w:szCs w:val="18"/>
+        </w:rPr>
+      </w:pPr>
+      <w:r>
+        <w:rPr>
+          <w:rFonts w:ascii="Courier New" w:hAnsi="Courier New" w:cs="Courier New"/>
+          <w:sz w:val="18"/>
+          <w:szCs w:val="18"/>
+        </w:rPr>
+        <w:t>│   ├── _build/                     # The final, generated HTML website appears here.</w:t>
+      </w:r>
+    </w:p>
+    <w:p>
+      <w:pPr>
+        <w:tabs>
+          <w:tab w:val="left" w:pos="916"/>
+          <w:tab w:val="left" w:pos="1832"/>
+          <w:tab w:val="left" w:pos="2748"/>
+          <w:tab w:val="left" w:pos="3664"/>
+          <w:tab w:val="left" w:pos="4580"/>
+          <w:tab w:val="left" w:pos="5496"/>
+          <w:tab w:val="left" w:pos="6412"/>
+          <w:tab w:val="left" w:pos="7328"/>
+          <w:tab w:val="left" w:pos="8244"/>
+          <w:tab w:val="left" w:pos="9160"/>
+          <w:tab w:val="left" w:pos="10076"/>
+          <w:tab w:val="left" w:pos="10992"/>
+          <w:tab w:val="left" w:pos="11908"/>
+          <w:tab w:val="left" w:pos="12824"/>
+          <w:tab w:val="left" w:pos="13740"/>
+          <w:tab w:val="left" w:pos="14656"/>
+        </w:tabs>
+        <w:rPr>
+          <w:rFonts w:ascii="Courier New" w:hAnsi="Courier New" w:cs="Courier New"/>
+          <w:sz w:val="18"/>
+          <w:szCs w:val="18"/>
+        </w:rPr>
+      </w:pPr>
+      <w:r>
+        <w:rPr>
+          <w:rFonts w:ascii="Courier New" w:hAnsi="Courier New" w:cs="Courier New"/>
+          <w:sz w:val="18"/>
+          <w:szCs w:val="18"/>
+        </w:rPr>
+        <w:t>│   ├── _static/                    # Folder for custom CSS and other static files.</w:t>
+      </w:r>
+    </w:p>
+    <w:p>
+      <w:pPr>
+        <w:tabs>
+          <w:tab w:val="left" w:pos="916"/>
+          <w:tab w:val="left" w:pos="1832"/>
+          <w:tab w:val="left" w:pos="2748"/>
+          <w:tab w:val="left" w:pos="3664"/>
+          <w:tab w:val="left" w:pos="4580"/>
+          <w:tab w:val="left" w:pos="5496"/>
+          <w:tab w:val="left" w:pos="6412"/>
+          <w:tab w:val="left" w:pos="7328"/>
+          <w:tab w:val="left" w:pos="8244"/>
+          <w:tab w:val="left" w:pos="9160"/>
+          <w:tab w:val="left" w:pos="10076"/>
+          <w:tab w:val="left" w:pos="10992"/>
+          <w:tab w:val="left" w:pos="11908"/>
+          <w:tab w:val="left" w:pos="12824"/>
+          <w:tab w:val="left" w:pos="13740"/>
+          <w:tab w:val="left" w:pos="14656"/>
+        </w:tabs>
+        <w:rPr>
+          <w:rFonts w:ascii="Courier New" w:hAnsi="Courier New" w:cs="Courier New"/>
+          <w:sz w:val="18"/>
+          <w:szCs w:val="18"/>
+        </w:rPr>
+      </w:pPr>
+      <w:r>
+        <w:rPr>
+          <w:rFonts w:ascii="Courier New" w:hAnsi="Courier New" w:cs="Courier New"/>
+          <w:sz w:val="18"/>
+          <w:szCs w:val="18"/>
+        </w:rPr>
+        <w:t xml:space="preserve">│   │   └── custom.css              # </w:t>
+      </w:r>
+      <w:r>
+        <w:rPr>
+          <w:rFonts w:ascii="Courier New" w:hAnsi="Courier New" w:cs="Courier New"/>
+          <w:color w:val="000000" w:themeColor="text1"/>
+          <w:sz w:val="18"/>
+          <w:szCs w:val="18"/>
+        </w:rPr>
+        <w:t>Custom styles for table formatting</w:t>
+      </w:r>
+      <w:r>
+        <w:rPr>
+          <w:rFonts w:ascii="Courier New" w:hAnsi="Courier New" w:cs="Courier New"/>
+          <w:color w:val="000000" w:themeColor="text1"/>
+          <w:sz w:val="18"/>
+          <w:szCs w:val="18"/>
+        </w:rPr>
+        <w:t>.</w:t>
+      </w:r>
+    </w:p>
+    <w:p>
+      <w:pPr>
+        <w:tabs>
+          <w:tab w:val="left" w:pos="916"/>
+          <w:tab w:val="left" w:pos="1832"/>
+          <w:tab w:val="left" w:pos="2748"/>
+          <w:tab w:val="left" w:pos="3664"/>
+          <w:tab w:val="left" w:pos="4580"/>
+          <w:tab w:val="left" w:pos="5496"/>
+          <w:tab w:val="left" w:pos="6412"/>
+          <w:tab w:val="left" w:pos="7328"/>
+          <w:tab w:val="left" w:pos="8244"/>
+          <w:tab w:val="left" w:pos="9160"/>
+          <w:tab w:val="left" w:pos="10076"/>
+          <w:tab w:val="left" w:pos="10992"/>
+          <w:tab w:val="left" w:pos="11908"/>
+          <w:tab w:val="left" w:pos="12824"/>
+          <w:tab w:val="left" w:pos="13740"/>
+          <w:tab w:val="left" w:pos="14656"/>
+        </w:tabs>
+        <w:rPr>
+          <w:rFonts w:ascii="Courier New" w:hAnsi="Courier New" w:cs="Courier New"/>
+          <w:sz w:val="18"/>
+          <w:szCs w:val="18"/>
+        </w:rPr>
+      </w:pPr>
+      <w:r>
+        <w:rPr>
+          <w:rFonts w:ascii="Courier New" w:hAnsi="Courier New" w:cs="Courier New"/>
+          <w:sz w:val="18"/>
+          <w:szCs w:val="18"/>
+        </w:rPr>
+        <w:t>│   ├── conf.py                     # The main Sphinx configuration file.</w:t>
+      </w:r>
+    </w:p>
+    <w:p>
+      <w:pPr>
+        <w:tabs>
+          <w:tab w:val="left" w:pos="916"/>
+          <w:tab w:val="left" w:pos="1832"/>
+          <w:tab w:val="left" w:pos="2748"/>
+          <w:tab w:val="left" w:pos="3664"/>
+          <w:tab w:val="left" w:pos="4580"/>
+          <w:tab w:val="left" w:pos="5496"/>
+          <w:tab w:val="left" w:pos="6412"/>
+          <w:tab w:val="left" w:pos="7328"/>
+          <w:tab w:val="left" w:pos="8244"/>
+          <w:tab w:val="left" w:pos="9160"/>
+          <w:tab w:val="left" w:pos="10076"/>
+          <w:tab w:val="left" w:pos="10992"/>
+          <w:tab w:val="left" w:pos="11908"/>
+          <w:tab w:val="left" w:pos="12824"/>
+          <w:tab w:val="left" w:pos="13740"/>
+          <w:tab w:val="left" w:pos="14656"/>
+        </w:tabs>
+      </w:pPr>
+      <w:r>
+        <w:rPr>
+          <w:rFonts w:ascii="Courier New" w:hAnsi="Courier New" w:cs="Courier New"/>
+          <w:sz w:val="18"/>
+          <w:szCs w:val="18"/>
+        </w:rPr>
+        <w:t>│   └── index.rst                   # The top-level page for the Sphinx site.</w:t>
+      </w:r>
+      <w:r>
+        <w:t xml:space="preserve"> </w:t>
+      </w:r>
+    </w:p>
+    <w:p>
+      <w:pPr>
+        <w:tabs>
+          <w:tab w:val="left" w:pos="916"/>
+          <w:tab w:val="left" w:pos="1832"/>
+          <w:tab w:val="left" w:pos="2748"/>
+          <w:tab w:val="left" w:pos="3664"/>
+          <w:tab w:val="left" w:pos="4580"/>
+          <w:tab w:val="left" w:pos="5496"/>
+          <w:tab w:val="left" w:pos="6412"/>
+          <w:tab w:val="left" w:pos="7328"/>
+          <w:tab w:val="left" w:pos="8244"/>
+          <w:tab w:val="left" w:pos="9160"/>
+          <w:tab w:val="left" w:pos="10076"/>
+          <w:tab w:val="left" w:pos="10992"/>
+          <w:tab w:val="left" w:pos="11908"/>
+          <w:tab w:val="left" w:pos="12824"/>
+          <w:tab w:val="left" w:pos="13740"/>
+          <w:tab w:val="left" w:pos="14656"/>
+        </w:tabs>
+        <w:rPr>
+          <w:rFonts w:ascii="Courier New" w:hAnsi="Courier New" w:cs="Courier New"/>
+          <w:color w:val="000000" w:themeColor="text1"/>
+          <w:sz w:val="18"/>
+          <w:szCs w:val="18"/>
+        </w:rPr>
+      </w:pPr>
+      <w:r>
+        <w:rPr>
+          <w:rFonts w:ascii="Courier New" w:hAnsi="Courier New" w:cs="Courier New"/>
+          <w:color w:val="000000" w:themeColor="text1"/>
+          <w:sz w:val="18"/>
+          <w:szCs w:val="18"/>
+        </w:rPr>
+        <w:t>│</w:t>
+      </w:r>
+      <w:r>
+        <w:tab/>
+      </w:r>
+      <w:r>
+        <w:tab/>
+      </w:r>
+      <w:r>
+        <w:tab/>
+      </w:r>
+      <w:r>
+        <w:tab/>
+      </w:r>
+      <w:r>
+        <w:tab/>
+      </w:r>
+      <w:r>
+        <w:rPr>
+          <w:rFonts w:ascii="Courier New" w:hAnsi="Courier New" w:cs="Courier New"/>
+          <w:i/>
+          <w:iCs/>
+          <w:sz w:val="18"/>
+          <w:szCs w:val="18"/>
+        </w:rPr>
+        <w:t>Auto-updated by generator</w:t>
+      </w:r>
+    </w:p>
+    <w:p>
+      <w:pPr>
+        <w:tabs>
+          <w:tab w:val="left" w:pos="916"/>
+          <w:tab w:val="left" w:pos="1832"/>
+          <w:tab w:val="left" w:pos="2748"/>
+          <w:tab w:val="left" w:pos="3664"/>
+          <w:tab w:val="left" w:pos="4580"/>
+          <w:tab w:val="left" w:pos="5496"/>
+          <w:tab w:val="left" w:pos="6412"/>
+          <w:tab w:val="left" w:pos="7328"/>
+          <w:tab w:val="left" w:pos="8244"/>
+          <w:tab w:val="left" w:pos="9160"/>
+          <w:tab w:val="left" w:pos="10076"/>
+          <w:tab w:val="left" w:pos="10992"/>
+          <w:tab w:val="left" w:pos="11908"/>
+          <w:tab w:val="left" w:pos="12824"/>
+          <w:tab w:val="left" w:pos="13740"/>
+          <w:tab w:val="left" w:pos="14656"/>
+        </w:tabs>
+        <w:rPr>
+          <w:rFonts w:ascii="Courier New" w:hAnsi="Courier New" w:cs="Courier New"/>
+          <w:color w:val="000000" w:themeColor="text1"/>
+          <w:sz w:val="18"/>
+          <w:szCs w:val="18"/>
+        </w:rPr>
+      </w:pPr>
+      <w:r>
+        <w:rPr>
+          <w:rFonts w:ascii="Courier New" w:hAnsi="Courier New" w:cs="Courier New"/>
+          <w:color w:val="000000" w:themeColor="text1"/>
+          <w:sz w:val="18"/>
+          <w:szCs w:val="18"/>
+        </w:rPr>
+        <w:t>│</w:t>
+      </w:r>
+    </w:p>
+    <w:p>
+      <w:pPr>
+        <w:tabs>
+          <w:tab w:val="left" w:pos="916"/>
+          <w:tab w:val="left" w:pos="1832"/>
+          <w:tab w:val="left" w:pos="2748"/>
+          <w:tab w:val="left" w:pos="3664"/>
+          <w:tab w:val="left" w:pos="4580"/>
+          <w:tab w:val="left" w:pos="5496"/>
+          <w:tab w:val="left" w:pos="6412"/>
+          <w:tab w:val="left" w:pos="7328"/>
+          <w:tab w:val="left" w:pos="8244"/>
+          <w:tab w:val="left" w:pos="9160"/>
+          <w:tab w:val="left" w:pos="10076"/>
+          <w:tab w:val="left" w:pos="10992"/>
+          <w:tab w:val="left" w:pos="11908"/>
+          <w:tab w:val="left" w:pos="12824"/>
+          <w:tab w:val="left" w:pos="13740"/>
+          <w:tab w:val="left" w:pos="14656"/>
+        </w:tabs>
+        <w:rPr>
+          <w:rFonts w:ascii="Courier New" w:hAnsi="Courier New" w:cs="Courier New"/>
+          <w:sz w:val="18"/>
+          <w:szCs w:val="18"/>
+        </w:rPr>
+      </w:pPr>
+      <w:r>
+        <w:rPr>
+          <w:rFonts w:ascii="Courier New" w:hAnsi="Courier New" w:cs="Courier New"/>
+          <w:sz w:val="18"/>
+          <w:szCs w:val="18"/>
+        </w:rPr>
+        <w:t>├── sample_project/                 # An example project to analyze.</w:t>
+      </w:r>
+    </w:p>
+    <w:p>
+      <w:pPr>
+        <w:tabs>
+          <w:tab w:val="left" w:pos="916"/>
+          <w:tab w:val="left" w:pos="1832"/>
+          <w:tab w:val="left" w:pos="2748"/>
+          <w:tab w:val="left" w:pos="3664"/>
+          <w:tab w:val="left" w:pos="4580"/>
+          <w:tab w:val="left" w:pos="5496"/>
+          <w:tab w:val="left" w:pos="6412"/>
+          <w:tab w:val="left" w:pos="7328"/>
+          <w:tab w:val="left" w:pos="8244"/>
+          <w:tab w:val="left" w:pos="9160"/>
+          <w:tab w:val="left" w:pos="10076"/>
+          <w:tab w:val="left" w:pos="10992"/>
+          <w:tab w:val="left" w:pos="11908"/>
+          <w:tab w:val="left" w:pos="12824"/>
+          <w:tab w:val="left" w:pos="13740"/>
+          <w:tab w:val="left" w:pos="14656"/>
+        </w:tabs>
+        <w:rPr>
+          <w:rFonts w:ascii="Courier New" w:hAnsi="Courier New" w:cs="Courier New"/>
+          <w:sz w:val="18"/>
+          <w:szCs w:val="18"/>
+        </w:rPr>
+      </w:pPr>
+      <w:r>
+        <w:rPr>
+          <w:rFonts w:ascii="Courier New" w:hAnsi="Courier New" w:cs="Courier New"/>
+          <w:sz w:val="18"/>
+          <w:szCs w:val="18"/>
+        </w:rPr>
+        <w:t>│   ├── __init__.py</w:t>
+      </w:r>
+    </w:p>
+    <w:p>
+      <w:pPr>
+        <w:tabs>
+          <w:tab w:val="left" w:pos="916"/>
+          <w:tab w:val="left" w:pos="1832"/>
+          <w:tab w:val="left" w:pos="2748"/>
+          <w:tab w:val="left" w:pos="3664"/>
+          <w:tab w:val="left" w:pos="4580"/>
+          <w:tab w:val="left" w:pos="5496"/>
+          <w:tab w:val="left" w:pos="6412"/>
+          <w:tab w:val="left" w:pos="7328"/>
+          <w:tab w:val="left" w:pos="8244"/>
+          <w:tab w:val="left" w:pos="9160"/>
+          <w:tab w:val="left" w:pos="10076"/>
+          <w:tab w:val="left" w:pos="10992"/>
+          <w:tab w:val="left" w:pos="11908"/>
+          <w:tab w:val="left" w:pos="12824"/>
+          <w:tab w:val="left" w:pos="13740"/>
+          <w:tab w:val="left" w:pos="14656"/>
+        </w:tabs>
+        <w:rPr>
+          <w:rFonts w:ascii="Courier New" w:hAnsi="Courier New" w:cs="Courier New"/>
+          <w:sz w:val="18"/>
+          <w:szCs w:val="18"/>
+        </w:rPr>
+      </w:pPr>
+      <w:r>
+        <w:rPr>
+          <w:rFonts w:ascii="Courier New" w:hAnsi="Courier New" w:cs="Courier New"/>
+          <w:sz w:val="18"/>
+          <w:szCs w:val="18"/>
+        </w:rPr>
+        <w:t>│   ├── petrochemical_plant_operations.py # The complex test file.</w:t>
+      </w:r>
+    </w:p>
+    <w:p>
+      <w:pPr>
+        <w:tabs>
+          <w:tab w:val="left" w:pos="916"/>
+          <w:tab w:val="left" w:pos="1832"/>
+          <w:tab w:val="left" w:pos="2748"/>
+          <w:tab w:val="left" w:pos="3664"/>
+          <w:tab w:val="left" w:pos="4580"/>
+          <w:tab w:val="left" w:pos="5496"/>
+          <w:tab w:val="left" w:pos="6412"/>
+          <w:tab w:val="left" w:pos="7328"/>
+          <w:tab w:val="left" w:pos="8244"/>
+          <w:tab w:val="left" w:pos="9160"/>
+          <w:tab w:val="left" w:pos="10076"/>
+          <w:tab w:val="left" w:pos="10992"/>
+          <w:tab w:val="left" w:pos="11908"/>
+          <w:tab w:val="left" w:pos="12824"/>
+          <w:tab w:val="left" w:pos="13740"/>
+          <w:tab w:val="left" w:pos="14656"/>
+        </w:tabs>
+        <w:rPr>
+          <w:rFonts w:ascii="Courier New" w:hAnsi="Courier New" w:cs="Courier New"/>
+          <w:sz w:val="18"/>
+          <w:szCs w:val="18"/>
+        </w:rPr>
+      </w:pPr>
+      <w:r>
+        <w:rPr>
+          <w:rFonts w:ascii="Courier New" w:hAnsi="Courier New" w:cs="Courier New"/>
+          <w:sz w:val="18"/>
+          <w:szCs w:val="18"/>
+        </w:rPr>
+        <w:t>│   └── sales_report.py             # The original simple test file.</w:t>
+      </w:r>
+    </w:p>
+    <w:p>
+      <w:pPr>
+        <w:tabs>
+          <w:tab w:val="left" w:pos="916"/>
+          <w:tab w:val="left" w:pos="1832"/>
+          <w:tab w:val="left" w:pos="2748"/>
+          <w:tab w:val="left" w:pos="3664"/>
+          <w:tab w:val="left" w:pos="4580"/>
+          <w:tab w:val="left" w:pos="5496"/>
+          <w:tab w:val="left" w:pos="6412"/>
+          <w:tab w:val="left" w:pos="7328"/>
+          <w:tab w:val="left" w:pos="8244"/>
+          <w:tab w:val="left" w:pos="9160"/>
+          <w:tab w:val="left" w:pos="10076"/>
+          <w:tab w:val="left" w:pos="10992"/>
+          <w:tab w:val="left" w:pos="11908"/>
+          <w:tab w:val="left" w:pos="12824"/>
+          <w:tab w:val="left" w:pos="13740"/>
+          <w:tab w:val="left" w:pos="14656"/>
+        </w:tabs>
+        <w:rPr>
+          <w:rFonts w:ascii="Courier New" w:hAnsi="Courier New" w:cs="Courier New"/>
+          <w:color w:val="000000" w:themeColor="text1"/>
+          <w:sz w:val="18"/>
+          <w:szCs w:val="18"/>
+        </w:rPr>
+      </w:pPr>
+      <w:r>
+        <w:rPr>
+          <w:rFonts w:ascii="Courier New" w:hAnsi="Courier New" w:cs="Courier New"/>
+          <w:color w:val="000000" w:themeColor="text1"/>
+          <w:sz w:val="18"/>
+          <w:szCs w:val="18"/>
+        </w:rPr>
+        <w:t>│</w:t>
+      </w:r>
+    </w:p>
+    <w:p>
+      <w:pPr>
+        <w:tabs>
+          <w:tab w:val="left" w:pos="916"/>
+          <w:tab w:val="left" w:pos="1832"/>
+          <w:tab w:val="left" w:pos="2748"/>
+          <w:tab w:val="left" w:pos="3664"/>
+          <w:tab w:val="left" w:pos="4580"/>
+          <w:tab w:val="left" w:pos="5496"/>
+          <w:tab w:val="left" w:pos="6412"/>
+          <w:tab w:val="left" w:pos="7328"/>
+          <w:tab w:val="left" w:pos="8244"/>
+          <w:tab w:val="left" w:pos="9160"/>
+          <w:tab w:val="left" w:pos="10076"/>
+          <w:tab w:val="left" w:pos="10992"/>
+          <w:tab w:val="left" w:pos="11908"/>
+          <w:tab w:val="left" w:pos="12824"/>
+          <w:tab w:val="left" w:pos="13740"/>
+          <w:tab w:val="left" w:pos="14656"/>
+        </w:tabs>
+        <w:rPr>
+          <w:rFonts w:ascii="Courier New" w:hAnsi="Courier New" w:cs="Courier New"/>
+          <w:color w:val="000000" w:themeColor="text1"/>
+          <w:sz w:val="18"/>
+          <w:szCs w:val="18"/>
+        </w:rPr>
+      </w:pPr>
+      <w:r>
+        <w:rPr>
+          <w:rFonts w:ascii="Courier New" w:hAnsi="Courier New" w:cs="Courier New"/>
+          <w:sz w:val="18"/>
+          <w:szCs w:val="18"/>
+        </w:rPr>
+        <w:t>├──</w:t>
+      </w:r>
+      <w:r>
+        <w:rPr>
+          <w:rFonts w:ascii="Courier New" w:hAnsi="Courier New" w:cs="Courier New"/>
+          <w:color w:val="000000" w:themeColor="text1"/>
+          <w:sz w:val="18"/>
+          <w:szCs w:val="18"/>
+        </w:rPr>
+        <w:t xml:space="preserve"> templates/                      # </w:t>
+      </w:r>
+      <w:r>
+        <w:rPr>
+          <w:rFonts w:ascii="Courier New" w:hAnsi="Courier New" w:cs="Courier New"/>
+          <w:sz w:val="18"/>
+          <w:szCs w:val="18"/>
+        </w:rPr>
+        <w:t>Templates for SPHINX (.rst) files</w:t>
+      </w:r>
+      <w:r>
+        <w:rPr>
+          <w:rFonts w:ascii="Courier New" w:hAnsi="Courier New" w:cs="Courier New"/>
+          <w:sz w:val="18"/>
+          <w:szCs w:val="18"/>
+        </w:rPr>
+        <w:t xml:space="preserve">, </w:t>
+      </w:r>
+      <w:r>
+        <w:rPr>
+          <w:rFonts w:ascii="Courier New" w:hAnsi="Courier New" w:cs="Courier New"/>
+          <w:sz w:val="18"/>
+          <w:szCs w:val="18"/>
+        </w:rPr>
+        <w:t>FLASK WEB UI</w:t>
+      </w:r>
+    </w:p>
+    <w:p>
+      <w:pPr>
+        <w:tabs>
+          <w:tab w:val="left" w:pos="916"/>
+          <w:tab w:val="left" w:pos="1832"/>
+          <w:tab w:val="left" w:pos="2748"/>
+          <w:tab w:val="left" w:pos="3664"/>
+          <w:tab w:val="left" w:pos="4580"/>
+          <w:tab w:val="left" w:pos="5496"/>
+          <w:tab w:val="left" w:pos="6412"/>
+          <w:tab w:val="left" w:pos="7328"/>
+          <w:tab w:val="left" w:pos="8244"/>
+          <w:tab w:val="left" w:pos="9160"/>
+          <w:tab w:val="left" w:pos="10076"/>
+          <w:tab w:val="left" w:pos="10992"/>
+          <w:tab w:val="left" w:pos="11908"/>
+          <w:tab w:val="left" w:pos="12824"/>
+          <w:tab w:val="left" w:pos="13740"/>
+          <w:tab w:val="left" w:pos="14656"/>
+        </w:tabs>
+        <w:rPr>
+          <w:rFonts w:ascii="Courier New" w:hAnsi="Courier New" w:cs="Courier New"/>
+          <w:color w:val="000000" w:themeColor="text1"/>
+          <w:sz w:val="18"/>
+          <w:szCs w:val="18"/>
+        </w:rPr>
+      </w:pPr>
+      <w:r>
+        <w:rPr>
+          <w:rFonts w:ascii="Courier New" w:hAnsi="Courier New" w:cs="Courier New"/>
+          <w:sz w:val="18"/>
+          <w:szCs w:val="18"/>
+        </w:rPr>
+        <w:t>│</w:t>
+      </w:r>
+      <w:r>
+        <w:rPr>
+          <w:rFonts w:ascii="Courier New" w:hAnsi="Courier New" w:cs="Courier New"/>
+          <w:color w:val="000000" w:themeColor="text1"/>
+          <w:sz w:val="18"/>
+          <w:szCs w:val="18"/>
+        </w:rPr>
+        <w:t xml:space="preserve">    ├── index.html                 # </w:t>
+      </w:r>
+      <w:r>
+        <w:rPr>
+          <w:rFonts w:ascii="Courier New" w:hAnsi="Courier New" w:cs="Courier New"/>
+          <w:sz w:val="18"/>
+          <w:szCs w:val="18"/>
+        </w:rPr>
+        <w:t>The HTML for the main web interface</w:t>
+      </w:r>
+      <w:r>
+        <w:rPr>
+          <w:rFonts w:ascii="Courier New" w:hAnsi="Courier New" w:cs="Courier New"/>
+          <w:color w:val="000000" w:themeColor="text1"/>
+          <w:sz w:val="18"/>
+          <w:szCs w:val="18"/>
+        </w:rPr>
+        <w:t xml:space="preserve">. </w:t>
+      </w:r>
+      <w:r>
+        <w:rPr>
+          <w:rFonts w:ascii="Courier New" w:hAnsi="Courier New" w:cs="Courier New"/>
+          <w:color w:val="000000" w:themeColor="text1"/>
+          <w:sz w:val="18"/>
+          <w:szCs w:val="18"/>
+        </w:rPr>
+        <w:t>Flask UI</w:t>
+      </w:r>
+    </w:p>
+    <w:p>
+      <w:pPr>
+        <w:tabs>
+          <w:tab w:val="left" w:pos="916"/>
+          <w:tab w:val="left" w:pos="1832"/>
+          <w:tab w:val="left" w:pos="2748"/>
+          <w:tab w:val="left" w:pos="3664"/>
+          <w:tab w:val="left" w:pos="4580"/>
+          <w:tab w:val="left" w:pos="5496"/>
+          <w:tab w:val="left" w:pos="6412"/>
+          <w:tab w:val="left" w:pos="7328"/>
+          <w:tab w:val="left" w:pos="8244"/>
+          <w:tab w:val="left" w:pos="9160"/>
+          <w:tab w:val="left" w:pos="10076"/>
+          <w:tab w:val="left" w:pos="10992"/>
+          <w:tab w:val="left" w:pos="11908"/>
+          <w:tab w:val="left" w:pos="12824"/>
+          <w:tab w:val="left" w:pos="13740"/>
+          <w:tab w:val="left" w:pos="14656"/>
+        </w:tabs>
+      </w:pPr>
+      <w:r>
+        <w:rPr>
+          <w:rFonts w:ascii="Courier New" w:hAnsi="Courier New" w:cs="Courier New"/>
+          <w:sz w:val="18"/>
+          <w:szCs w:val="18"/>
+        </w:rPr>
+        <w:t>│</w:t>
+      </w:r>
+      <w:r>
+        <w:rPr>
+          <w:rFonts w:ascii="Courier New" w:hAnsi="Courier New" w:cs="Courier New"/>
+          <w:color w:val="000000" w:themeColor="text1"/>
+          <w:sz w:val="18"/>
+          <w:szCs w:val="18"/>
+        </w:rPr>
+        <w:t xml:space="preserve">    └── kpi_template.rst.j2</w:t>
+      </w:r>
+      <w:r>
+        <w:rPr>
+          <w:rFonts w:ascii="Courier New" w:hAnsi="Courier New" w:cs="Courier New"/>
+          <w:sz w:val="18"/>
+          <w:szCs w:val="18"/>
+        </w:rPr>
+        <w:t xml:space="preserve">   </w:t>
+      </w:r>
+      <w:r>
+        <w:rPr>
+          <w:rFonts w:ascii="Courier New" w:hAnsi="Courier New" w:cs="Courier New"/>
+          <w:sz w:val="18"/>
+          <w:szCs w:val="18"/>
+        </w:rPr>
+        <w:tab/>
+      </w:r>
+      <w:r>
+        <w:rPr>
+          <w:rFonts w:ascii="Courier New" w:hAnsi="Courier New" w:cs="Courier New"/>
+          <w:sz w:val="18"/>
+          <w:szCs w:val="18"/>
+        </w:rPr>
+        <w:t xml:space="preserve">  # The Jinja2 template for a single KPI page.</w:t>
+      </w:r>
+      <w:r>
+        <w:t xml:space="preserve"> </w:t>
+      </w:r>
+    </w:p>
+    <w:p>
+      <w:pPr>
+        <w:tabs>
+          <w:tab w:val="left" w:pos="916"/>
+          <w:tab w:val="left" w:pos="1832"/>
+          <w:tab w:val="left" w:pos="2748"/>
+          <w:tab w:val="left" w:pos="3664"/>
+          <w:tab w:val="left" w:pos="4580"/>
+          <w:tab w:val="left" w:pos="5496"/>
+          <w:tab w:val="left" w:pos="6412"/>
+          <w:tab w:val="left" w:pos="7328"/>
+          <w:tab w:val="left" w:pos="8244"/>
+          <w:tab w:val="left" w:pos="9160"/>
+          <w:tab w:val="left" w:pos="10076"/>
+          <w:tab w:val="left" w:pos="10992"/>
+          <w:tab w:val="left" w:pos="11908"/>
+          <w:tab w:val="left" w:pos="12824"/>
+          <w:tab w:val="left" w:pos="13740"/>
+          <w:tab w:val="left" w:pos="14656"/>
+        </w:tabs>
+        <w:rPr>
+          <w:rFonts w:ascii="Courier New" w:hAnsi="Courier New" w:cs="Courier New"/>
+          <w:color w:val="000000" w:themeColor="text1"/>
+          <w:sz w:val="18"/>
+          <w:szCs w:val="18"/>
+        </w:rPr>
+      </w:pPr>
+      <w:r>
+        <w:rPr>
+          <w:rFonts w:ascii="Courier New" w:hAnsi="Courier New" w:cs="Courier New"/>
+          <w:color w:val="000000" w:themeColor="text1"/>
+          <w:sz w:val="18"/>
+          <w:szCs w:val="18"/>
+        </w:rPr>
+        <w:t xml:space="preserve">├── </w:t>
+      </w:r>
+      <w:r>
+        <w:rPr>
+          <w:rFonts w:ascii="Courier New" w:hAnsi="Courier New" w:cs="Courier New"/>
+          <w:color w:val="000000" w:themeColor="text1"/>
+          <w:sz w:val="18"/>
+          <w:szCs w:val="18"/>
+        </w:rPr>
+        <w:t>KPI_Inrctive_Bluebook.plantum</w:t>
+      </w:r>
+      <w:r>
+        <w:rPr>
+          <w:rFonts w:ascii="Courier New" w:hAnsi="Courier New" w:cs="Courier New"/>
+          <w:color w:val="000000" w:themeColor="text1"/>
+          <w:sz w:val="18"/>
+          <w:szCs w:val="18"/>
+        </w:rPr>
+        <w:tab/>
+      </w:r>
+      <w:r>
+        <w:rPr>
+          <w:rFonts w:ascii="Courier New" w:hAnsi="Courier New" w:cs="Courier New"/>
+          <w:color w:val="000000" w:themeColor="text1"/>
+          <w:sz w:val="18"/>
+          <w:szCs w:val="18"/>
+        </w:rPr>
+        <w:t xml:space="preserve">  </w:t>
+      </w:r>
+      <w:r>
+        <w:rPr>
+          <w:rFonts w:ascii="Courier New" w:hAnsi="Courier New" w:cs="Courier New"/>
+          <w:sz w:val="18"/>
+          <w:szCs w:val="18"/>
+        </w:rPr>
+        <w:t>#</w:t>
+      </w:r>
+      <w:r>
+        <w:t xml:space="preserve"> </w:t>
+      </w:r>
+      <w:r>
+        <w:rPr>
+          <w:rFonts w:ascii="Courier New" w:hAnsi="Courier New" w:cs="Courier New"/>
+          <w:sz w:val="18"/>
+          <w:szCs w:val="18"/>
+        </w:rPr>
+        <w:t>UML + Flowchart</w:t>
+      </w:r>
+      <w:r>
+        <w:rPr>
+          <w:rFonts w:ascii="Courier New" w:hAnsi="Courier New" w:cs="Courier New"/>
+          <w:sz w:val="18"/>
+          <w:szCs w:val="18"/>
+        </w:rPr>
+        <w:t>.</w:t>
+      </w:r>
+    </w:p>
+    <w:p>
+      <w:pPr>
+        <w:tabs>
+          <w:tab w:val="left" w:pos="916"/>
+          <w:tab w:val="left" w:pos="1832"/>
+          <w:tab w:val="left" w:pos="2748"/>
+          <w:tab w:val="left" w:pos="3664"/>
+          <w:tab w:val="left" w:pos="4580"/>
+          <w:tab w:val="left" w:pos="5496"/>
+          <w:tab w:val="left" w:pos="6412"/>
+          <w:tab w:val="left" w:pos="7328"/>
+          <w:tab w:val="left" w:pos="8244"/>
+          <w:tab w:val="left" w:pos="9160"/>
+          <w:tab w:val="left" w:pos="10076"/>
+          <w:tab w:val="left" w:pos="10992"/>
+          <w:tab w:val="left" w:pos="11908"/>
+          <w:tab w:val="left" w:pos="12824"/>
+          <w:tab w:val="left" w:pos="13740"/>
+          <w:tab w:val="left" w:pos="14656"/>
+        </w:tabs>
+        <w:rPr>
+          <w:rFonts w:ascii="Courier New" w:hAnsi="Courier New" w:cs="Courier New"/>
+          <w:color w:val="000000" w:themeColor="text1"/>
+          <w:sz w:val="18"/>
+          <w:szCs w:val="18"/>
+        </w:rPr>
+      </w:pPr>
+      <w:r>
+        <w:rPr>
+          <w:rFonts w:ascii="Courier New" w:hAnsi="Courier New" w:cs="Courier New"/>
+          <w:color w:val="000000" w:themeColor="text1"/>
+          <w:sz w:val="18"/>
+          <w:szCs w:val="18"/>
+        </w:rPr>
+        <w:t xml:space="preserve">├── </w:t>
+      </w:r>
+      <w:r>
+        <w:rPr>
+          <w:rFonts w:ascii="Courier New" w:hAnsi="Courier New" w:cs="Courier New"/>
+          <w:color w:val="000000" w:themeColor="text1"/>
+          <w:sz w:val="18"/>
+          <w:szCs w:val="18"/>
+        </w:rPr>
+        <w:t>README.md</w:t>
+      </w:r>
+      <w:r>
+        <w:rPr>
+          <w:rFonts w:ascii="Courier New" w:hAnsi="Courier New" w:cs="Courier New"/>
+          <w:color w:val="000000" w:themeColor="text1"/>
+          <w:sz w:val="18"/>
+          <w:szCs w:val="18"/>
+        </w:rPr>
+        <w:t xml:space="preserve">                       </w:t>
+      </w:r>
+      <w:r>
+        <w:rPr>
+          <w:rFonts w:ascii="Courier New" w:hAnsi="Courier New" w:cs="Courier New"/>
+          <w:sz w:val="18"/>
+          <w:szCs w:val="18"/>
+        </w:rPr>
+        <w:t xml:space="preserve"># </w:t>
+      </w:r>
+      <w:r>
+        <w:rPr>
+          <w:rFonts w:ascii="Courier New" w:hAnsi="Courier New" w:cs="Courier New"/>
+          <w:sz w:val="18"/>
+          <w:szCs w:val="18"/>
+        </w:rPr>
+        <w:t>Cookbook + Technical intro</w:t>
+      </w:r>
+      <w:r>
+        <w:rPr>
+          <w:rFonts w:ascii="Courier New" w:hAnsi="Courier New" w:cs="Courier New"/>
+          <w:sz w:val="18"/>
+          <w:szCs w:val="18"/>
+        </w:rPr>
+        <w:t>.</w:t>
+      </w:r>
+    </w:p>
+    <w:p>
+      <w:pPr>
+        <w:tabs>
+          <w:tab w:val="left" w:pos="916"/>
+          <w:tab w:val="left" w:pos="1832"/>
+          <w:tab w:val="left" w:pos="2748"/>
+          <w:tab w:val="left" w:pos="3664"/>
+          <w:tab w:val="left" w:pos="4580"/>
+          <w:tab w:val="left" w:pos="5496"/>
+          <w:tab w:val="left" w:pos="6412"/>
+          <w:tab w:val="left" w:pos="7328"/>
+          <w:tab w:val="left" w:pos="8244"/>
+          <w:tab w:val="left" w:pos="9160"/>
+          <w:tab w:val="left" w:pos="10076"/>
+          <w:tab w:val="left" w:pos="10992"/>
+          <w:tab w:val="left" w:pos="11908"/>
+          <w:tab w:val="left" w:pos="12824"/>
+          <w:tab w:val="left" w:pos="13740"/>
+          <w:tab w:val="left" w:pos="14656"/>
+        </w:tabs>
+        <w:rPr>
+          <w:rFonts w:ascii="Courier New" w:hAnsi="Courier New" w:cs="Courier New"/>
+          <w:color w:val="000000" w:themeColor="text1"/>
+          <w:sz w:val="18"/>
+          <w:szCs w:val="18"/>
+        </w:rPr>
+      </w:pPr>
     </w:p>
     <w:p>
       <w:pPr>
@@ -3344,7 +5375,6 @@
           <w:sz w:val="53"/>
           <w:szCs w:val="53"/>
         </w:rPr>
-        <w:lastRenderedPageBreak/>
         <w:t>AI-Powered KPI Extractor &amp; Interactive Bluebook Generator</w:t>
       </w:r>
     </w:p>
@@ -3536,6 +5566,7 @@
           <w:sz w:val="43"/>
           <w:szCs w:val="43"/>
         </w:rPr>
+        <w:lastRenderedPageBreak/>
         <w:t>Requirements</w:t>
       </w:r>
     </w:p>
@@ -4119,7 +6150,6 @@
           <w:sz w:val="43"/>
           <w:szCs w:val="43"/>
         </w:rPr>
-        <w:lastRenderedPageBreak/>
         <w:t>How it Works</w:t>
       </w:r>
     </w:p>
@@ -4464,6 +6494,7 @@
           <w:sz w:val="43"/>
           <w:szCs w:val="43"/>
         </w:rPr>
+        <w:lastRenderedPageBreak/>
         <w:t>Troubleshooting</w:t>
       </w:r>
     </w:p>
@@ -5201,13 +7232,7 @@
         <w:rPr>
           <w:color w:val="000000"/>
         </w:rPr>
-        <w:t>processes source code repositories to automatically extract KPIs, enrich them with descriptive metadata, and generate an interactive documentation site</w:t>
-      </w:r>
-      <w:r>
-        <w:rPr>
-          <w:color w:val="000000"/>
-        </w:rPr>
-        <w:t xml:space="preserve"> </w:t>
+        <w:t xml:space="preserve">processes source code repositories to automatically extract KPIs, enrich them with descriptive metadata, and generate an interactive documentation site </w:t>
       </w:r>
       <w:r>
         <w:rPr>
@@ -6596,16 +8621,7 @@
           <w:color w:val="000000"/>
         </w:rPr>
         <w:lastRenderedPageBreak/>
-        <w:t>High-level Components</w:t>
-      </w:r>
-      <w:r>
-        <w:rPr>
-          <w:rFonts w:asciiTheme="majorBidi" w:hAnsiTheme="majorBidi" w:cstheme="majorBidi"/>
-          <w:b/>
-          <w:bCs/>
-          <w:color w:val="000000"/>
-        </w:rPr>
-        <w:t xml:space="preserve"> Digram</w:t>
+        <w:t>High-level Components Digram</w:t>
       </w:r>
     </w:p>
     <w:p>
@@ -7270,29 +9286,7 @@
           <w:sz w:val="18"/>
           <w:szCs w:val="18"/>
         </w:rPr>
-        <w:t>Figure</w:t>
-      </w:r>
-      <w:r>
-        <w:rPr>
-          <w:rFonts w:asciiTheme="majorBidi" w:hAnsiTheme="majorBidi" w:cstheme="majorBidi"/>
-          <w:b/>
-          <w:bCs/>
-          <w:color w:val="000000"/>
-          <w:sz w:val="18"/>
-          <w:szCs w:val="18"/>
-        </w:rPr>
-        <w:t>. 6</w:t>
-      </w:r>
-      <w:r>
-        <w:rPr>
-          <w:rFonts w:asciiTheme="majorBidi" w:hAnsiTheme="majorBidi" w:cstheme="majorBidi"/>
-          <w:b/>
-          <w:bCs/>
-          <w:color w:val="000000"/>
-          <w:sz w:val="18"/>
-          <w:szCs w:val="18"/>
-        </w:rPr>
-        <w:t>.</w:t>
+        <w:t>Figure. 6.</w:t>
       </w:r>
       <w:r>
         <w:rPr>

</xml_diff>

<commit_message>
12 KPIs with all languges are fixed
The missing KPI extraction issue was fixed by adding the helper function _expand_forward_statement. The scanner now detects all 12 KPI files, including the four previously missing ones. The KPI list, formulas, and documentation pipeline work correctly after regeneration.
</commit_message>
<xml_diff>
--- a/help/Technical Document.docx
+++ b/help/Technical Document.docx
@@ -1755,12 +1755,191 @@
         <w:t> files into a polished, interactive HTML website, complete with a navigation menu, search functionality, and perfectly rendered math equations.</w:t>
       </w:r>
     </w:p>
-    <w:p/>
-    <w:p/>
-    <w:p/>
-    <w:p/>
-    <w:p/>
-    <w:p/>
+    <w:p>
+      <w:pPr>
+        <w:spacing w:before="100" w:beforeAutospacing="1" w:after="100" w:afterAutospacing="1"/>
+        <w:jc w:val="both"/>
+        <w:rPr>
+          <w:color w:val="000000"/>
+        </w:rPr>
+      </w:pPr>
+    </w:p>
+    <w:p>
+      <w:pPr>
+        <w:spacing w:before="100" w:beforeAutospacing="1" w:after="100" w:afterAutospacing="1"/>
+        <w:jc w:val="both"/>
+        <w:rPr>
+          <w:color w:val="000000"/>
+        </w:rPr>
+      </w:pPr>
+    </w:p>
+    <w:p>
+      <w:pPr>
+        <w:spacing w:before="100" w:beforeAutospacing="1" w:after="100" w:afterAutospacing="1"/>
+        <w:jc w:val="both"/>
+        <w:rPr>
+          <w:color w:val="000000"/>
+        </w:rPr>
+      </w:pPr>
+    </w:p>
+    <w:p>
+      <w:pPr>
+        <w:pStyle w:val="ListParagraph"/>
+        <w:numPr>
+          <w:ilvl w:val="1"/>
+          <w:numId w:val="5"/>
+        </w:numPr>
+        <w:spacing w:before="100" w:beforeAutospacing="1" w:after="100" w:afterAutospacing="1"/>
+        <w:jc w:val="both"/>
+        <w:outlineLvl w:val="2"/>
+        <w:rPr>
+          <w:b/>
+          <w:bCs/>
+          <w:color w:val="000000"/>
+          <w:sz w:val="27"/>
+          <w:szCs w:val="27"/>
+        </w:rPr>
+      </w:pPr>
+      <w:r>
+        <w:rPr>
+          <w:b/>
+          <w:bCs/>
+          <w:color w:val="000000"/>
+          <w:sz w:val="27"/>
+          <w:szCs w:val="27"/>
+        </w:rPr>
+        <w:lastRenderedPageBreak/>
+        <w:t xml:space="preserve"> The main functions in extraction and generation:</w:t>
+      </w:r>
+    </w:p>
+    <w:p>
+      <w:pPr>
+        <w:pStyle w:val="ListParagraph"/>
+        <w:numPr>
+          <w:ilvl w:val="0"/>
+          <w:numId w:val="47"/>
+        </w:numPr>
+        <w:spacing w:before="100" w:beforeAutospacing="1" w:after="100" w:afterAutospacing="1"/>
+        <w:jc w:val="both"/>
+        <w:outlineLvl w:val="2"/>
+        <w:rPr>
+          <w:color w:val="000000"/>
+        </w:rPr>
+      </w:pPr>
+      <w:r>
+        <w:rPr>
+          <w:rFonts w:ascii="Courier New" w:hAnsi="Courier New" w:cs="Courier New"/>
+          <w:color w:val="000000"/>
+        </w:rPr>
+        <w:t>kpi_extractor.py</w:t>
+      </w:r>
+      <w:r>
+        <w:rPr>
+          <w:color w:val="000000"/>
+        </w:rPr>
+        <w:t xml:space="preserve"> finds # KPI: markers within functions.</w:t>
+      </w:r>
+    </w:p>
+    <w:p>
+      <w:pPr>
+        <w:pStyle w:val="ListParagraph"/>
+        <w:numPr>
+          <w:ilvl w:val="0"/>
+          <w:numId w:val="47"/>
+        </w:numPr>
+        <w:spacing w:before="100" w:beforeAutospacing="1" w:after="100" w:afterAutospacing="1"/>
+        <w:jc w:val="both"/>
+        <w:outlineLvl w:val="2"/>
+        <w:rPr>
+          <w:color w:val="000000"/>
+        </w:rPr>
+      </w:pPr>
+      <w:r>
+        <w:rPr>
+          <w:rFonts w:ascii="Courier New" w:hAnsi="Courier New" w:cs="Courier New"/>
+          <w:color w:val="000000"/>
+        </w:rPr>
+        <w:t>main.py</w:t>
+      </w:r>
+      <w:r>
+        <w:rPr>
+          <w:color w:val="000000"/>
+        </w:rPr>
+        <w:t xml:space="preserve"> scopes the function with AST, generates MathJax from code, and renders a Jinja template.</w:t>
+      </w:r>
+    </w:p>
+    <w:p>
+      <w:pPr>
+        <w:pStyle w:val="ListParagraph"/>
+        <w:numPr>
+          <w:ilvl w:val="0"/>
+          <w:numId w:val="47"/>
+        </w:numPr>
+        <w:spacing w:before="100" w:beforeAutospacing="1" w:after="100" w:afterAutospacing="1"/>
+        <w:jc w:val="both"/>
+        <w:outlineLvl w:val="2"/>
+        <w:rPr>
+          <w:color w:val="000000"/>
+        </w:rPr>
+      </w:pPr>
+      <w:r>
+        <w:rPr>
+          <w:rFonts w:ascii="Courier New" w:hAnsi="Courier New" w:cs="Courier New"/>
+          <w:color w:val="000000"/>
+        </w:rPr>
+        <w:t>ai_generator.py</w:t>
+      </w:r>
+      <w:r>
+        <w:rPr>
+          <w:color w:val="000000"/>
+        </w:rPr>
+        <w:t xml:space="preserve"> calls OpenAI to create narrative fields and infers a specific unit when the AI is vague.</w:t>
+      </w:r>
+    </w:p>
+    <w:p>
+      <w:pPr>
+        <w:pStyle w:val="ListParagraph"/>
+        <w:numPr>
+          <w:ilvl w:val="0"/>
+          <w:numId w:val="47"/>
+        </w:numPr>
+        <w:spacing w:before="100" w:beforeAutospacing="1" w:after="100" w:afterAutospacing="1"/>
+        <w:jc w:val="both"/>
+        <w:outlineLvl w:val="2"/>
+        <w:rPr>
+          <w:color w:val="000000"/>
+        </w:rPr>
+      </w:pPr>
+      <w:r>
+        <w:rPr>
+          <w:color w:val="000000"/>
+        </w:rPr>
+        <w:t>Sphinx converts .</w:t>
+      </w:r>
+      <w:r>
+        <w:rPr>
+          <w:rFonts w:ascii="Courier New" w:hAnsi="Courier New" w:cs="Courier New"/>
+          <w:color w:val="000000"/>
+        </w:rPr>
+        <w:t xml:space="preserve">rst </w:t>
+      </w:r>
+      <w:r>
+        <w:rPr>
+          <w:color w:val="000000"/>
+        </w:rPr>
+        <w:t>into an HTML Bluebook.</w:t>
+      </w:r>
+    </w:p>
+    <w:p>
+      <w:pPr>
+        <w:spacing w:before="100" w:beforeAutospacing="1" w:after="100" w:afterAutospacing="1"/>
+        <w:jc w:val="both"/>
+        <w:outlineLvl w:val="2"/>
+        <w:rPr>
+          <w:color w:val="000000"/>
+        </w:rPr>
+      </w:pPr>
+    </w:p>
     <w:p>
       <w:pPr>
         <w:pStyle w:val="ListParagraph"/>
@@ -3243,7 +3422,6 @@
         <w:rPr>
           <w:highlight w:val="yellow"/>
         </w:rPr>
-        <w:lastRenderedPageBreak/>
         <w:t xml:space="preserve">Option B by </w:t>
       </w:r>
       <w:r>
@@ -3839,16 +4017,7 @@
           <w:szCs w:val="18"/>
         </w:rPr>
         <w:tab/>
-        <w:t xml:space="preserve"> </w:t>
-      </w:r>
-      <w:r>
-        <w:rPr>
-          <w:rFonts w:ascii="Courier New" w:hAnsi="Courier New" w:cs="Courier New"/>
-          <w:color w:val="000000" w:themeColor="text1"/>
-          <w:sz w:val="18"/>
-          <w:szCs w:val="18"/>
-        </w:rPr>
-        <w:t xml:space="preserve"> </w:t>
+        <w:t xml:space="preserve">  </w:t>
       </w:r>
       <w:r>
         <w:rPr>
@@ -3948,16 +4117,7 @@
           <w:szCs w:val="18"/>
         </w:rPr>
         <w:tab/>
-        <w:t xml:space="preserve"> </w:t>
-      </w:r>
-      <w:r>
-        <w:rPr>
-          <w:rFonts w:ascii="Courier New" w:hAnsi="Courier New" w:cs="Courier New"/>
-          <w:color w:val="000000" w:themeColor="text1"/>
-          <w:sz w:val="18"/>
-          <w:szCs w:val="18"/>
-        </w:rPr>
-        <w:t xml:space="preserve"> </w:t>
+        <w:t xml:space="preserve">  </w:t>
       </w:r>
       <w:r>
         <w:rPr>
@@ -5129,14 +5289,6 @@
           <w:szCs w:val="18"/>
         </w:rPr>
         <w:tab/>
-      </w:r>
-      <w:r>
-        <w:rPr>
-          <w:rFonts w:ascii="Courier New" w:hAnsi="Courier New" w:cs="Courier New"/>
-          <w:color w:val="000000" w:themeColor="text1"/>
-          <w:sz w:val="18"/>
-          <w:szCs w:val="18"/>
-        </w:rPr>
         <w:t xml:space="preserve">  </w:t>
       </w:r>
       <w:r>
@@ -5274,1525 +5426,6 @@
         </w:rPr>
       </w:pPr>
     </w:p>
-    <w:p>
-      <w:pPr>
-        <w:pStyle w:val="Heading1"/>
-        <w:shd w:val="clear" w:color="auto" w:fill="1E1F22"/>
-        <w:spacing w:before="240" w:after="240"/>
-        <w:rPr>
-          <w:rFonts w:ascii="Helvetica" w:hAnsi="Helvetica"/>
-          <w:color w:val="BCBEC4"/>
-          <w:sz w:val="53"/>
-          <w:szCs w:val="53"/>
-        </w:rPr>
-      </w:pPr>
-      <w:r>
-        <w:rPr>
-          <w:rFonts w:ascii="Helvetica" w:hAnsi="Helvetica"/>
-          <w:color w:val="BCBEC4"/>
-          <w:sz w:val="53"/>
-          <w:szCs w:val="53"/>
-        </w:rPr>
-        <w:t>AI-Powered KPI Extractor &amp; Interactive Bluebook Generator</w:t>
-      </w:r>
-    </w:p>
-    <w:p>
-      <w:pPr>
-        <w:pStyle w:val="NormalWeb"/>
-        <w:shd w:val="clear" w:color="auto" w:fill="1E1F22"/>
-        <w:spacing w:before="240" w:beforeAutospacing="0" w:after="240" w:afterAutospacing="0"/>
-        <w:rPr>
-          <w:rFonts w:ascii="Helvetica" w:hAnsi="Helvetica"/>
-          <w:color w:val="BCBEC4"/>
-          <w:sz w:val="20"/>
-          <w:szCs w:val="20"/>
-        </w:rPr>
-      </w:pPr>
-      <w:r>
-        <w:rPr>
-          <w:rFonts w:ascii="Helvetica" w:hAnsi="Helvetica"/>
-          <w:color w:val="BCBEC4"/>
-          <w:sz w:val="20"/>
-          <w:szCs w:val="20"/>
-        </w:rPr>
-        <w:t>This tool scans your Python code for KPI comments inside functions, generates clean documentation pages with readable math, and builds an interactive HTML “Bluebook” using Sphinx.</w:t>
-      </w:r>
-    </w:p>
-    <w:p>
-      <w:pPr>
-        <w:pStyle w:val="Heading2"/>
-        <w:shd w:val="clear" w:color="auto" w:fill="1E1F22"/>
-        <w:spacing w:before="240" w:after="240"/>
-        <w:rPr>
-          <w:rFonts w:ascii="Helvetica" w:hAnsi="Helvetica"/>
-          <w:color w:val="BCBEC4"/>
-          <w:sz w:val="43"/>
-          <w:szCs w:val="43"/>
-        </w:rPr>
-      </w:pPr>
-      <w:r>
-        <w:rPr>
-          <w:rFonts w:ascii="Helvetica" w:hAnsi="Helvetica"/>
-          <w:color w:val="BCBEC4"/>
-          <w:sz w:val="43"/>
-          <w:szCs w:val="43"/>
-        </w:rPr>
-        <w:t>Features</w:t>
-      </w:r>
-    </w:p>
-    <w:p>
-      <w:pPr>
-        <w:numPr>
-          <w:ilvl w:val="0"/>
-          <w:numId w:val="13"/>
-        </w:numPr>
-        <w:shd w:val="clear" w:color="auto" w:fill="1E1F22"/>
-        <w:spacing w:before="100" w:beforeAutospacing="1" w:after="100" w:afterAutospacing="1"/>
-        <w:rPr>
-          <w:rFonts w:ascii="Helvetica" w:hAnsi="Helvetica"/>
-          <w:color w:val="BCBEC4"/>
-          <w:sz w:val="20"/>
-          <w:szCs w:val="20"/>
-        </w:rPr>
-      </w:pPr>
-      <w:r>
-        <w:rPr>
-          <w:rFonts w:ascii="Helvetica" w:hAnsi="Helvetica"/>
-          <w:color w:val="BCBEC4"/>
-          <w:sz w:val="20"/>
-          <w:szCs w:val="20"/>
-        </w:rPr>
-        <w:t>AST-precise “Code Context” (only the function that implements the KPI)</w:t>
-      </w:r>
-    </w:p>
-    <w:p>
-      <w:pPr>
-        <w:numPr>
-          <w:ilvl w:val="0"/>
-          <w:numId w:val="13"/>
-        </w:numPr>
-        <w:shd w:val="clear" w:color="auto" w:fill="1E1F22"/>
-        <w:spacing w:before="100" w:beforeAutospacing="1" w:after="100" w:afterAutospacing="1"/>
-        <w:rPr>
-          <w:rFonts w:ascii="Helvetica" w:hAnsi="Helvetica"/>
-          <w:color w:val="BCBEC4"/>
-          <w:sz w:val="20"/>
-          <w:szCs w:val="20"/>
-        </w:rPr>
-      </w:pPr>
-      <w:r>
-        <w:rPr>
-          <w:rFonts w:ascii="Helvetica" w:hAnsi="Helvetica"/>
-          <w:color w:val="BCBEC4"/>
-          <w:sz w:val="20"/>
-          <w:szCs w:val="20"/>
-        </w:rPr>
-        <w:t>Programmatic LaTeX/MathJax formulas with italic readable labels and correct operator precedence</w:t>
-      </w:r>
-    </w:p>
-    <w:p>
-      <w:pPr>
-        <w:numPr>
-          <w:ilvl w:val="0"/>
-          <w:numId w:val="13"/>
-        </w:numPr>
-        <w:shd w:val="clear" w:color="auto" w:fill="1E1F22"/>
-        <w:spacing w:before="100" w:beforeAutospacing="1" w:after="100" w:afterAutospacing="1"/>
-        <w:rPr>
-          <w:rFonts w:ascii="Helvetica" w:hAnsi="Helvetica"/>
-          <w:color w:val="BCBEC4"/>
-          <w:sz w:val="20"/>
-          <w:szCs w:val="20"/>
-        </w:rPr>
-      </w:pPr>
-      <w:r>
-        <w:rPr>
-          <w:rFonts w:ascii="Helvetica" w:hAnsi="Helvetica"/>
-          <w:color w:val="BCBEC4"/>
-          <w:sz w:val="20"/>
-          <w:szCs w:val="20"/>
-        </w:rPr>
-        <w:t>AI-generated descriptions/objectives/notes</w:t>
-      </w:r>
-    </w:p>
-    <w:p>
-      <w:pPr>
-        <w:numPr>
-          <w:ilvl w:val="0"/>
-          <w:numId w:val="13"/>
-        </w:numPr>
-        <w:shd w:val="clear" w:color="auto" w:fill="1E1F22"/>
-        <w:spacing w:before="100" w:beforeAutospacing="1" w:after="100" w:afterAutospacing="1"/>
-        <w:rPr>
-          <w:rFonts w:ascii="Helvetica" w:hAnsi="Helvetica"/>
-          <w:color w:val="BCBEC4"/>
-          <w:sz w:val="20"/>
-          <w:szCs w:val="20"/>
-        </w:rPr>
-      </w:pPr>
-      <w:r>
-        <w:rPr>
-          <w:rFonts w:ascii="Helvetica" w:hAnsi="Helvetica"/>
-          <w:color w:val="BCBEC4"/>
-          <w:sz w:val="20"/>
-          <w:szCs w:val="20"/>
-        </w:rPr>
-        <w:t>Smart unit-of-measure inference (%, tons/day, hours per failure, ratio, …)</w:t>
-      </w:r>
-    </w:p>
-    <w:p>
-      <w:pPr>
-        <w:numPr>
-          <w:ilvl w:val="0"/>
-          <w:numId w:val="13"/>
-        </w:numPr>
-        <w:shd w:val="clear" w:color="auto" w:fill="1E1F22"/>
-        <w:spacing w:before="100" w:beforeAutospacing="1" w:after="100" w:afterAutospacing="1"/>
-        <w:rPr>
-          <w:rFonts w:ascii="Helvetica" w:hAnsi="Helvetica"/>
-          <w:color w:val="BCBEC4"/>
-          <w:sz w:val="20"/>
-          <w:szCs w:val="20"/>
-        </w:rPr>
-      </w:pPr>
-      <w:r>
-        <w:rPr>
-          <w:rFonts w:ascii="Helvetica" w:hAnsi="Helvetica"/>
-          <w:color w:val="BCBEC4"/>
-          <w:sz w:val="20"/>
-          <w:szCs w:val="20"/>
-        </w:rPr>
-        <w:t>One-command CLI</w:t>
-      </w:r>
-    </w:p>
-    <w:p>
-      <w:pPr>
-        <w:pStyle w:val="Heading2"/>
-        <w:shd w:val="clear" w:color="auto" w:fill="1E1F22"/>
-        <w:spacing w:before="240" w:after="240"/>
-        <w:rPr>
-          <w:rFonts w:ascii="Helvetica" w:hAnsi="Helvetica"/>
-          <w:color w:val="BCBEC4"/>
-          <w:sz w:val="43"/>
-          <w:szCs w:val="43"/>
-        </w:rPr>
-      </w:pPr>
-      <w:r>
-        <w:rPr>
-          <w:rFonts w:ascii="Helvetica" w:hAnsi="Helvetica"/>
-          <w:color w:val="BCBEC4"/>
-          <w:sz w:val="43"/>
-          <w:szCs w:val="43"/>
-        </w:rPr>
-        <w:lastRenderedPageBreak/>
-        <w:t>Requirements</w:t>
-      </w:r>
-    </w:p>
-    <w:p>
-      <w:pPr>
-        <w:numPr>
-          <w:ilvl w:val="0"/>
-          <w:numId w:val="14"/>
-        </w:numPr>
-        <w:shd w:val="clear" w:color="auto" w:fill="1E1F22"/>
-        <w:spacing w:before="100" w:beforeAutospacing="1" w:after="100" w:afterAutospacing="1"/>
-        <w:rPr>
-          <w:rFonts w:ascii="Helvetica" w:hAnsi="Helvetica"/>
-          <w:color w:val="BCBEC4"/>
-          <w:sz w:val="20"/>
-          <w:szCs w:val="20"/>
-        </w:rPr>
-      </w:pPr>
-      <w:r>
-        <w:rPr>
-          <w:rFonts w:ascii="Helvetica" w:hAnsi="Helvetica"/>
-          <w:color w:val="BCBEC4"/>
-          <w:sz w:val="20"/>
-          <w:szCs w:val="20"/>
-        </w:rPr>
-        <w:t>Python 3.10+</w:t>
-      </w:r>
-    </w:p>
-    <w:p>
-      <w:pPr>
-        <w:numPr>
-          <w:ilvl w:val="0"/>
-          <w:numId w:val="14"/>
-        </w:numPr>
-        <w:shd w:val="clear" w:color="auto" w:fill="1E1F22"/>
-        <w:spacing w:before="100" w:beforeAutospacing="1" w:after="100" w:afterAutospacing="1"/>
-        <w:rPr>
-          <w:rFonts w:ascii="Helvetica" w:hAnsi="Helvetica"/>
-          <w:color w:val="BCBEC4"/>
-          <w:sz w:val="20"/>
-          <w:szCs w:val="20"/>
-        </w:rPr>
-      </w:pPr>
-      <w:r>
-        <w:rPr>
-          <w:rFonts w:ascii="Helvetica" w:hAnsi="Helvetica"/>
-          <w:color w:val="BCBEC4"/>
-          <w:sz w:val="20"/>
-          <w:szCs w:val="20"/>
-        </w:rPr>
-        <w:t>virtualenv + pip</w:t>
-      </w:r>
-    </w:p>
-    <w:p>
-      <w:pPr>
-        <w:numPr>
-          <w:ilvl w:val="0"/>
-          <w:numId w:val="14"/>
-        </w:numPr>
-        <w:shd w:val="clear" w:color="auto" w:fill="1E1F22"/>
-        <w:spacing w:before="100" w:beforeAutospacing="1" w:after="100" w:afterAutospacing="1"/>
-        <w:rPr>
-          <w:rFonts w:ascii="Helvetica" w:hAnsi="Helvetica"/>
-          <w:color w:val="BCBEC4"/>
-          <w:sz w:val="20"/>
-          <w:szCs w:val="20"/>
-        </w:rPr>
-      </w:pPr>
-      <w:r>
-        <w:rPr>
-          <w:rFonts w:ascii="Helvetica" w:hAnsi="Helvetica"/>
-          <w:color w:val="BCBEC4"/>
-          <w:sz w:val="20"/>
-          <w:szCs w:val="20"/>
-        </w:rPr>
-        <w:t>Packages: click, jinja2, requests (installed automatically by your project)</w:t>
-      </w:r>
-    </w:p>
-    <w:p>
-      <w:pPr>
-        <w:numPr>
-          <w:ilvl w:val="0"/>
-          <w:numId w:val="14"/>
-        </w:numPr>
-        <w:shd w:val="clear" w:color="auto" w:fill="1E1F22"/>
-        <w:spacing w:beforeAutospacing="1" w:afterAutospacing="1"/>
-        <w:rPr>
-          <w:rFonts w:ascii="Helvetica" w:hAnsi="Helvetica"/>
-          <w:color w:val="BCBEC4"/>
-          <w:sz w:val="20"/>
-          <w:szCs w:val="20"/>
-        </w:rPr>
-      </w:pPr>
-      <w:r>
-        <w:rPr>
-          <w:rFonts w:ascii="Helvetica" w:hAnsi="Helvetica"/>
-          <w:color w:val="BCBEC4"/>
-          <w:sz w:val="20"/>
-          <w:szCs w:val="20"/>
-        </w:rPr>
-        <w:t>Sphinx for building docs: </w:t>
-      </w:r>
-      <w:r>
-        <w:rPr>
-          <w:rFonts w:ascii="Consolas" w:hAnsi="Consolas" w:cs="Consolas"/>
-          <w:noProof/>
-          <w:color w:val="6B9BFA"/>
-          <w:sz w:val="18"/>
-          <w:szCs w:val="18"/>
-        </w:rPr>
-        <w:drawing>
-          <wp:inline distT="0" distB="0" distL="0" distR="0" wp14:anchorId="061340A0" wp14:editId="6931ABCA">
-            <wp:extent cx="382905" cy="382905"/>
-            <wp:effectExtent l="0" t="0" r="0" b="0"/>
-            <wp:docPr id="275616377" name="Picture 9">
-              <a:hlinkClick xmlns:a="http://schemas.openxmlformats.org/drawingml/2006/main" r:id="rId10"/>
-            </wp:docPr>
-            <wp:cNvGraphicFramePr>
-              <a:graphicFrameLocks xmlns:a="http://schemas.openxmlformats.org/drawingml/2006/main" noChangeAspect="1"/>
-            </wp:cNvGraphicFramePr>
-            <a:graphic xmlns:a="http://schemas.openxmlformats.org/drawingml/2006/main">
-              <a:graphicData uri="http://schemas.openxmlformats.org/drawingml/2006/picture">
-                <pic:pic xmlns:pic="http://schemas.openxmlformats.org/drawingml/2006/picture">
-                  <pic:nvPicPr>
-                    <pic:cNvPr id="0" name="Picture 16">
-                      <a:hlinkClick r:id="rId10"/>
-                    </pic:cNvPr>
-                    <pic:cNvPicPr>
-                      <a:picLocks noChangeAspect="1" noChangeArrowheads="1"/>
-                    </pic:cNvPicPr>
-                  </pic:nvPicPr>
-                  <pic:blipFill>
-                    <a:blip r:embed="rId11">
-                      <a:extLst>
-                        <a:ext uri="{28A0092B-C50C-407E-A947-70E740481C1C}">
-                          <a14:useLocalDpi xmlns:a14="http://schemas.microsoft.com/office/drawing/2010/main" val="0"/>
-                        </a:ext>
-                      </a:extLst>
-                    </a:blip>
-                    <a:srcRect/>
-                    <a:stretch>
-                      <a:fillRect/>
-                    </a:stretch>
-                  </pic:blipFill>
-                  <pic:spPr bwMode="auto">
-                    <a:xfrm>
-                      <a:off x="0" y="0"/>
-                      <a:ext cx="382905" cy="382905"/>
-                    </a:xfrm>
-                    <a:prstGeom prst="rect">
-                      <a:avLst/>
-                    </a:prstGeom>
-                    <a:noFill/>
-                    <a:ln>
-                      <a:noFill/>
-                    </a:ln>
-                  </pic:spPr>
-                </pic:pic>
-              </a:graphicData>
-            </a:graphic>
-          </wp:inline>
-        </w:drawing>
-      </w:r>
-      <w:r>
-        <w:rPr>
-          <w:rStyle w:val="HTMLCode"/>
-          <w:rFonts w:ascii="Consolas" w:eastAsiaTheme="majorEastAsia" w:hAnsi="Consolas" w:cs="Consolas"/>
-          <w:color w:val="BCBEC4"/>
-          <w:sz w:val="18"/>
-          <w:szCs w:val="18"/>
-        </w:rPr>
-        <w:t>pip install sphinx</w:t>
-      </w:r>
-    </w:p>
-    <w:p>
-      <w:pPr>
-        <w:pStyle w:val="Heading2"/>
-        <w:shd w:val="clear" w:color="auto" w:fill="1E1F22"/>
-        <w:spacing w:before="240" w:after="240"/>
-        <w:rPr>
-          <w:rFonts w:ascii="Helvetica" w:hAnsi="Helvetica"/>
-          <w:color w:val="BCBEC4"/>
-          <w:sz w:val="43"/>
-          <w:szCs w:val="43"/>
-        </w:rPr>
-      </w:pPr>
-      <w:r>
-        <w:rPr>
-          <w:rFonts w:ascii="Helvetica" w:hAnsi="Helvetica"/>
-          <w:color w:val="BCBEC4"/>
-          <w:sz w:val="43"/>
-          <w:szCs w:val="43"/>
-        </w:rPr>
-        <w:t>Install</w:t>
-      </w:r>
-    </w:p>
-    <w:p>
-      <w:pPr>
-        <w:pStyle w:val="NormalWeb"/>
-        <w:shd w:val="clear" w:color="auto" w:fill="1E1F22"/>
-        <w:spacing w:before="0" w:beforeAutospacing="0" w:after="0" w:afterAutospacing="0"/>
-        <w:rPr>
-          <w:rFonts w:ascii="Helvetica" w:hAnsi="Helvetica"/>
-          <w:color w:val="BCBEC4"/>
-          <w:sz w:val="20"/>
-          <w:szCs w:val="20"/>
-        </w:rPr>
-      </w:pPr>
-      <w:r>
-        <w:rPr>
-          <w:rFonts w:ascii="Helvetica" w:hAnsi="Helvetica"/>
-          <w:color w:val="BCBEC4"/>
-          <w:sz w:val="20"/>
-          <w:szCs w:val="20"/>
-        </w:rPr>
-        <w:t>Bash </w:t>
-      </w:r>
-      <w:r>
-        <w:rPr>
-          <w:rFonts w:ascii="Consolas" w:hAnsi="Consolas" w:cs="Consolas"/>
-          <w:noProof/>
-          <w:color w:val="6B9BFA"/>
-          <w:sz w:val="18"/>
-          <w:szCs w:val="18"/>
-        </w:rPr>
-        <w:drawing>
-          <wp:inline distT="0" distB="0" distL="0" distR="0" wp14:anchorId="2BA2E2D0" wp14:editId="4398798F">
-            <wp:extent cx="382905" cy="382905"/>
-            <wp:effectExtent l="0" t="0" r="0" b="0"/>
-            <wp:docPr id="1999026834" name="Picture 8">
-              <a:hlinkClick xmlns:a="http://schemas.openxmlformats.org/drawingml/2006/main" r:id="rId10"/>
-            </wp:docPr>
-            <wp:cNvGraphicFramePr>
-              <a:graphicFrameLocks xmlns:a="http://schemas.openxmlformats.org/drawingml/2006/main" noChangeAspect="1"/>
-            </wp:cNvGraphicFramePr>
-            <a:graphic xmlns:a="http://schemas.openxmlformats.org/drawingml/2006/main">
-              <a:graphicData uri="http://schemas.openxmlformats.org/drawingml/2006/picture">
-                <pic:pic xmlns:pic="http://schemas.openxmlformats.org/drawingml/2006/picture">
-                  <pic:nvPicPr>
-                    <pic:cNvPr id="0" name="Picture 17">
-                      <a:hlinkClick r:id="rId10"/>
-                    </pic:cNvPr>
-                    <pic:cNvPicPr>
-                      <a:picLocks noChangeAspect="1" noChangeArrowheads="1"/>
-                    </pic:cNvPicPr>
-                  </pic:nvPicPr>
-                  <pic:blipFill>
-                    <a:blip r:embed="rId11">
-                      <a:extLst>
-                        <a:ext uri="{28A0092B-C50C-407E-A947-70E740481C1C}">
-                          <a14:useLocalDpi xmlns:a14="http://schemas.microsoft.com/office/drawing/2010/main" val="0"/>
-                        </a:ext>
-                      </a:extLst>
-                    </a:blip>
-                    <a:srcRect/>
-                    <a:stretch>
-                      <a:fillRect/>
-                    </a:stretch>
-                  </pic:blipFill>
-                  <pic:spPr bwMode="auto">
-                    <a:xfrm>
-                      <a:off x="0" y="0"/>
-                      <a:ext cx="382905" cy="382905"/>
-                    </a:xfrm>
-                    <a:prstGeom prst="rect">
-                      <a:avLst/>
-                    </a:prstGeom>
-                    <a:noFill/>
-                    <a:ln>
-                      <a:noFill/>
-                    </a:ln>
-                  </pic:spPr>
-                </pic:pic>
-              </a:graphicData>
-            </a:graphic>
-          </wp:inline>
-        </w:drawing>
-      </w:r>
-      <w:r>
-        <w:rPr>
-          <w:rStyle w:val="HTMLCode"/>
-          <w:rFonts w:ascii="Consolas" w:eastAsiaTheme="majorEastAsia" w:hAnsi="Consolas" w:cs="Consolas"/>
-          <w:color w:val="BCBEC4"/>
-          <w:sz w:val="18"/>
-          <w:szCs w:val="18"/>
-        </w:rPr>
-        <w:t>python -m venv .venv &amp;&amp; source .venv/bin/activate pip install -e</w:t>
-      </w:r>
-    </w:p>
-    <w:p>
-      <w:pPr>
-        <w:pStyle w:val="Heading2"/>
-        <w:shd w:val="clear" w:color="auto" w:fill="1E1F22"/>
-        <w:spacing w:before="240" w:after="240"/>
-        <w:rPr>
-          <w:rFonts w:ascii="Helvetica" w:hAnsi="Helvetica"/>
-          <w:color w:val="BCBEC4"/>
-          <w:sz w:val="43"/>
-          <w:szCs w:val="43"/>
-        </w:rPr>
-      </w:pPr>
-      <w:r>
-        <w:rPr>
-          <w:rFonts w:ascii="Helvetica" w:hAnsi="Helvetica"/>
-          <w:color w:val="BCBEC4"/>
-          <w:sz w:val="43"/>
-          <w:szCs w:val="43"/>
-        </w:rPr>
-        <w:t>If you don’t have a setup.py, simply run from the repo root:</w:t>
-      </w:r>
-    </w:p>
-    <w:p>
-      <w:pPr>
-        <w:pStyle w:val="NormalWeb"/>
-        <w:shd w:val="clear" w:color="auto" w:fill="1E1F22"/>
-        <w:spacing w:before="0" w:beforeAutospacing="0" w:after="0" w:afterAutospacing="0"/>
-        <w:rPr>
-          <w:rFonts w:ascii="Helvetica" w:hAnsi="Helvetica"/>
-          <w:color w:val="BCBEC4"/>
-          <w:sz w:val="20"/>
-          <w:szCs w:val="20"/>
-        </w:rPr>
-      </w:pPr>
-      <w:r>
-        <w:rPr>
-          <w:rFonts w:ascii="Helvetica" w:hAnsi="Helvetica"/>
-          <w:color w:val="BCBEC4"/>
-          <w:sz w:val="20"/>
-          <w:szCs w:val="20"/>
-        </w:rPr>
-        <w:t>bash </w:t>
-      </w:r>
-      <w:r>
-        <w:rPr>
-          <w:rFonts w:ascii="Consolas" w:hAnsi="Consolas" w:cs="Consolas"/>
-          <w:noProof/>
-          <w:color w:val="6B9BFA"/>
-          <w:sz w:val="18"/>
-          <w:szCs w:val="18"/>
-        </w:rPr>
-        <w:drawing>
-          <wp:inline distT="0" distB="0" distL="0" distR="0" wp14:anchorId="22E4113E" wp14:editId="19392DF6">
-            <wp:extent cx="382905" cy="382905"/>
-            <wp:effectExtent l="0" t="0" r="0" b="0"/>
-            <wp:docPr id="1780531767" name="Picture 7">
-              <a:hlinkClick xmlns:a="http://schemas.openxmlformats.org/drawingml/2006/main" r:id="rId10"/>
-            </wp:docPr>
-            <wp:cNvGraphicFramePr>
-              <a:graphicFrameLocks xmlns:a="http://schemas.openxmlformats.org/drawingml/2006/main" noChangeAspect="1"/>
-            </wp:cNvGraphicFramePr>
-            <a:graphic xmlns:a="http://schemas.openxmlformats.org/drawingml/2006/main">
-              <a:graphicData uri="http://schemas.openxmlformats.org/drawingml/2006/picture">
-                <pic:pic xmlns:pic="http://schemas.openxmlformats.org/drawingml/2006/picture">
-                  <pic:nvPicPr>
-                    <pic:cNvPr id="0" name="Picture 18">
-                      <a:hlinkClick r:id="rId10"/>
-                    </pic:cNvPr>
-                    <pic:cNvPicPr>
-                      <a:picLocks noChangeAspect="1" noChangeArrowheads="1"/>
-                    </pic:cNvPicPr>
-                  </pic:nvPicPr>
-                  <pic:blipFill>
-                    <a:blip r:embed="rId11">
-                      <a:extLst>
-                        <a:ext uri="{28A0092B-C50C-407E-A947-70E740481C1C}">
-                          <a14:useLocalDpi xmlns:a14="http://schemas.microsoft.com/office/drawing/2010/main" val="0"/>
-                        </a:ext>
-                      </a:extLst>
-                    </a:blip>
-                    <a:srcRect/>
-                    <a:stretch>
-                      <a:fillRect/>
-                    </a:stretch>
-                  </pic:blipFill>
-                  <pic:spPr bwMode="auto">
-                    <a:xfrm>
-                      <a:off x="0" y="0"/>
-                      <a:ext cx="382905" cy="382905"/>
-                    </a:xfrm>
-                    <a:prstGeom prst="rect">
-                      <a:avLst/>
-                    </a:prstGeom>
-                    <a:noFill/>
-                    <a:ln>
-                      <a:noFill/>
-                    </a:ln>
-                  </pic:spPr>
-                </pic:pic>
-              </a:graphicData>
-            </a:graphic>
-          </wp:inline>
-        </w:drawing>
-      </w:r>
-      <w:r>
-        <w:rPr>
-          <w:rStyle w:val="HTMLCode"/>
-          <w:rFonts w:ascii="Consolas" w:eastAsiaTheme="majorEastAsia" w:hAnsi="Consolas" w:cs="Consolas"/>
-          <w:color w:val="BCBEC4"/>
-          <w:sz w:val="18"/>
-          <w:szCs w:val="18"/>
-        </w:rPr>
-        <w:t>python -m bluebook_generator.cli generate path/to/your/source</w:t>
-      </w:r>
-    </w:p>
-    <w:p>
-      <w:pPr>
-        <w:pStyle w:val="Heading2"/>
-        <w:shd w:val="clear" w:color="auto" w:fill="1E1F22"/>
-        <w:spacing w:before="240" w:after="240"/>
-        <w:rPr>
-          <w:rFonts w:ascii="Helvetica" w:hAnsi="Helvetica"/>
-          <w:color w:val="BCBEC4"/>
-          <w:sz w:val="43"/>
-          <w:szCs w:val="43"/>
-        </w:rPr>
-      </w:pPr>
-      <w:r>
-        <w:rPr>
-          <w:rFonts w:ascii="Helvetica" w:hAnsi="Helvetica"/>
-          <w:color w:val="BCBEC4"/>
-          <w:sz w:val="43"/>
-          <w:szCs w:val="43"/>
-        </w:rPr>
-        <w:t>Set your OpenAI key:</w:t>
-      </w:r>
-    </w:p>
-    <w:p>
-      <w:pPr>
-        <w:pStyle w:val="NormalWeb"/>
-        <w:shd w:val="clear" w:color="auto" w:fill="1E1F22"/>
-        <w:spacing w:before="240" w:beforeAutospacing="0" w:after="240" w:afterAutospacing="0"/>
-        <w:rPr>
-          <w:rFonts w:ascii="Helvetica" w:hAnsi="Helvetica"/>
-          <w:color w:val="BCBEC4"/>
-          <w:sz w:val="20"/>
-          <w:szCs w:val="20"/>
-        </w:rPr>
-      </w:pPr>
-      <w:r>
-        <w:rPr>
-          <w:rFonts w:ascii="Helvetica" w:hAnsi="Helvetica"/>
-          <w:color w:val="BCBEC4"/>
-          <w:sz w:val="20"/>
-          <w:szCs w:val="20"/>
-        </w:rPr>
-        <w:t>bash 'export OPENAI_API_KEY=sk-...'</w:t>
-      </w:r>
-    </w:p>
-    <w:p>
-      <w:pPr>
-        <w:pStyle w:val="Heading2"/>
-        <w:shd w:val="clear" w:color="auto" w:fill="1E1F22"/>
-        <w:spacing w:before="240" w:after="240"/>
-        <w:rPr>
-          <w:rFonts w:ascii="Helvetica" w:hAnsi="Helvetica"/>
-          <w:color w:val="BCBEC4"/>
-          <w:sz w:val="43"/>
-          <w:szCs w:val="43"/>
-        </w:rPr>
-      </w:pPr>
-      <w:r>
-        <w:rPr>
-          <w:rFonts w:ascii="Helvetica" w:hAnsi="Helvetica"/>
-          <w:color w:val="BCBEC4"/>
-          <w:sz w:val="43"/>
-          <w:szCs w:val="43"/>
-        </w:rPr>
-        <w:t>How to Use</w:t>
-      </w:r>
-    </w:p>
-    <w:p>
-      <w:pPr>
-        <w:numPr>
-          <w:ilvl w:val="0"/>
-          <w:numId w:val="15"/>
-        </w:numPr>
-        <w:shd w:val="clear" w:color="auto" w:fill="1E1F22"/>
-        <w:spacing w:before="100" w:beforeAutospacing="1" w:after="100" w:afterAutospacing="1"/>
-        <w:rPr>
-          <w:rFonts w:ascii="Helvetica" w:hAnsi="Helvetica"/>
-          <w:color w:val="BCBEC4"/>
-          <w:sz w:val="20"/>
-          <w:szCs w:val="20"/>
-        </w:rPr>
-      </w:pPr>
-      <w:r>
-        <w:rPr>
-          <w:rFonts w:ascii="Helvetica" w:hAnsi="Helvetica"/>
-          <w:color w:val="BCBEC4"/>
-          <w:sz w:val="20"/>
-          <w:szCs w:val="20"/>
-        </w:rPr>
-        <w:t>Tag KPIs in code inside a function with a single-line comment: 'python def calculate_oee(...): # KPI: Overall Equipment Effectiveness (OEE) oee = availability * performance * quality * 100 return oee'</w:t>
-      </w:r>
-    </w:p>
-    <w:p>
-      <w:pPr>
-        <w:numPr>
-          <w:ilvl w:val="0"/>
-          <w:numId w:val="15"/>
-        </w:numPr>
-        <w:shd w:val="clear" w:color="auto" w:fill="1E1F22"/>
-        <w:spacing w:before="100" w:beforeAutospacing="1" w:after="100" w:afterAutospacing="1"/>
-        <w:rPr>
-          <w:rFonts w:ascii="Helvetica" w:hAnsi="Helvetica"/>
-          <w:color w:val="BCBEC4"/>
-          <w:sz w:val="20"/>
-          <w:szCs w:val="20"/>
-        </w:rPr>
-      </w:pPr>
-      <w:r>
-        <w:rPr>
-          <w:rFonts w:ascii="Helvetica" w:hAnsi="Helvetica"/>
-          <w:color w:val="BCBEC4"/>
-          <w:sz w:val="20"/>
-          <w:szCs w:val="20"/>
-        </w:rPr>
-        <w:t>Generate: bash 'bluebook generate ./path/to/your/repo'</w:t>
-      </w:r>
-    </w:p>
-    <w:p>
-      <w:pPr>
-        <w:numPr>
-          <w:ilvl w:val="0"/>
-          <w:numId w:val="15"/>
-        </w:numPr>
-        <w:shd w:val="clear" w:color="auto" w:fill="1E1F22"/>
-        <w:spacing w:beforeAutospacing="1" w:afterAutospacing="1"/>
-        <w:rPr>
-          <w:rFonts w:ascii="Helvetica" w:hAnsi="Helvetica"/>
-          <w:color w:val="BCBEC4"/>
-          <w:sz w:val="20"/>
-          <w:szCs w:val="20"/>
-        </w:rPr>
-      </w:pPr>
-      <w:r>
-        <w:rPr>
-          <w:rFonts w:ascii="Helvetica" w:hAnsi="Helvetica"/>
-          <w:color w:val="BCBEC4"/>
-          <w:sz w:val="20"/>
-          <w:szCs w:val="20"/>
-        </w:rPr>
-        <w:t>Open </w:t>
-      </w:r>
-      <w:r>
-        <w:rPr>
-          <w:rStyle w:val="HTMLCode"/>
-          <w:rFonts w:ascii="Consolas" w:eastAsiaTheme="majorEastAsia" w:hAnsi="Consolas" w:cs="Consolas"/>
-          <w:color w:val="BCBEC4"/>
-          <w:sz w:val="18"/>
-          <w:szCs w:val="18"/>
-        </w:rPr>
-        <w:t>docs/_build/index.html</w:t>
-      </w:r>
-      <w:r>
-        <w:rPr>
-          <w:rFonts w:ascii="Helvetica" w:hAnsi="Helvetica"/>
-          <w:color w:val="BCBEC4"/>
-          <w:sz w:val="20"/>
-          <w:szCs w:val="20"/>
-        </w:rPr>
-        <w:t>.</w:t>
-      </w:r>
-    </w:p>
-    <w:p>
-      <w:pPr>
-        <w:pStyle w:val="Heading2"/>
-        <w:shd w:val="clear" w:color="auto" w:fill="1E1F22"/>
-        <w:spacing w:before="240" w:after="240"/>
-        <w:rPr>
-          <w:rFonts w:ascii="Helvetica" w:hAnsi="Helvetica"/>
-          <w:color w:val="BCBEC4"/>
-          <w:sz w:val="43"/>
-          <w:szCs w:val="43"/>
-        </w:rPr>
-      </w:pPr>
-      <w:r>
-        <w:rPr>
-          <w:rFonts w:ascii="Helvetica" w:hAnsi="Helvetica"/>
-          <w:color w:val="BCBEC4"/>
-          <w:sz w:val="43"/>
-          <w:szCs w:val="43"/>
-        </w:rPr>
-        <w:t>How it Works</w:t>
-      </w:r>
-    </w:p>
-    <w:p>
-      <w:pPr>
-        <w:numPr>
-          <w:ilvl w:val="0"/>
-          <w:numId w:val="16"/>
-        </w:numPr>
-        <w:shd w:val="clear" w:color="auto" w:fill="1E1F22"/>
-        <w:spacing w:beforeAutospacing="1" w:afterAutospacing="1"/>
-        <w:rPr>
-          <w:rFonts w:ascii="Helvetica" w:hAnsi="Helvetica"/>
-          <w:color w:val="BCBEC4"/>
-          <w:sz w:val="20"/>
-          <w:szCs w:val="20"/>
-        </w:rPr>
-      </w:pPr>
-      <w:r>
-        <w:rPr>
-          <w:rStyle w:val="HTMLCode"/>
-          <w:rFonts w:ascii="Consolas" w:eastAsiaTheme="majorEastAsia" w:hAnsi="Consolas" w:cs="Consolas"/>
-          <w:color w:val="BCBEC4"/>
-          <w:sz w:val="18"/>
-          <w:szCs w:val="18"/>
-        </w:rPr>
-        <w:t>kpi_extractor.py</w:t>
-      </w:r>
-      <w:r>
-        <w:rPr>
-          <w:rFonts w:ascii="Helvetica" w:hAnsi="Helvetica"/>
-          <w:color w:val="BCBEC4"/>
-          <w:sz w:val="20"/>
-          <w:szCs w:val="20"/>
-        </w:rPr>
-        <w:t> finds </w:t>
-      </w:r>
-      <w:r>
-        <w:rPr>
-          <w:rStyle w:val="HTMLCode"/>
-          <w:rFonts w:ascii="Consolas" w:eastAsiaTheme="majorEastAsia" w:hAnsi="Consolas" w:cs="Consolas"/>
-          <w:color w:val="BCBEC4"/>
-          <w:sz w:val="18"/>
-          <w:szCs w:val="18"/>
-        </w:rPr>
-        <w:t># KPI:</w:t>
-      </w:r>
-      <w:r>
-        <w:rPr>
-          <w:rFonts w:ascii="Helvetica" w:hAnsi="Helvetica"/>
-          <w:color w:val="BCBEC4"/>
-          <w:sz w:val="20"/>
-          <w:szCs w:val="20"/>
-        </w:rPr>
-        <w:t> markers within functions.</w:t>
-      </w:r>
-    </w:p>
-    <w:p>
-      <w:pPr>
-        <w:numPr>
-          <w:ilvl w:val="0"/>
-          <w:numId w:val="16"/>
-        </w:numPr>
-        <w:shd w:val="clear" w:color="auto" w:fill="1E1F22"/>
-        <w:spacing w:beforeAutospacing="1" w:afterAutospacing="1"/>
-        <w:rPr>
-          <w:rFonts w:ascii="Helvetica" w:hAnsi="Helvetica"/>
-          <w:color w:val="BCBEC4"/>
-          <w:sz w:val="20"/>
-          <w:szCs w:val="20"/>
-        </w:rPr>
-      </w:pPr>
-      <w:r>
-        <w:rPr>
-          <w:rStyle w:val="HTMLCode"/>
-          <w:rFonts w:ascii="Consolas" w:eastAsiaTheme="majorEastAsia" w:hAnsi="Consolas" w:cs="Consolas"/>
-          <w:color w:val="BCBEC4"/>
-          <w:sz w:val="18"/>
-          <w:szCs w:val="18"/>
-        </w:rPr>
-        <w:t>main.py</w:t>
-      </w:r>
-      <w:r>
-        <w:rPr>
-          <w:rFonts w:ascii="Helvetica" w:hAnsi="Helvetica"/>
-          <w:color w:val="BCBEC4"/>
-          <w:sz w:val="20"/>
-          <w:szCs w:val="20"/>
-        </w:rPr>
-        <w:t> scopes the function with AST, generates MathJax from code, and renders a Jinja template.</w:t>
-      </w:r>
-    </w:p>
-    <w:p>
-      <w:pPr>
-        <w:numPr>
-          <w:ilvl w:val="0"/>
-          <w:numId w:val="16"/>
-        </w:numPr>
-        <w:shd w:val="clear" w:color="auto" w:fill="1E1F22"/>
-        <w:spacing w:beforeAutospacing="1" w:afterAutospacing="1"/>
-        <w:rPr>
-          <w:rFonts w:ascii="Helvetica" w:hAnsi="Helvetica"/>
-          <w:color w:val="BCBEC4"/>
-          <w:sz w:val="20"/>
-          <w:szCs w:val="20"/>
-        </w:rPr>
-      </w:pPr>
-      <w:r>
-        <w:rPr>
-          <w:rStyle w:val="HTMLCode"/>
-          <w:rFonts w:ascii="Consolas" w:eastAsiaTheme="majorEastAsia" w:hAnsi="Consolas" w:cs="Consolas"/>
-          <w:color w:val="BCBEC4"/>
-          <w:sz w:val="18"/>
-          <w:szCs w:val="18"/>
-        </w:rPr>
-        <w:t>ai_generator.py</w:t>
-      </w:r>
-      <w:r>
-        <w:rPr>
-          <w:rFonts w:ascii="Helvetica" w:hAnsi="Helvetica"/>
-          <w:color w:val="BCBEC4"/>
-          <w:sz w:val="20"/>
-          <w:szCs w:val="20"/>
-        </w:rPr>
-        <w:t> calls OpenAI to create narrative fields and infers a specific unit when the AI is vague.</w:t>
-      </w:r>
-    </w:p>
-    <w:p>
-      <w:pPr>
-        <w:numPr>
-          <w:ilvl w:val="0"/>
-          <w:numId w:val="16"/>
-        </w:numPr>
-        <w:shd w:val="clear" w:color="auto" w:fill="1E1F22"/>
-        <w:spacing w:beforeAutospacing="1" w:afterAutospacing="1"/>
-        <w:rPr>
-          <w:rFonts w:ascii="Helvetica" w:hAnsi="Helvetica"/>
-          <w:color w:val="BCBEC4"/>
-          <w:sz w:val="20"/>
-          <w:szCs w:val="20"/>
-        </w:rPr>
-      </w:pPr>
-      <w:r>
-        <w:rPr>
-          <w:rFonts w:ascii="Helvetica" w:hAnsi="Helvetica"/>
-          <w:color w:val="BCBEC4"/>
-          <w:sz w:val="20"/>
-          <w:szCs w:val="20"/>
-        </w:rPr>
-        <w:t>Sphinx converts </w:t>
-      </w:r>
-      <w:r>
-        <w:rPr>
-          <w:rStyle w:val="HTMLCode"/>
-          <w:rFonts w:ascii="Consolas" w:eastAsiaTheme="majorEastAsia" w:hAnsi="Consolas" w:cs="Consolas"/>
-          <w:color w:val="BCBEC4"/>
-          <w:sz w:val="18"/>
-          <w:szCs w:val="18"/>
-        </w:rPr>
-        <w:t>.rst</w:t>
-      </w:r>
-      <w:r>
-        <w:rPr>
-          <w:rFonts w:ascii="Helvetica" w:hAnsi="Helvetica"/>
-          <w:color w:val="BCBEC4"/>
-          <w:sz w:val="20"/>
-          <w:szCs w:val="20"/>
-        </w:rPr>
-        <w:t> into an HTML Bluebook.</w:t>
-      </w:r>
-    </w:p>
-    <w:p>
-      <w:pPr>
-        <w:pStyle w:val="Heading2"/>
-        <w:shd w:val="clear" w:color="auto" w:fill="1E1F22"/>
-        <w:spacing w:before="240" w:after="240"/>
-        <w:rPr>
-          <w:rFonts w:ascii="Helvetica" w:hAnsi="Helvetica"/>
-          <w:color w:val="BCBEC4"/>
-          <w:sz w:val="43"/>
-          <w:szCs w:val="43"/>
-        </w:rPr>
-      </w:pPr>
-      <w:r>
-        <w:rPr>
-          <w:rFonts w:ascii="Helvetica" w:hAnsi="Helvetica"/>
-          <w:color w:val="BCBEC4"/>
-          <w:sz w:val="43"/>
-          <w:szCs w:val="43"/>
-        </w:rPr>
-        <w:t>Customization</w:t>
-      </w:r>
-    </w:p>
-    <w:p>
-      <w:pPr>
-        <w:numPr>
-          <w:ilvl w:val="0"/>
-          <w:numId w:val="17"/>
-        </w:numPr>
-        <w:shd w:val="clear" w:color="auto" w:fill="1E1F22"/>
-        <w:spacing w:beforeAutospacing="1" w:afterAutospacing="1"/>
-        <w:rPr>
-          <w:rFonts w:ascii="Helvetica" w:hAnsi="Helvetica"/>
-          <w:color w:val="BCBEC4"/>
-          <w:sz w:val="20"/>
-          <w:szCs w:val="20"/>
-        </w:rPr>
-      </w:pPr>
-      <w:r>
-        <w:rPr>
-          <w:rFonts w:ascii="Helvetica" w:hAnsi="Helvetica"/>
-          <w:color w:val="BCBEC4"/>
-          <w:sz w:val="20"/>
-          <w:szCs w:val="20"/>
-        </w:rPr>
-        <w:t>Edit </w:t>
-      </w:r>
-      <w:r>
-        <w:rPr>
-          <w:rStyle w:val="HTMLCode"/>
-          <w:rFonts w:ascii="Consolas" w:eastAsiaTheme="majorEastAsia" w:hAnsi="Consolas" w:cs="Consolas"/>
-          <w:color w:val="BCBEC4"/>
-          <w:sz w:val="18"/>
-          <w:szCs w:val="18"/>
-        </w:rPr>
-        <w:t>templates/kpi_template.rst.j2</w:t>
-      </w:r>
-      <w:r>
-        <w:rPr>
-          <w:rFonts w:ascii="Helvetica" w:hAnsi="Helvetica"/>
-          <w:color w:val="BCBEC4"/>
-          <w:sz w:val="20"/>
-          <w:szCs w:val="20"/>
-        </w:rPr>
-        <w:t> for layout.</w:t>
-      </w:r>
-    </w:p>
-    <w:p>
-      <w:pPr>
-        <w:numPr>
-          <w:ilvl w:val="0"/>
-          <w:numId w:val="17"/>
-        </w:numPr>
-        <w:shd w:val="clear" w:color="auto" w:fill="1E1F22"/>
-        <w:spacing w:beforeAutospacing="1" w:afterAutospacing="1"/>
-        <w:rPr>
-          <w:rFonts w:ascii="Helvetica" w:hAnsi="Helvetica"/>
-          <w:color w:val="BCBEC4"/>
-          <w:sz w:val="20"/>
-          <w:szCs w:val="20"/>
-        </w:rPr>
-      </w:pPr>
-      <w:r>
-        <w:rPr>
-          <w:rFonts w:ascii="Helvetica" w:hAnsi="Helvetica"/>
-          <w:color w:val="BCBEC4"/>
-          <w:sz w:val="20"/>
-          <w:szCs w:val="20"/>
-        </w:rPr>
-        <w:t>Add rules to </w:t>
-      </w:r>
-      <w:r>
-        <w:rPr>
-          <w:rStyle w:val="HTMLCode"/>
-          <w:rFonts w:ascii="Consolas" w:eastAsiaTheme="majorEastAsia" w:hAnsi="Consolas" w:cs="Consolas"/>
-          <w:color w:val="BCBEC4"/>
-          <w:sz w:val="18"/>
-          <w:szCs w:val="18"/>
-        </w:rPr>
-        <w:t>ai_generator._infer_unit_of_measure</w:t>
-      </w:r>
-      <w:r>
-        <w:rPr>
-          <w:rFonts w:ascii="Helvetica" w:hAnsi="Helvetica"/>
-          <w:color w:val="BCBEC4"/>
-          <w:sz w:val="20"/>
-          <w:szCs w:val="20"/>
-        </w:rPr>
-        <w:t> to refine units.</w:t>
-      </w:r>
-    </w:p>
-    <w:p>
-      <w:pPr>
-        <w:numPr>
-          <w:ilvl w:val="0"/>
-          <w:numId w:val="17"/>
-        </w:numPr>
-        <w:shd w:val="clear" w:color="auto" w:fill="1E1F22"/>
-        <w:spacing w:beforeAutospacing="1" w:afterAutospacing="1"/>
-        <w:rPr>
-          <w:rFonts w:ascii="Helvetica" w:hAnsi="Helvetica"/>
-          <w:color w:val="BCBEC4"/>
-          <w:sz w:val="20"/>
-          <w:szCs w:val="20"/>
-        </w:rPr>
-      </w:pPr>
-      <w:r>
-        <w:rPr>
-          <w:rFonts w:ascii="Helvetica" w:hAnsi="Helvetica"/>
-          <w:color w:val="BCBEC4"/>
-          <w:sz w:val="20"/>
-          <w:szCs w:val="20"/>
-        </w:rPr>
-        <w:t>Extend variable definitions in </w:t>
-      </w:r>
-      <w:r>
-        <w:rPr>
-          <w:rStyle w:val="HTMLCode"/>
-          <w:rFonts w:ascii="Consolas" w:eastAsiaTheme="majorEastAsia" w:hAnsi="Consolas" w:cs="Consolas"/>
-          <w:color w:val="BCBEC4"/>
-          <w:sz w:val="18"/>
-          <w:szCs w:val="18"/>
-        </w:rPr>
-        <w:t>main.generate_formula_from_code</w:t>
-      </w:r>
-      <w:r>
-        <w:rPr>
-          <w:rFonts w:ascii="Helvetica" w:hAnsi="Helvetica"/>
-          <w:color w:val="BCBEC4"/>
-          <w:sz w:val="20"/>
-          <w:szCs w:val="20"/>
-        </w:rPr>
-        <w:t>.</w:t>
-      </w:r>
-    </w:p>
-    <w:p>
-      <w:pPr>
-        <w:pStyle w:val="Heading2"/>
-        <w:shd w:val="clear" w:color="auto" w:fill="1E1F22"/>
-        <w:spacing w:before="240" w:after="240"/>
-        <w:rPr>
-          <w:rFonts w:ascii="Helvetica" w:hAnsi="Helvetica"/>
-          <w:color w:val="BCBEC4"/>
-          <w:sz w:val="43"/>
-          <w:szCs w:val="43"/>
-        </w:rPr>
-      </w:pPr>
-      <w:r>
-        <w:rPr>
-          <w:rFonts w:ascii="Helvetica" w:hAnsi="Helvetica"/>
-          <w:color w:val="BCBEC4"/>
-          <w:sz w:val="43"/>
-          <w:szCs w:val="43"/>
-        </w:rPr>
-        <w:lastRenderedPageBreak/>
-        <w:t>Troubleshooting</w:t>
-      </w:r>
-    </w:p>
-    <w:p>
-      <w:pPr>
-        <w:numPr>
-          <w:ilvl w:val="0"/>
-          <w:numId w:val="18"/>
-        </w:numPr>
-        <w:shd w:val="clear" w:color="auto" w:fill="1E1F22"/>
-        <w:spacing w:beforeAutospacing="1" w:afterAutospacing="1"/>
-        <w:rPr>
-          <w:rFonts w:ascii="Helvetica" w:hAnsi="Helvetica"/>
-          <w:color w:val="BCBEC4"/>
-          <w:sz w:val="20"/>
-          <w:szCs w:val="20"/>
-        </w:rPr>
-      </w:pPr>
-      <w:r>
-        <w:rPr>
-          <w:rFonts w:ascii="Helvetica" w:hAnsi="Helvetica"/>
-          <w:color w:val="BCBEC4"/>
-          <w:sz w:val="20"/>
-          <w:szCs w:val="20"/>
-        </w:rPr>
-        <w:t xml:space="preserve">Missing API key </w:t>
-      </w:r>
-      <w:r>
-        <w:rPr>
-          <w:color w:val="BCBEC4"/>
-          <w:sz w:val="20"/>
-          <w:szCs w:val="20"/>
-        </w:rPr>
-        <w:t>→</w:t>
-      </w:r>
-      <w:r>
-        <w:rPr>
-          <w:rFonts w:ascii="Helvetica" w:hAnsi="Helvetica"/>
-          <w:color w:val="BCBEC4"/>
-          <w:sz w:val="20"/>
-          <w:szCs w:val="20"/>
-        </w:rPr>
-        <w:t xml:space="preserve"> set </w:t>
-      </w:r>
-      <w:r>
-        <w:rPr>
-          <w:rStyle w:val="HTMLCode"/>
-          <w:rFonts w:ascii="Consolas" w:eastAsiaTheme="majorEastAsia" w:hAnsi="Consolas" w:cs="Consolas"/>
-          <w:color w:val="BCBEC4"/>
-          <w:sz w:val="18"/>
-          <w:szCs w:val="18"/>
-        </w:rPr>
-        <w:t>OPENAI_API_KEY</w:t>
-      </w:r>
-      <w:r>
-        <w:rPr>
-          <w:rFonts w:ascii="Helvetica" w:hAnsi="Helvetica"/>
-          <w:color w:val="BCBEC4"/>
-          <w:sz w:val="20"/>
-          <w:szCs w:val="20"/>
-        </w:rPr>
-        <w:t>.</w:t>
-      </w:r>
-    </w:p>
-    <w:p>
-      <w:pPr>
-        <w:numPr>
-          <w:ilvl w:val="0"/>
-          <w:numId w:val="18"/>
-        </w:numPr>
-        <w:shd w:val="clear" w:color="auto" w:fill="1E1F22"/>
-        <w:spacing w:beforeAutospacing="1" w:afterAutospacing="1"/>
-        <w:rPr>
-          <w:rFonts w:ascii="Helvetica" w:hAnsi="Helvetica"/>
-          <w:color w:val="BCBEC4"/>
-          <w:sz w:val="20"/>
-          <w:szCs w:val="20"/>
-        </w:rPr>
-      </w:pPr>
-      <w:r>
-        <w:rPr>
-          <w:rFonts w:ascii="Helvetica" w:hAnsi="Helvetica"/>
-          <w:color w:val="BCBEC4"/>
-          <w:sz w:val="20"/>
-          <w:szCs w:val="20"/>
-        </w:rPr>
-        <w:t xml:space="preserve">“No KPIs found” </w:t>
-      </w:r>
-      <w:r>
-        <w:rPr>
-          <w:color w:val="BCBEC4"/>
-          <w:sz w:val="20"/>
-          <w:szCs w:val="20"/>
-        </w:rPr>
-        <w:t>→</w:t>
-      </w:r>
-      <w:r>
-        <w:rPr>
-          <w:rFonts w:ascii="Helvetica" w:hAnsi="Helvetica"/>
-          <w:color w:val="BCBEC4"/>
-          <w:sz w:val="20"/>
-          <w:szCs w:val="20"/>
-        </w:rPr>
-        <w:t xml:space="preserve"> ensure </w:t>
-      </w:r>
-      <w:r>
-        <w:rPr>
-          <w:rStyle w:val="HTMLCode"/>
-          <w:rFonts w:ascii="Consolas" w:eastAsiaTheme="majorEastAsia" w:hAnsi="Consolas" w:cs="Consolas"/>
-          <w:color w:val="BCBEC4"/>
-          <w:sz w:val="18"/>
-          <w:szCs w:val="18"/>
-        </w:rPr>
-        <w:t># KPI: Your KPI Name</w:t>
-      </w:r>
-      <w:r>
-        <w:rPr>
-          <w:rFonts w:ascii="Helvetica" w:hAnsi="Helvetica"/>
-          <w:color w:val="BCBEC4"/>
-          <w:sz w:val="20"/>
-          <w:szCs w:val="20"/>
-        </w:rPr>
-        <w:t> is inside a function.</w:t>
-      </w:r>
-    </w:p>
-    <w:p>
-      <w:pPr>
-        <w:numPr>
-          <w:ilvl w:val="0"/>
-          <w:numId w:val="18"/>
-        </w:numPr>
-        <w:shd w:val="clear" w:color="auto" w:fill="1E1F22"/>
-        <w:spacing w:before="100" w:beforeAutospacing="1" w:after="100" w:afterAutospacing="1"/>
-        <w:rPr>
-          <w:rFonts w:ascii="Helvetica" w:hAnsi="Helvetica"/>
-          <w:color w:val="BCBEC4"/>
-          <w:sz w:val="20"/>
-          <w:szCs w:val="20"/>
-        </w:rPr>
-      </w:pPr>
-      <w:r>
-        <w:rPr>
-          <w:rFonts w:ascii="Helvetica" w:hAnsi="Helvetica"/>
-          <w:color w:val="BCBEC4"/>
-          <w:sz w:val="20"/>
-          <w:szCs w:val="20"/>
-        </w:rPr>
-        <w:t xml:space="preserve">Broken LaTeX </w:t>
-      </w:r>
-      <w:r>
-        <w:rPr>
-          <w:color w:val="BCBEC4"/>
-          <w:sz w:val="20"/>
-          <w:szCs w:val="20"/>
-        </w:rPr>
-        <w:t>→</w:t>
-      </w:r>
-      <w:r>
-        <w:rPr>
-          <w:rFonts w:ascii="Helvetica" w:hAnsi="Helvetica"/>
-          <w:color w:val="BCBEC4"/>
-          <w:sz w:val="20"/>
-          <w:szCs w:val="20"/>
-        </w:rPr>
-        <w:t xml:space="preserve"> check expressions or open an issue with the example.</w:t>
-      </w:r>
-    </w:p>
-    <w:p>
-      <w:pPr>
-        <w:pStyle w:val="Heading2"/>
-        <w:shd w:val="clear" w:color="auto" w:fill="1E1F22"/>
-        <w:spacing w:before="240" w:after="240"/>
-        <w:rPr>
-          <w:rFonts w:ascii="Helvetica" w:hAnsi="Helvetica"/>
-          <w:color w:val="BCBEC4"/>
-          <w:sz w:val="43"/>
-          <w:szCs w:val="43"/>
-        </w:rPr>
-      </w:pPr>
-      <w:r>
-        <w:rPr>
-          <w:rFonts w:ascii="Helvetica" w:hAnsi="Helvetica"/>
-          <w:color w:val="BCBEC4"/>
-          <w:sz w:val="43"/>
-          <w:szCs w:val="43"/>
-        </w:rPr>
-        <w:t>Example KPIs</w:t>
-      </w:r>
-    </w:p>
-    <w:p>
-      <w:pPr>
-        <w:numPr>
-          <w:ilvl w:val="0"/>
-          <w:numId w:val="19"/>
-        </w:numPr>
-        <w:shd w:val="clear" w:color="auto" w:fill="1E1F22"/>
-        <w:spacing w:before="100" w:beforeAutospacing="1" w:after="100" w:afterAutospacing="1"/>
-        <w:rPr>
-          <w:rFonts w:ascii="Helvetica" w:hAnsi="Helvetica"/>
-          <w:color w:val="BCBEC4"/>
-          <w:sz w:val="20"/>
-          <w:szCs w:val="20"/>
-        </w:rPr>
-      </w:pPr>
-      <w:r>
-        <w:rPr>
-          <w:rFonts w:ascii="Helvetica" w:hAnsi="Helvetica"/>
-          <w:color w:val="BCBEC4"/>
-          <w:sz w:val="20"/>
-          <w:szCs w:val="20"/>
-        </w:rPr>
-        <w:t>Overall Equipment Effectiveness (OEE)</w:t>
-      </w:r>
-    </w:p>
-    <w:p>
-      <w:pPr>
-        <w:numPr>
-          <w:ilvl w:val="0"/>
-          <w:numId w:val="19"/>
-        </w:numPr>
-        <w:shd w:val="clear" w:color="auto" w:fill="1E1F22"/>
-        <w:spacing w:before="100" w:beforeAutospacing="1" w:after="100" w:afterAutospacing="1"/>
-        <w:rPr>
-          <w:rFonts w:ascii="Helvetica" w:hAnsi="Helvetica"/>
-          <w:color w:val="BCBEC4"/>
-          <w:sz w:val="20"/>
-          <w:szCs w:val="20"/>
-        </w:rPr>
-      </w:pPr>
-      <w:r>
-        <w:rPr>
-          <w:rFonts w:ascii="Helvetica" w:hAnsi="Helvetica"/>
-          <w:color w:val="BCBEC4"/>
-          <w:sz w:val="20"/>
-          <w:szCs w:val="20"/>
-        </w:rPr>
-        <w:t>Ethylene Yield Percentage</w:t>
-      </w:r>
-    </w:p>
-    <w:p>
-      <w:pPr>
-        <w:numPr>
-          <w:ilvl w:val="0"/>
-          <w:numId w:val="19"/>
-        </w:numPr>
-        <w:shd w:val="clear" w:color="auto" w:fill="1E1F22"/>
-        <w:spacing w:before="100" w:beforeAutospacing="1" w:after="100" w:afterAutospacing="1"/>
-        <w:rPr>
-          <w:rFonts w:ascii="Helvetica" w:hAnsi="Helvetica"/>
-          <w:color w:val="BCBEC4"/>
-          <w:sz w:val="20"/>
-          <w:szCs w:val="20"/>
-        </w:rPr>
-      </w:pPr>
-      <w:r>
-        <w:rPr>
-          <w:rFonts w:ascii="Helvetica" w:hAnsi="Helvetica"/>
-          <w:color w:val="BCBEC4"/>
-          <w:sz w:val="20"/>
-          <w:szCs w:val="20"/>
-        </w:rPr>
-        <w:t>Daily Feedstock Throughput (tons/day)</w:t>
-      </w:r>
-    </w:p>
-    <w:p>
-      <w:pPr>
-        <w:numPr>
-          <w:ilvl w:val="0"/>
-          <w:numId w:val="19"/>
-        </w:numPr>
-        <w:shd w:val="clear" w:color="auto" w:fill="1E1F22"/>
-        <w:spacing w:before="100" w:beforeAutospacing="1" w:after="100" w:afterAutospacing="1"/>
-        <w:rPr>
-          <w:rFonts w:ascii="Helvetica" w:hAnsi="Helvetica"/>
-          <w:color w:val="BCBEC4"/>
-          <w:sz w:val="20"/>
-          <w:szCs w:val="20"/>
-        </w:rPr>
-      </w:pPr>
-      <w:r>
-        <w:rPr>
-          <w:rFonts w:ascii="Helvetica" w:hAnsi="Helvetica"/>
-          <w:color w:val="BCBEC4"/>
-          <w:sz w:val="20"/>
-          <w:szCs w:val="20"/>
-        </w:rPr>
-        <w:t>Mean Time Between Failures (hours per failure)</w:t>
-      </w:r>
-    </w:p>
-    <w:p>
-      <w:pPr>
-        <w:numPr>
-          <w:ilvl w:val="0"/>
-          <w:numId w:val="19"/>
-        </w:numPr>
-        <w:shd w:val="clear" w:color="auto" w:fill="1E1F22"/>
-        <w:spacing w:before="100" w:beforeAutospacing="1" w:after="100" w:afterAutospacing="1"/>
-        <w:rPr>
-          <w:rFonts w:ascii="Helvetica" w:hAnsi="Helvetica"/>
-          <w:color w:val="BCBEC4"/>
-          <w:sz w:val="20"/>
-          <w:szCs w:val="20"/>
-        </w:rPr>
-      </w:pPr>
-      <w:r>
-        <w:rPr>
-          <w:rFonts w:ascii="Helvetica" w:hAnsi="Helvetica"/>
-          <w:color w:val="BCBEC4"/>
-          <w:sz w:val="20"/>
-          <w:szCs w:val="20"/>
-        </w:rPr>
-        <w:t>Propylene to Ethylene (P/E) Ratio</w:t>
-      </w:r>
-    </w:p>
-    <w:p>
-      <w:pPr>
-        <w:pStyle w:val="NormalWeb"/>
-        <w:shd w:val="clear" w:color="auto" w:fill="1E1F22"/>
-        <w:spacing w:before="240" w:beforeAutospacing="0" w:after="240" w:afterAutospacing="0"/>
-        <w:rPr>
-          <w:rFonts w:ascii="Helvetica" w:hAnsi="Helvetica"/>
-          <w:color w:val="BCBEC4"/>
-          <w:sz w:val="20"/>
-          <w:szCs w:val="20"/>
-        </w:rPr>
-      </w:pPr>
-      <w:r>
-        <w:rPr>
-          <w:rFonts w:ascii="Helvetica" w:hAnsi="Helvetica"/>
-          <w:color w:val="BCBEC4"/>
-          <w:sz w:val="20"/>
-          <w:szCs w:val="20"/>
-        </w:rPr>
-        <w:t>Packaging (optional) If you’d like a console script named bluebook, add this to your pyproject.toml or setup.cfg. Example for setup.cfg: [metadata] name = bluebook-generator version = 1.0.0 description = AI-Powered KPI Extractor &amp; Interactive Bluebook Generator</w:t>
-      </w:r>
-    </w:p>
-    <w:p>
-      <w:pPr>
-        <w:pStyle w:val="NormalWeb"/>
-        <w:shd w:val="clear" w:color="auto" w:fill="1E1F22"/>
-        <w:spacing w:before="240" w:beforeAutospacing="0" w:after="240" w:afterAutospacing="0"/>
-        <w:rPr>
-          <w:rFonts w:ascii="Helvetica" w:hAnsi="Helvetica"/>
-          <w:color w:val="BCBEC4"/>
-          <w:sz w:val="20"/>
-          <w:szCs w:val="20"/>
-        </w:rPr>
-      </w:pPr>
-      <w:r>
-        <w:rPr>
-          <w:rFonts w:ascii="Helvetica" w:hAnsi="Helvetica"/>
-          <w:color w:val="BCBEC4"/>
-          <w:sz w:val="20"/>
-          <w:szCs w:val="20"/>
-        </w:rPr>
-        <w:t>[options] packages = find: install_requires = click jinja2 python-dotenv openai sphinx</w:t>
-      </w:r>
-    </w:p>
-    <w:p>
-      <w:pPr>
-        <w:pStyle w:val="NormalWeb"/>
-        <w:shd w:val="clear" w:color="auto" w:fill="1E1F22"/>
-        <w:spacing w:before="240" w:beforeAutospacing="0" w:after="240" w:afterAutospacing="0"/>
-        <w:rPr>
-          <w:rFonts w:ascii="Helvetica" w:hAnsi="Helvetica"/>
-          <w:color w:val="BCBEC4"/>
-          <w:sz w:val="20"/>
-          <w:szCs w:val="20"/>
-        </w:rPr>
-      </w:pPr>
-      <w:r>
-        <w:rPr>
-          <w:rFonts w:ascii="Helvetica" w:hAnsi="Helvetica"/>
-          <w:color w:val="BCBEC4"/>
-          <w:sz w:val="20"/>
-          <w:szCs w:val="20"/>
-        </w:rPr>
-        <w:t>[options.entry_points] console_scripts = bluebook = bluebook_generator.cli:main</w:t>
-      </w:r>
-    </w:p>
     <w:p/>
     <w:p>
       <w:pPr>
@@ -6907,6 +5540,7 @@
         <w:rPr>
           <w:color w:val="000000"/>
         </w:rPr>
+        <w:lastRenderedPageBreak/>
         <w:t>This diagram shows the major components of the system and their relationships.</w:t>
       </w:r>
     </w:p>
@@ -6932,7 +5566,6 @@
           <w:color w:val="000000"/>
           <w14:ligatures w14:val="standardContextual"/>
         </w:rPr>
-        <w:lastRenderedPageBreak/>
         <w:drawing>
           <wp:inline distT="0" distB="0" distL="0" distR="0" wp14:anchorId="249A72C4" wp14:editId="52A9F0DB">
             <wp:extent cx="6436242" cy="2632258"/>
@@ -6949,7 +5582,7 @@
                     <pic:cNvPicPr/>
                   </pic:nvPicPr>
                   <pic:blipFill>
-                    <a:blip r:embed="rId12">
+                    <a:blip r:embed="rId10">
                       <a:extLst>
                         <a:ext uri="{28A0092B-C50C-407E-A947-70E740481C1C}">
                           <a14:useLocalDpi xmlns:a14="http://schemas.microsoft.com/office/drawing/2010/main" val="0"/>
@@ -7919,6 +6552,7 @@
           <w:bCs/>
           <w:color w:val="000000"/>
         </w:rPr>
+        <w:lastRenderedPageBreak/>
         <w:t>templates/kpi_template.rst.j2</w:t>
       </w:r>
       <w:r>
@@ -8001,7 +6635,6 @@
         <w:rPr>
           <w:color w:val="000000"/>
         </w:rPr>
-        <w:lastRenderedPageBreak/>
         <w:t>Each KPI is rendered into</w:t>
       </w:r>
       <w:r>
@@ -8414,7 +7047,7 @@
                     <pic:cNvPicPr/>
                   </pic:nvPicPr>
                   <pic:blipFill>
-                    <a:blip r:embed="rId13">
+                    <a:blip r:embed="rId11">
                       <a:extLst>
                         <a:ext uri="{28A0092B-C50C-407E-A947-70E740481C1C}">
                           <a14:useLocalDpi xmlns:a14="http://schemas.microsoft.com/office/drawing/2010/main" val="0"/>
@@ -8529,7 +7162,6 @@
           <w:bCs/>
           <w:color w:val="000000"/>
         </w:rPr>
-        <w:lastRenderedPageBreak/>
         <w:t>High-level Components Digram</w:t>
       </w:r>
     </w:p>
@@ -8614,10 +7246,10 @@
                             </pic:cNvPicPr>
                           </pic:nvPicPr>
                           <pic:blipFill rotWithShape="1">
-                            <a:blip r:embed="rId14">
+                            <a:blip r:embed="rId12">
                               <a:extLst>
                                 <a:ext uri="{96DAC541-7B7A-43D3-8B79-37D633B846F1}">
-                                  <asvg:svgBlip xmlns:asvg="http://schemas.microsoft.com/office/drawing/2016/SVG/main" r:embed="rId15"/>
+                                  <asvg:svgBlip xmlns:asvg="http://schemas.microsoft.com/office/drawing/2016/SVG/main" r:embed="rId13"/>
                                 </a:ext>
                               </a:extLst>
                             </a:blip>
@@ -8652,10 +7284,10 @@
                             </pic:cNvPicPr>
                           </pic:nvPicPr>
                           <pic:blipFill rotWithShape="1">
-                            <a:blip r:embed="rId14">
+                            <a:blip r:embed="rId12">
                               <a:extLst>
                                 <a:ext uri="{96DAC541-7B7A-43D3-8B79-37D633B846F1}">
-                                  <asvg:svgBlip xmlns:asvg="http://schemas.microsoft.com/office/drawing/2016/SVG/main" r:embed="rId15"/>
+                                  <asvg:svgBlip xmlns:asvg="http://schemas.microsoft.com/office/drawing/2016/SVG/main" r:embed="rId13"/>
                                 </a:ext>
                               </a:extLst>
                             </a:blip>
@@ -8702,10 +7334,10 @@
                             </pic:cNvPicPr>
                           </pic:nvPicPr>
                           <pic:blipFill rotWithShape="1">
-                            <a:blip r:embed="rId14">
+                            <a:blip r:embed="rId12">
                               <a:extLst>
                                 <a:ext uri="{96DAC541-7B7A-43D3-8B79-37D633B846F1}">
-                                  <asvg:svgBlip xmlns:asvg="http://schemas.microsoft.com/office/drawing/2016/SVG/main" r:embed="rId15"/>
+                                  <asvg:svgBlip xmlns:asvg="http://schemas.microsoft.com/office/drawing/2016/SVG/main" r:embed="rId13"/>
                                 </a:ext>
                               </a:extLst>
                             </a:blip>
@@ -8740,10 +7372,10 @@
                             </pic:cNvPicPr>
                           </pic:nvPicPr>
                           <pic:blipFill rotWithShape="1">
-                            <a:blip r:embed="rId14">
+                            <a:blip r:embed="rId12">
                               <a:extLst>
                                 <a:ext uri="{96DAC541-7B7A-43D3-8B79-37D633B846F1}">
-                                  <asvg:svgBlip xmlns:asvg="http://schemas.microsoft.com/office/drawing/2016/SVG/main" r:embed="rId15"/>
+                                  <asvg:svgBlip xmlns:asvg="http://schemas.microsoft.com/office/drawing/2016/SVG/main" r:embed="rId13"/>
                                 </a:ext>
                               </a:extLst>
                             </a:blip>
@@ -8874,10 +7506,10 @@
                           </pic:cNvPicPr>
                         </pic:nvPicPr>
                         <pic:blipFill rotWithShape="1">
-                          <a:blip r:embed="rId14">
+                          <a:blip r:embed="rId12">
                             <a:extLst>
                               <a:ext uri="{96DAC541-7B7A-43D3-8B79-37D633B846F1}">
-                                <asvg:svgBlip xmlns:asvg="http://schemas.microsoft.com/office/drawing/2016/SVG/main" r:embed="rId15"/>
+                                <asvg:svgBlip xmlns:asvg="http://schemas.microsoft.com/office/drawing/2016/SVG/main" r:embed="rId13"/>
                               </a:ext>
                             </a:extLst>
                           </a:blip>
@@ -8912,10 +7544,10 @@
                           </pic:cNvPicPr>
                         </pic:nvPicPr>
                         <pic:blipFill rotWithShape="1">
-                          <a:blip r:embed="rId14">
+                          <a:blip r:embed="rId12">
                             <a:extLst>
                               <a:ext uri="{96DAC541-7B7A-43D3-8B79-37D633B846F1}">
-                                <asvg:svgBlip xmlns:asvg="http://schemas.microsoft.com/office/drawing/2016/SVG/main" r:embed="rId15"/>
+                                <asvg:svgBlip xmlns:asvg="http://schemas.microsoft.com/office/drawing/2016/SVG/main" r:embed="rId13"/>
                               </a:ext>
                             </a:extLst>
                           </a:blip>
@@ -8950,10 +7582,10 @@
                           </pic:cNvPicPr>
                         </pic:nvPicPr>
                         <pic:blipFill rotWithShape="1">
-                          <a:blip r:embed="rId14">
+                          <a:blip r:embed="rId12">
                             <a:extLst>
                               <a:ext uri="{96DAC541-7B7A-43D3-8B79-37D633B846F1}">
-                                <asvg:svgBlip xmlns:asvg="http://schemas.microsoft.com/office/drawing/2016/SVG/main" r:embed="rId15"/>
+                                <asvg:svgBlip xmlns:asvg="http://schemas.microsoft.com/office/drawing/2016/SVG/main" r:embed="rId13"/>
                               </a:ext>
                             </a:extLst>
                           </a:blip>
@@ -10949,8 +9581,16 @@
     <w:p>
       <w:pPr>
         <w:pStyle w:val="NormalWeb"/>
-      </w:pPr>
-      <w:r>
+        <w:rPr>
+          <w:b/>
+          <w:bCs/>
+        </w:rPr>
+      </w:pPr>
+      <w:r>
+        <w:rPr>
+          <w:b/>
+          <w:bCs/>
+        </w:rPr>
         <w:t>Supported sources now</w:t>
       </w:r>
     </w:p>
@@ -11003,10 +9643,7 @@
         <w:t>SQL, ANSI SQL, SAP HANA SQLScript</w:t>
       </w:r>
       <w:r>
-        <w:t xml:space="preserve"> (</w:t>
-      </w:r>
-      <w:r>
-        <w:t>.sql, .pks/.pkb/.pls)</w:t>
+        <w:t xml:space="preserve"> (.sql, .pks/.pkb/.pls)</w:t>
       </w:r>
     </w:p>
     <w:p>
@@ -11081,30 +9718,6 @@
     </w:p>
     <w:p>
       <w:pPr>
-        <w:pStyle w:val="NormalWeb"/>
-      </w:pPr>
-      <w:r>
-        <w:t>If you want native .pbix and .xlsx parsing, I can add optional readers behind feature flags while keeping your current environment clea</w:t>
-      </w:r>
-      <w:r>
-        <w:t>r</w:t>
-      </w:r>
-    </w:p>
-    <w:p>
-      <w:pPr>
-        <w:pStyle w:val="NormalWeb"/>
-      </w:pPr>
-      <w:r>
-        <w:t>“add multi-language KPI scanning</w:t>
-      </w:r>
-    </w:p>
-    <w:p>
-      <w:pPr>
-        <w:spacing w:before="100" w:beforeAutospacing="1" w:after="100" w:afterAutospacing="1"/>
-      </w:pPr>
-    </w:p>
-    <w:p>
-      <w:pPr>
         <w:spacing w:before="100" w:beforeAutospacing="1" w:after="100" w:afterAutospacing="1"/>
         <w:rPr>
           <w:color w:val="000000"/>
@@ -11239,23 +9852,23 @@
         <w:spacing w:before="100" w:beforeAutospacing="1" w:after="100" w:afterAutospacing="1"/>
       </w:pPr>
       <w:r>
+        <w:t>If you prefer to show a blank comment (or a softer message) when the API call finally fails, edit the fallback in your AI generator.</w:t>
+      </w:r>
+    </w:p>
+    <w:p>
+      <w:r>
+        <w:t># ... existing code ...</w:t>
+      </w:r>
+    </w:p>
+    <w:p/>
+    <w:p>
+      <w:r>
+        <w:t xml:space="preserve">    retries = 8</w:t>
+      </w:r>
+    </w:p>
+    <w:p>
+      <w:r>
         <w:lastRenderedPageBreak/>
-        <w:t>If you prefer to show a blank comment (or a softer message) when the API call finally fails, edit the fallback in your AI generator.</w:t>
-      </w:r>
-    </w:p>
-    <w:p>
-      <w:r>
-        <w:t># ... existing code ...</w:t>
-      </w:r>
-    </w:p>
-    <w:p/>
-    <w:p>
-      <w:r>
-        <w:t xml:space="preserve">    retries = 8</w:t>
-      </w:r>
-    </w:p>
-    <w:p>
-      <w:r>
         <w:t xml:space="preserve">    delay = 8  # shorter initial delay to speed up a bit</w:t>
       </w:r>
     </w:p>
@@ -11514,7 +10127,6 @@
         <w:spacing w:before="100" w:beforeAutospacing="1" w:after="100" w:afterAutospacing="1"/>
       </w:pPr>
       <w:r>
-        <w:lastRenderedPageBreak/>
         <w:t>Reporting Source: If the text looks generic, it’s replaced with a more relevant source inferred from obvious keywords (e.g., historian, SCADA/OPC, CSV/Excel, SQL, API, sensors).</w:t>
       </w:r>
     </w:p>
@@ -13054,6 +11666,120 @@
     </w:lvl>
   </w:abstractNum>
   <w:abstractNum w:abstractNumId="11" w15:restartNumberingAfterBreak="0">
+    <w:nsid w:val="1AE916EA"/>
+    <w:multiLevelType w:val="hybridMultilevel"/>
+    <w:tmpl w:val="921253B0"/>
+    <w:lvl w:ilvl="0" w:tplc="6AAA85E8">
+      <w:numFmt w:val="bullet"/>
+      <w:lvlText w:val="•"/>
+      <w:lvlJc w:val="left"/>
+      <w:pPr>
+        <w:ind w:left="1440" w:hanging="720"/>
+      </w:pPr>
+      <w:rPr>
+        <w:rFonts w:ascii="Times New Roman" w:eastAsia="Times New Roman" w:hAnsi="Times New Roman" w:cs="Times New Roman" w:hint="default"/>
+        <w:b/>
+        <w:sz w:val="27"/>
+      </w:rPr>
+    </w:lvl>
+    <w:lvl w:ilvl="1" w:tplc="04090003" w:tentative="1">
+      <w:start w:val="1"/>
+      <w:numFmt w:val="bullet"/>
+      <w:lvlText w:val="o"/>
+      <w:lvlJc w:val="left"/>
+      <w:pPr>
+        <w:ind w:left="1800" w:hanging="360"/>
+      </w:pPr>
+      <w:rPr>
+        <w:rFonts w:ascii="Courier New" w:hAnsi="Courier New" w:cs="Courier New" w:hint="default"/>
+      </w:rPr>
+    </w:lvl>
+    <w:lvl w:ilvl="2" w:tplc="04090005" w:tentative="1">
+      <w:start w:val="1"/>
+      <w:numFmt w:val="bullet"/>
+      <w:lvlText w:val=""/>
+      <w:lvlJc w:val="left"/>
+      <w:pPr>
+        <w:ind w:left="2520" w:hanging="360"/>
+      </w:pPr>
+      <w:rPr>
+        <w:rFonts w:ascii="Wingdings" w:hAnsi="Wingdings" w:hint="default"/>
+      </w:rPr>
+    </w:lvl>
+    <w:lvl w:ilvl="3" w:tplc="04090001" w:tentative="1">
+      <w:start w:val="1"/>
+      <w:numFmt w:val="bullet"/>
+      <w:lvlText w:val=""/>
+      <w:lvlJc w:val="left"/>
+      <w:pPr>
+        <w:ind w:left="3240" w:hanging="360"/>
+      </w:pPr>
+      <w:rPr>
+        <w:rFonts w:ascii="Symbol" w:hAnsi="Symbol" w:hint="default"/>
+      </w:rPr>
+    </w:lvl>
+    <w:lvl w:ilvl="4" w:tplc="04090003" w:tentative="1">
+      <w:start w:val="1"/>
+      <w:numFmt w:val="bullet"/>
+      <w:lvlText w:val="o"/>
+      <w:lvlJc w:val="left"/>
+      <w:pPr>
+        <w:ind w:left="3960" w:hanging="360"/>
+      </w:pPr>
+      <w:rPr>
+        <w:rFonts w:ascii="Courier New" w:hAnsi="Courier New" w:cs="Courier New" w:hint="default"/>
+      </w:rPr>
+    </w:lvl>
+    <w:lvl w:ilvl="5" w:tplc="04090005" w:tentative="1">
+      <w:start w:val="1"/>
+      <w:numFmt w:val="bullet"/>
+      <w:lvlText w:val=""/>
+      <w:lvlJc w:val="left"/>
+      <w:pPr>
+        <w:ind w:left="4680" w:hanging="360"/>
+      </w:pPr>
+      <w:rPr>
+        <w:rFonts w:ascii="Wingdings" w:hAnsi="Wingdings" w:hint="default"/>
+      </w:rPr>
+    </w:lvl>
+    <w:lvl w:ilvl="6" w:tplc="04090001" w:tentative="1">
+      <w:start w:val="1"/>
+      <w:numFmt w:val="bullet"/>
+      <w:lvlText w:val=""/>
+      <w:lvlJc w:val="left"/>
+      <w:pPr>
+        <w:ind w:left="5400" w:hanging="360"/>
+      </w:pPr>
+      <w:rPr>
+        <w:rFonts w:ascii="Symbol" w:hAnsi="Symbol" w:hint="default"/>
+      </w:rPr>
+    </w:lvl>
+    <w:lvl w:ilvl="7" w:tplc="04090003" w:tentative="1">
+      <w:start w:val="1"/>
+      <w:numFmt w:val="bullet"/>
+      <w:lvlText w:val="o"/>
+      <w:lvlJc w:val="left"/>
+      <w:pPr>
+        <w:ind w:left="6120" w:hanging="360"/>
+      </w:pPr>
+      <w:rPr>
+        <w:rFonts w:ascii="Courier New" w:hAnsi="Courier New" w:cs="Courier New" w:hint="default"/>
+      </w:rPr>
+    </w:lvl>
+    <w:lvl w:ilvl="8" w:tplc="04090005" w:tentative="1">
+      <w:start w:val="1"/>
+      <w:numFmt w:val="bullet"/>
+      <w:lvlText w:val=""/>
+      <w:lvlJc w:val="left"/>
+      <w:pPr>
+        <w:ind w:left="6840" w:hanging="360"/>
+      </w:pPr>
+      <w:rPr>
+        <w:rFonts w:ascii="Wingdings" w:hAnsi="Wingdings" w:hint="default"/>
+      </w:rPr>
+    </w:lvl>
+  </w:abstractNum>
+  <w:abstractNum w:abstractNumId="12" w15:restartNumberingAfterBreak="0">
     <w:nsid w:val="1D586067"/>
     <w:multiLevelType w:val="multilevel"/>
     <w:tmpl w:val="13F03DC0"/>
@@ -13202,7 +11928,7 @@
       </w:rPr>
     </w:lvl>
   </w:abstractNum>
-  <w:abstractNum w:abstractNumId="12" w15:restartNumberingAfterBreak="0">
+  <w:abstractNum w:abstractNumId="13" w15:restartNumberingAfterBreak="0">
     <w:nsid w:val="22E15A75"/>
     <w:multiLevelType w:val="multilevel"/>
     <w:tmpl w:val="F6FA9E34"/>
@@ -13351,7 +12077,7 @@
       </w:rPr>
     </w:lvl>
   </w:abstractNum>
-  <w:abstractNum w:abstractNumId="13" w15:restartNumberingAfterBreak="0">
+  <w:abstractNum w:abstractNumId="14" w15:restartNumberingAfterBreak="0">
     <w:nsid w:val="27B86D7C"/>
     <w:multiLevelType w:val="multilevel"/>
     <w:tmpl w:val="E0F82940"/>
@@ -13500,7 +12226,7 @@
       </w:rPr>
     </w:lvl>
   </w:abstractNum>
-  <w:abstractNum w:abstractNumId="14" w15:restartNumberingAfterBreak="0">
+  <w:abstractNum w:abstractNumId="15" w15:restartNumberingAfterBreak="0">
     <w:nsid w:val="31233DCE"/>
     <w:multiLevelType w:val="multilevel"/>
     <w:tmpl w:val="6B6C8ECA"/>
@@ -13649,7 +12375,7 @@
       </w:rPr>
     </w:lvl>
   </w:abstractNum>
-  <w:abstractNum w:abstractNumId="15" w15:restartNumberingAfterBreak="0">
+  <w:abstractNum w:abstractNumId="16" w15:restartNumberingAfterBreak="0">
     <w:nsid w:val="315C629A"/>
     <w:multiLevelType w:val="multilevel"/>
     <w:tmpl w:val="EF8A23D0"/>
@@ -13798,7 +12524,7 @@
       </w:rPr>
     </w:lvl>
   </w:abstractNum>
-  <w:abstractNum w:abstractNumId="16" w15:restartNumberingAfterBreak="0">
+  <w:abstractNum w:abstractNumId="17" w15:restartNumberingAfterBreak="0">
     <w:nsid w:val="327F682E"/>
     <w:multiLevelType w:val="multilevel"/>
     <w:tmpl w:val="F2F06D80"/>
@@ -13947,7 +12673,7 @@
       </w:rPr>
     </w:lvl>
   </w:abstractNum>
-  <w:abstractNum w:abstractNumId="17" w15:restartNumberingAfterBreak="0">
+  <w:abstractNum w:abstractNumId="18" w15:restartNumberingAfterBreak="0">
     <w:nsid w:val="3879310B"/>
     <w:multiLevelType w:val="multilevel"/>
     <w:tmpl w:val="6C542C40"/>
@@ -14068,7 +12794,7 @@
       </w:pPr>
     </w:lvl>
   </w:abstractNum>
-  <w:abstractNum w:abstractNumId="18" w15:restartNumberingAfterBreak="0">
+  <w:abstractNum w:abstractNumId="19" w15:restartNumberingAfterBreak="0">
     <w:nsid w:val="38CD4E20"/>
     <w:multiLevelType w:val="hybridMultilevel"/>
     <w:tmpl w:val="FE92CB46"/>
@@ -14157,7 +12883,7 @@
       </w:pPr>
     </w:lvl>
   </w:abstractNum>
-  <w:abstractNum w:abstractNumId="19" w15:restartNumberingAfterBreak="0">
+  <w:abstractNum w:abstractNumId="20" w15:restartNumberingAfterBreak="0">
     <w:nsid w:val="3BE86B02"/>
     <w:multiLevelType w:val="multilevel"/>
     <w:tmpl w:val="CE3C56B4"/>
@@ -14306,7 +13032,7 @@
       </w:rPr>
     </w:lvl>
   </w:abstractNum>
-  <w:abstractNum w:abstractNumId="20" w15:restartNumberingAfterBreak="0">
+  <w:abstractNum w:abstractNumId="21" w15:restartNumberingAfterBreak="0">
     <w:nsid w:val="3D645FE0"/>
     <w:multiLevelType w:val="multilevel"/>
     <w:tmpl w:val="C26059D8"/>
@@ -14455,7 +13181,7 @@
       </w:rPr>
     </w:lvl>
   </w:abstractNum>
-  <w:abstractNum w:abstractNumId="21" w15:restartNumberingAfterBreak="0">
+  <w:abstractNum w:abstractNumId="22" w15:restartNumberingAfterBreak="0">
     <w:nsid w:val="429049C5"/>
     <w:multiLevelType w:val="multilevel"/>
     <w:tmpl w:val="BFEA140C"/>
@@ -14604,7 +13330,7 @@
       </w:rPr>
     </w:lvl>
   </w:abstractNum>
-  <w:abstractNum w:abstractNumId="22" w15:restartNumberingAfterBreak="0">
+  <w:abstractNum w:abstractNumId="23" w15:restartNumberingAfterBreak="0">
     <w:nsid w:val="43C050C0"/>
     <w:multiLevelType w:val="multilevel"/>
     <w:tmpl w:val="1D7EEA66"/>
@@ -14717,7 +13443,7 @@
       </w:pPr>
     </w:lvl>
   </w:abstractNum>
-  <w:abstractNum w:abstractNumId="23" w15:restartNumberingAfterBreak="0">
+  <w:abstractNum w:abstractNumId="24" w15:restartNumberingAfterBreak="0">
     <w:nsid w:val="47901A4B"/>
     <w:multiLevelType w:val="multilevel"/>
     <w:tmpl w:val="6102DFBE"/>
@@ -14830,7 +13556,7 @@
       </w:pPr>
     </w:lvl>
   </w:abstractNum>
-  <w:abstractNum w:abstractNumId="24" w15:restartNumberingAfterBreak="0">
+  <w:abstractNum w:abstractNumId="25" w15:restartNumberingAfterBreak="0">
     <w:nsid w:val="4926073A"/>
     <w:multiLevelType w:val="multilevel"/>
     <w:tmpl w:val="B61E35B4"/>
@@ -14979,7 +13705,7 @@
       </w:rPr>
     </w:lvl>
   </w:abstractNum>
-  <w:abstractNum w:abstractNumId="25" w15:restartNumberingAfterBreak="0">
+  <w:abstractNum w:abstractNumId="26" w15:restartNumberingAfterBreak="0">
     <w:nsid w:val="499D441F"/>
     <w:multiLevelType w:val="multilevel"/>
     <w:tmpl w:val="26E6B63E"/>
@@ -15128,7 +13854,7 @@
       </w:rPr>
     </w:lvl>
   </w:abstractNum>
-  <w:abstractNum w:abstractNumId="26" w15:restartNumberingAfterBreak="0">
+  <w:abstractNum w:abstractNumId="27" w15:restartNumberingAfterBreak="0">
     <w:nsid w:val="49DC51E6"/>
     <w:multiLevelType w:val="multilevel"/>
     <w:tmpl w:val="667C2FD8"/>
@@ -15277,7 +14003,7 @@
       </w:rPr>
     </w:lvl>
   </w:abstractNum>
-  <w:abstractNum w:abstractNumId="27" w15:restartNumberingAfterBreak="0">
+  <w:abstractNum w:abstractNumId="28" w15:restartNumberingAfterBreak="0">
     <w:nsid w:val="4D435ACE"/>
     <w:multiLevelType w:val="multilevel"/>
     <w:tmpl w:val="D004AF48"/>
@@ -15426,7 +14152,7 @@
       </w:rPr>
     </w:lvl>
   </w:abstractNum>
-  <w:abstractNum w:abstractNumId="28" w15:restartNumberingAfterBreak="0">
+  <w:abstractNum w:abstractNumId="29" w15:restartNumberingAfterBreak="0">
     <w:nsid w:val="4D7E1D67"/>
     <w:multiLevelType w:val="multilevel"/>
     <w:tmpl w:val="46082404"/>
@@ -15539,7 +14265,7 @@
       </w:pPr>
     </w:lvl>
   </w:abstractNum>
-  <w:abstractNum w:abstractNumId="29" w15:restartNumberingAfterBreak="0">
+  <w:abstractNum w:abstractNumId="30" w15:restartNumberingAfterBreak="0">
     <w:nsid w:val="50B621E8"/>
     <w:multiLevelType w:val="multilevel"/>
     <w:tmpl w:val="D77E837C"/>
@@ -15688,7 +14414,7 @@
       </w:rPr>
     </w:lvl>
   </w:abstractNum>
-  <w:abstractNum w:abstractNumId="30" w15:restartNumberingAfterBreak="0">
+  <w:abstractNum w:abstractNumId="31" w15:restartNumberingAfterBreak="0">
     <w:nsid w:val="50FC22B1"/>
     <w:multiLevelType w:val="multilevel"/>
     <w:tmpl w:val="3BE06AE4"/>
@@ -15837,11 +14563,11 @@
       </w:rPr>
     </w:lvl>
   </w:abstractNum>
-  <w:abstractNum w:abstractNumId="31" w15:restartNumberingAfterBreak="0">
+  <w:abstractNum w:abstractNumId="32" w15:restartNumberingAfterBreak="0">
     <w:nsid w:val="55352C56"/>
-    <w:multiLevelType w:val="hybridMultilevel"/>
-    <w:tmpl w:val="C17AF468"/>
-    <w:lvl w:ilvl="0" w:tplc="0409000F">
+    <w:multiLevelType w:val="multilevel"/>
+    <w:tmpl w:val="AB62844A"/>
+    <w:lvl w:ilvl="0">
       <w:start w:val="1"/>
       <w:numFmt w:val="decimal"/>
       <w:lvlText w:val="%1."/>
@@ -15853,80 +14579,112 @@
         <w:rFonts w:hint="default"/>
       </w:rPr>
     </w:lvl>
-    <w:lvl w:ilvl="1" w:tplc="04090019" w:tentative="1">
-      <w:start w:val="1"/>
-      <w:numFmt w:val="lowerLetter"/>
-      <w:lvlText w:val="%2."/>
-      <w:lvlJc w:val="left"/>
-      <w:pPr>
-        <w:ind w:left="1440" w:hanging="360"/>
-      </w:pPr>
-    </w:lvl>
-    <w:lvl w:ilvl="2" w:tplc="0409001B" w:tentative="1">
-      <w:start w:val="1"/>
-      <w:numFmt w:val="lowerRoman"/>
-      <w:lvlText w:val="%3."/>
-      <w:lvlJc w:val="right"/>
-      <w:pPr>
-        <w:ind w:left="2160" w:hanging="180"/>
-      </w:pPr>
-    </w:lvl>
-    <w:lvl w:ilvl="3" w:tplc="0409000F" w:tentative="1">
+    <w:lvl w:ilvl="1">
       <w:start w:val="1"/>
       <w:numFmt w:val="decimal"/>
-      <w:lvlText w:val="%4."/>
-      <w:lvlJc w:val="left"/>
-      <w:pPr>
-        <w:ind w:left="2880" w:hanging="360"/>
-      </w:pPr>
-    </w:lvl>
-    <w:lvl w:ilvl="4" w:tplc="04090019" w:tentative="1">
-      <w:start w:val="1"/>
-      <w:numFmt w:val="lowerLetter"/>
-      <w:lvlText w:val="%5."/>
-      <w:lvlJc w:val="left"/>
-      <w:pPr>
-        <w:ind w:left="3600" w:hanging="360"/>
-      </w:pPr>
-    </w:lvl>
-    <w:lvl w:ilvl="5" w:tplc="0409001B" w:tentative="1">
-      <w:start w:val="1"/>
-      <w:numFmt w:val="lowerRoman"/>
-      <w:lvlText w:val="%6."/>
-      <w:lvlJc w:val="right"/>
-      <w:pPr>
-        <w:ind w:left="4320" w:hanging="180"/>
-      </w:pPr>
-    </w:lvl>
-    <w:lvl w:ilvl="6" w:tplc="0409000F" w:tentative="1">
+      <w:isLgl/>
+      <w:lvlText w:val="%1.%2"/>
+      <w:lvlJc w:val="left"/>
+      <w:pPr>
+        <w:ind w:left="1080" w:hanging="360"/>
+      </w:pPr>
+      <w:rPr>
+        <w:rFonts w:hint="default"/>
+      </w:rPr>
+    </w:lvl>
+    <w:lvl w:ilvl="2">
       <w:start w:val="1"/>
       <w:numFmt w:val="decimal"/>
-      <w:lvlText w:val="%7."/>
-      <w:lvlJc w:val="left"/>
-      <w:pPr>
-        <w:ind w:left="5040" w:hanging="360"/>
-      </w:pPr>
-    </w:lvl>
-    <w:lvl w:ilvl="7" w:tplc="04090019" w:tentative="1">
-      <w:start w:val="1"/>
-      <w:numFmt w:val="lowerLetter"/>
-      <w:lvlText w:val="%8."/>
-      <w:lvlJc w:val="left"/>
-      <w:pPr>
-        <w:ind w:left="5760" w:hanging="360"/>
-      </w:pPr>
-    </w:lvl>
-    <w:lvl w:ilvl="8" w:tplc="0409001B" w:tentative="1">
-      <w:start w:val="1"/>
-      <w:numFmt w:val="lowerRoman"/>
-      <w:lvlText w:val="%9."/>
-      <w:lvlJc w:val="right"/>
-      <w:pPr>
-        <w:ind w:left="6480" w:hanging="180"/>
-      </w:pPr>
+      <w:isLgl/>
+      <w:lvlText w:val="%1.%2.%3"/>
+      <w:lvlJc w:val="left"/>
+      <w:pPr>
+        <w:ind w:left="1800" w:hanging="720"/>
+      </w:pPr>
+      <w:rPr>
+        <w:rFonts w:hint="default"/>
+      </w:rPr>
+    </w:lvl>
+    <w:lvl w:ilvl="3">
+      <w:start w:val="1"/>
+      <w:numFmt w:val="decimal"/>
+      <w:isLgl/>
+      <w:lvlText w:val="%1.%2.%3.%4"/>
+      <w:lvlJc w:val="left"/>
+      <w:pPr>
+        <w:ind w:left="2520" w:hanging="1080"/>
+      </w:pPr>
+      <w:rPr>
+        <w:rFonts w:hint="default"/>
+      </w:rPr>
+    </w:lvl>
+    <w:lvl w:ilvl="4">
+      <w:start w:val="1"/>
+      <w:numFmt w:val="decimal"/>
+      <w:isLgl/>
+      <w:lvlText w:val="%1.%2.%3.%4.%5"/>
+      <w:lvlJc w:val="left"/>
+      <w:pPr>
+        <w:ind w:left="2880" w:hanging="1080"/>
+      </w:pPr>
+      <w:rPr>
+        <w:rFonts w:hint="default"/>
+      </w:rPr>
+    </w:lvl>
+    <w:lvl w:ilvl="5">
+      <w:start w:val="1"/>
+      <w:numFmt w:val="decimal"/>
+      <w:isLgl/>
+      <w:lvlText w:val="%1.%2.%3.%4.%5.%6"/>
+      <w:lvlJc w:val="left"/>
+      <w:pPr>
+        <w:ind w:left="3600" w:hanging="1440"/>
+      </w:pPr>
+      <w:rPr>
+        <w:rFonts w:hint="default"/>
+      </w:rPr>
+    </w:lvl>
+    <w:lvl w:ilvl="6">
+      <w:start w:val="1"/>
+      <w:numFmt w:val="decimal"/>
+      <w:isLgl/>
+      <w:lvlText w:val="%1.%2.%3.%4.%5.%6.%7"/>
+      <w:lvlJc w:val="left"/>
+      <w:pPr>
+        <w:ind w:left="3960" w:hanging="1440"/>
+      </w:pPr>
+      <w:rPr>
+        <w:rFonts w:hint="default"/>
+      </w:rPr>
+    </w:lvl>
+    <w:lvl w:ilvl="7">
+      <w:start w:val="1"/>
+      <w:numFmt w:val="decimal"/>
+      <w:isLgl/>
+      <w:lvlText w:val="%1.%2.%3.%4.%5.%6.%7.%8"/>
+      <w:lvlJc w:val="left"/>
+      <w:pPr>
+        <w:ind w:left="4680" w:hanging="1800"/>
+      </w:pPr>
+      <w:rPr>
+        <w:rFonts w:hint="default"/>
+      </w:rPr>
+    </w:lvl>
+    <w:lvl w:ilvl="8">
+      <w:start w:val="1"/>
+      <w:numFmt w:val="decimal"/>
+      <w:isLgl/>
+      <w:lvlText w:val="%1.%2.%3.%4.%5.%6.%7.%8.%9"/>
+      <w:lvlJc w:val="left"/>
+      <w:pPr>
+        <w:ind w:left="5040" w:hanging="1800"/>
+      </w:pPr>
+      <w:rPr>
+        <w:rFonts w:hint="default"/>
+      </w:rPr>
     </w:lvl>
   </w:abstractNum>
-  <w:abstractNum w:abstractNumId="32" w15:restartNumberingAfterBreak="0">
+  <w:abstractNum w:abstractNumId="33" w15:restartNumberingAfterBreak="0">
     <w:nsid w:val="56FB2A2B"/>
     <w:multiLevelType w:val="multilevel"/>
     <w:tmpl w:val="D28E48CE"/>
@@ -16039,7 +14797,7 @@
       </w:pPr>
     </w:lvl>
   </w:abstractNum>
-  <w:abstractNum w:abstractNumId="33" w15:restartNumberingAfterBreak="0">
+  <w:abstractNum w:abstractNumId="34" w15:restartNumberingAfterBreak="0">
     <w:nsid w:val="5EED0403"/>
     <w:multiLevelType w:val="multilevel"/>
     <w:tmpl w:val="0E924536"/>
@@ -16188,7 +14946,7 @@
       </w:rPr>
     </w:lvl>
   </w:abstractNum>
-  <w:abstractNum w:abstractNumId="34" w15:restartNumberingAfterBreak="0">
+  <w:abstractNum w:abstractNumId="35" w15:restartNumberingAfterBreak="0">
     <w:nsid w:val="5F5C0673"/>
     <w:multiLevelType w:val="multilevel"/>
     <w:tmpl w:val="28A479CC"/>
@@ -16301,7 +15059,7 @@
       </w:pPr>
     </w:lvl>
   </w:abstractNum>
-  <w:abstractNum w:abstractNumId="35" w15:restartNumberingAfterBreak="0">
+  <w:abstractNum w:abstractNumId="36" w15:restartNumberingAfterBreak="0">
     <w:nsid w:val="623301C8"/>
     <w:multiLevelType w:val="multilevel"/>
     <w:tmpl w:val="EC78776C"/>
@@ -16450,7 +15208,7 @@
       </w:rPr>
     </w:lvl>
   </w:abstractNum>
-  <w:abstractNum w:abstractNumId="36" w15:restartNumberingAfterBreak="0">
+  <w:abstractNum w:abstractNumId="37" w15:restartNumberingAfterBreak="0">
     <w:nsid w:val="6FBD64E7"/>
     <w:multiLevelType w:val="multilevel"/>
     <w:tmpl w:val="8FB47834"/>
@@ -16599,7 +15357,7 @@
       </w:rPr>
     </w:lvl>
   </w:abstractNum>
-  <w:abstractNum w:abstractNumId="37" w15:restartNumberingAfterBreak="0">
+  <w:abstractNum w:abstractNumId="38" w15:restartNumberingAfterBreak="0">
     <w:nsid w:val="73486126"/>
     <w:multiLevelType w:val="multilevel"/>
     <w:tmpl w:val="7CF67BF4"/>
@@ -16748,7 +15506,7 @@
       </w:rPr>
     </w:lvl>
   </w:abstractNum>
-  <w:abstractNum w:abstractNumId="38" w15:restartNumberingAfterBreak="0">
+  <w:abstractNum w:abstractNumId="39" w15:restartNumberingAfterBreak="0">
     <w:nsid w:val="76DE677B"/>
     <w:multiLevelType w:val="multilevel"/>
     <w:tmpl w:val="2F66EBD0"/>
@@ -16897,7 +15655,7 @@
       </w:rPr>
     </w:lvl>
   </w:abstractNum>
-  <w:abstractNum w:abstractNumId="39" w15:restartNumberingAfterBreak="0">
+  <w:abstractNum w:abstractNumId="40" w15:restartNumberingAfterBreak="0">
     <w:nsid w:val="77F430F6"/>
     <w:multiLevelType w:val="hybridMultilevel"/>
     <w:tmpl w:val="E3B88D80"/>
@@ -16986,7 +15744,7 @@
       </w:pPr>
     </w:lvl>
   </w:abstractNum>
-  <w:abstractNum w:abstractNumId="40" w15:restartNumberingAfterBreak="0">
+  <w:abstractNum w:abstractNumId="41" w15:restartNumberingAfterBreak="0">
     <w:nsid w:val="77FB2860"/>
     <w:multiLevelType w:val="multilevel"/>
     <w:tmpl w:val="4770F676"/>
@@ -17135,7 +15893,7 @@
       </w:rPr>
     </w:lvl>
   </w:abstractNum>
-  <w:abstractNum w:abstractNumId="41" w15:restartNumberingAfterBreak="0">
+  <w:abstractNum w:abstractNumId="42" w15:restartNumberingAfterBreak="0">
     <w:nsid w:val="78262756"/>
     <w:multiLevelType w:val="multilevel"/>
     <w:tmpl w:val="B3320FAC"/>
@@ -17248,7 +16006,7 @@
       </w:pPr>
     </w:lvl>
   </w:abstractNum>
-  <w:abstractNum w:abstractNumId="42" w15:restartNumberingAfterBreak="0">
+  <w:abstractNum w:abstractNumId="43" w15:restartNumberingAfterBreak="0">
     <w:nsid w:val="7A0155EA"/>
     <w:multiLevelType w:val="multilevel"/>
     <w:tmpl w:val="73005E7A"/>
@@ -17361,7 +16119,209 @@
       </w:pPr>
     </w:lvl>
   </w:abstractNum>
-  <w:abstractNum w:abstractNumId="43" w15:restartNumberingAfterBreak="0">
+  <w:abstractNum w:abstractNumId="44" w15:restartNumberingAfterBreak="0">
+    <w:nsid w:val="7BAF4B1A"/>
+    <w:multiLevelType w:val="hybridMultilevel"/>
+    <w:tmpl w:val="B060FB44"/>
+    <w:lvl w:ilvl="0" w:tplc="04090001">
+      <w:start w:val="1"/>
+      <w:numFmt w:val="bullet"/>
+      <w:lvlText w:val=""/>
+      <w:lvlJc w:val="left"/>
+      <w:pPr>
+        <w:ind w:left="1440" w:hanging="360"/>
+      </w:pPr>
+      <w:rPr>
+        <w:rFonts w:ascii="Symbol" w:hAnsi="Symbol" w:hint="default"/>
+      </w:rPr>
+    </w:lvl>
+    <w:lvl w:ilvl="1" w:tplc="04090003" w:tentative="1">
+      <w:start w:val="1"/>
+      <w:numFmt w:val="bullet"/>
+      <w:lvlText w:val="o"/>
+      <w:lvlJc w:val="left"/>
+      <w:pPr>
+        <w:ind w:left="2160" w:hanging="360"/>
+      </w:pPr>
+      <w:rPr>
+        <w:rFonts w:ascii="Courier New" w:hAnsi="Courier New" w:cs="Courier New" w:hint="default"/>
+      </w:rPr>
+    </w:lvl>
+    <w:lvl w:ilvl="2" w:tplc="04090005" w:tentative="1">
+      <w:start w:val="1"/>
+      <w:numFmt w:val="bullet"/>
+      <w:lvlText w:val=""/>
+      <w:lvlJc w:val="left"/>
+      <w:pPr>
+        <w:ind w:left="2880" w:hanging="360"/>
+      </w:pPr>
+      <w:rPr>
+        <w:rFonts w:ascii="Wingdings" w:hAnsi="Wingdings" w:hint="default"/>
+      </w:rPr>
+    </w:lvl>
+    <w:lvl w:ilvl="3" w:tplc="04090001" w:tentative="1">
+      <w:start w:val="1"/>
+      <w:numFmt w:val="bullet"/>
+      <w:lvlText w:val=""/>
+      <w:lvlJc w:val="left"/>
+      <w:pPr>
+        <w:ind w:left="3600" w:hanging="360"/>
+      </w:pPr>
+      <w:rPr>
+        <w:rFonts w:ascii="Symbol" w:hAnsi="Symbol" w:hint="default"/>
+      </w:rPr>
+    </w:lvl>
+    <w:lvl w:ilvl="4" w:tplc="04090003" w:tentative="1">
+      <w:start w:val="1"/>
+      <w:numFmt w:val="bullet"/>
+      <w:lvlText w:val="o"/>
+      <w:lvlJc w:val="left"/>
+      <w:pPr>
+        <w:ind w:left="4320" w:hanging="360"/>
+      </w:pPr>
+      <w:rPr>
+        <w:rFonts w:ascii="Courier New" w:hAnsi="Courier New" w:cs="Courier New" w:hint="default"/>
+      </w:rPr>
+    </w:lvl>
+    <w:lvl w:ilvl="5" w:tplc="04090005" w:tentative="1">
+      <w:start w:val="1"/>
+      <w:numFmt w:val="bullet"/>
+      <w:lvlText w:val=""/>
+      <w:lvlJc w:val="left"/>
+      <w:pPr>
+        <w:ind w:left="5040" w:hanging="360"/>
+      </w:pPr>
+      <w:rPr>
+        <w:rFonts w:ascii="Wingdings" w:hAnsi="Wingdings" w:hint="default"/>
+      </w:rPr>
+    </w:lvl>
+    <w:lvl w:ilvl="6" w:tplc="04090001" w:tentative="1">
+      <w:start w:val="1"/>
+      <w:numFmt w:val="bullet"/>
+      <w:lvlText w:val=""/>
+      <w:lvlJc w:val="left"/>
+      <w:pPr>
+        <w:ind w:left="5760" w:hanging="360"/>
+      </w:pPr>
+      <w:rPr>
+        <w:rFonts w:ascii="Symbol" w:hAnsi="Symbol" w:hint="default"/>
+      </w:rPr>
+    </w:lvl>
+    <w:lvl w:ilvl="7" w:tplc="04090003" w:tentative="1">
+      <w:start w:val="1"/>
+      <w:numFmt w:val="bullet"/>
+      <w:lvlText w:val="o"/>
+      <w:lvlJc w:val="left"/>
+      <w:pPr>
+        <w:ind w:left="6480" w:hanging="360"/>
+      </w:pPr>
+      <w:rPr>
+        <w:rFonts w:ascii="Courier New" w:hAnsi="Courier New" w:cs="Courier New" w:hint="default"/>
+      </w:rPr>
+    </w:lvl>
+    <w:lvl w:ilvl="8" w:tplc="04090005" w:tentative="1">
+      <w:start w:val="1"/>
+      <w:numFmt w:val="bullet"/>
+      <w:lvlText w:val=""/>
+      <w:lvlJc w:val="left"/>
+      <w:pPr>
+        <w:ind w:left="7200" w:hanging="360"/>
+      </w:pPr>
+      <w:rPr>
+        <w:rFonts w:ascii="Wingdings" w:hAnsi="Wingdings" w:hint="default"/>
+      </w:rPr>
+    </w:lvl>
+  </w:abstractNum>
+  <w:abstractNum w:abstractNumId="45" w15:restartNumberingAfterBreak="0">
+    <w:nsid w:val="7D3819B5"/>
+    <w:multiLevelType w:val="hybridMultilevel"/>
+    <w:tmpl w:val="CAE4149C"/>
+    <w:lvl w:ilvl="0" w:tplc="EAE4AD48">
+      <w:start w:val="1"/>
+      <w:numFmt w:val="decimal"/>
+      <w:lvlText w:val="%1."/>
+      <w:lvlJc w:val="left"/>
+      <w:pPr>
+        <w:ind w:left="1080" w:hanging="360"/>
+      </w:pPr>
+      <w:rPr>
+        <w:rFonts w:asciiTheme="majorBidi" w:hAnsiTheme="majorBidi" w:cstheme="majorBidi" w:hint="default"/>
+      </w:rPr>
+    </w:lvl>
+    <w:lvl w:ilvl="1" w:tplc="04090019" w:tentative="1">
+      <w:start w:val="1"/>
+      <w:numFmt w:val="lowerLetter"/>
+      <w:lvlText w:val="%2."/>
+      <w:lvlJc w:val="left"/>
+      <w:pPr>
+        <w:ind w:left="1800" w:hanging="360"/>
+      </w:pPr>
+    </w:lvl>
+    <w:lvl w:ilvl="2" w:tplc="0409001B" w:tentative="1">
+      <w:start w:val="1"/>
+      <w:numFmt w:val="lowerRoman"/>
+      <w:lvlText w:val="%3."/>
+      <w:lvlJc w:val="right"/>
+      <w:pPr>
+        <w:ind w:left="2520" w:hanging="180"/>
+      </w:pPr>
+    </w:lvl>
+    <w:lvl w:ilvl="3" w:tplc="0409000F" w:tentative="1">
+      <w:start w:val="1"/>
+      <w:numFmt w:val="decimal"/>
+      <w:lvlText w:val="%4."/>
+      <w:lvlJc w:val="left"/>
+      <w:pPr>
+        <w:ind w:left="3240" w:hanging="360"/>
+      </w:pPr>
+    </w:lvl>
+    <w:lvl w:ilvl="4" w:tplc="04090019" w:tentative="1">
+      <w:start w:val="1"/>
+      <w:numFmt w:val="lowerLetter"/>
+      <w:lvlText w:val="%5."/>
+      <w:lvlJc w:val="left"/>
+      <w:pPr>
+        <w:ind w:left="3960" w:hanging="360"/>
+      </w:pPr>
+    </w:lvl>
+    <w:lvl w:ilvl="5" w:tplc="0409001B" w:tentative="1">
+      <w:start w:val="1"/>
+      <w:numFmt w:val="lowerRoman"/>
+      <w:lvlText w:val="%6."/>
+      <w:lvlJc w:val="right"/>
+      <w:pPr>
+        <w:ind w:left="4680" w:hanging="180"/>
+      </w:pPr>
+    </w:lvl>
+    <w:lvl w:ilvl="6" w:tplc="0409000F" w:tentative="1">
+      <w:start w:val="1"/>
+      <w:numFmt w:val="decimal"/>
+      <w:lvlText w:val="%7."/>
+      <w:lvlJc w:val="left"/>
+      <w:pPr>
+        <w:ind w:left="5400" w:hanging="360"/>
+      </w:pPr>
+    </w:lvl>
+    <w:lvl w:ilvl="7" w:tplc="04090019" w:tentative="1">
+      <w:start w:val="1"/>
+      <w:numFmt w:val="lowerLetter"/>
+      <w:lvlText w:val="%8."/>
+      <w:lvlJc w:val="left"/>
+      <w:pPr>
+        <w:ind w:left="6120" w:hanging="360"/>
+      </w:pPr>
+    </w:lvl>
+    <w:lvl w:ilvl="8" w:tplc="0409001B" w:tentative="1">
+      <w:start w:val="1"/>
+      <w:numFmt w:val="lowerRoman"/>
+      <w:lvlText w:val="%9."/>
+      <w:lvlJc w:val="right"/>
+      <w:pPr>
+        <w:ind w:left="6840" w:hanging="180"/>
+      </w:pPr>
+    </w:lvl>
+  </w:abstractNum>
+  <w:abstractNum w:abstractNumId="46" w15:restartNumberingAfterBreak="0">
     <w:nsid w:val="7ED632BF"/>
     <w:multiLevelType w:val="multilevel"/>
     <w:tmpl w:val="F6F017CC"/>
@@ -17511,88 +16471,88 @@
     </w:lvl>
   </w:abstractNum>
   <w:num w:numId="1" w16cid:durableId="548151899">
-    <w:abstractNumId w:val="16"/>
+    <w:abstractNumId w:val="17"/>
   </w:num>
   <w:num w:numId="2" w16cid:durableId="1449006039">
-    <w:abstractNumId w:val="12"/>
+    <w:abstractNumId w:val="13"/>
   </w:num>
   <w:num w:numId="3" w16cid:durableId="31152161">
-    <w:abstractNumId w:val="28"/>
+    <w:abstractNumId w:val="29"/>
   </w:num>
   <w:num w:numId="4" w16cid:durableId="2062895452">
-    <w:abstractNumId w:val="39"/>
+    <w:abstractNumId w:val="40"/>
   </w:num>
   <w:num w:numId="5" w16cid:durableId="949896522">
-    <w:abstractNumId w:val="31"/>
+    <w:abstractNumId w:val="32"/>
   </w:num>
   <w:num w:numId="6" w16cid:durableId="543445449">
-    <w:abstractNumId w:val="14"/>
+    <w:abstractNumId w:val="15"/>
   </w:num>
   <w:num w:numId="7" w16cid:durableId="803498329">
-    <w:abstractNumId w:val="32"/>
+    <w:abstractNumId w:val="33"/>
   </w:num>
   <w:num w:numId="8" w16cid:durableId="1874151505">
-    <w:abstractNumId w:val="22"/>
+    <w:abstractNumId w:val="23"/>
   </w:num>
   <w:num w:numId="9" w16cid:durableId="705839741">
     <w:abstractNumId w:val="10"/>
   </w:num>
   <w:num w:numId="10" w16cid:durableId="1293827610">
-    <w:abstractNumId w:val="41"/>
+    <w:abstractNumId w:val="42"/>
   </w:num>
   <w:num w:numId="11" w16cid:durableId="1218130318">
-    <w:abstractNumId w:val="18"/>
+    <w:abstractNumId w:val="19"/>
   </w:num>
   <w:num w:numId="12" w16cid:durableId="336346935">
     <w:abstractNumId w:val="9"/>
   </w:num>
   <w:num w:numId="13" w16cid:durableId="767503906">
-    <w:abstractNumId w:val="43"/>
+    <w:abstractNumId w:val="46"/>
   </w:num>
   <w:num w:numId="14" w16cid:durableId="604002169">
     <w:abstractNumId w:val="7"/>
   </w:num>
   <w:num w:numId="15" w16cid:durableId="51393543">
-    <w:abstractNumId w:val="42"/>
+    <w:abstractNumId w:val="43"/>
   </w:num>
   <w:num w:numId="16" w16cid:durableId="94594747">
-    <w:abstractNumId w:val="20"/>
+    <w:abstractNumId w:val="21"/>
   </w:num>
   <w:num w:numId="17" w16cid:durableId="1947037119">
-    <w:abstractNumId w:val="36"/>
+    <w:abstractNumId w:val="37"/>
   </w:num>
   <w:num w:numId="18" w16cid:durableId="1183318972">
     <w:abstractNumId w:val="2"/>
   </w:num>
   <w:num w:numId="19" w16cid:durableId="1903708170">
-    <w:abstractNumId w:val="37"/>
+    <w:abstractNumId w:val="38"/>
   </w:num>
   <w:num w:numId="20" w16cid:durableId="242642197">
-    <w:abstractNumId w:val="17"/>
+    <w:abstractNumId w:val="18"/>
   </w:num>
   <w:num w:numId="21" w16cid:durableId="713819342">
-    <w:abstractNumId w:val="11"/>
+    <w:abstractNumId w:val="12"/>
   </w:num>
   <w:num w:numId="22" w16cid:durableId="840704383">
     <w:abstractNumId w:val="6"/>
   </w:num>
   <w:num w:numId="23" w16cid:durableId="825777938">
-    <w:abstractNumId w:val="21"/>
+    <w:abstractNumId w:val="22"/>
   </w:num>
   <w:num w:numId="24" w16cid:durableId="139881299">
-    <w:abstractNumId w:val="30"/>
+    <w:abstractNumId w:val="31"/>
   </w:num>
   <w:num w:numId="25" w16cid:durableId="1650359837">
-    <w:abstractNumId w:val="40"/>
+    <w:abstractNumId w:val="41"/>
   </w:num>
   <w:num w:numId="26" w16cid:durableId="1714816328">
+    <w:abstractNumId w:val="27"/>
+  </w:num>
+  <w:num w:numId="27" w16cid:durableId="75250526">
     <w:abstractNumId w:val="26"/>
   </w:num>
-  <w:num w:numId="27" w16cid:durableId="75250526">
+  <w:num w:numId="28" w16cid:durableId="1483691169">
     <w:abstractNumId w:val="25"/>
-  </w:num>
-  <w:num w:numId="28" w16cid:durableId="1483691169">
-    <w:abstractNumId w:val="24"/>
   </w:num>
   <w:num w:numId="29" w16cid:durableId="1360818939">
     <w:abstractNumId w:val="1"/>
@@ -17604,16 +16564,16 @@
     <w:abstractNumId w:val="0"/>
   </w:num>
   <w:num w:numId="32" w16cid:durableId="1815558953">
-    <w:abstractNumId w:val="35"/>
+    <w:abstractNumId w:val="36"/>
   </w:num>
   <w:num w:numId="33" w16cid:durableId="1074818736">
-    <w:abstractNumId w:val="33"/>
+    <w:abstractNumId w:val="34"/>
   </w:num>
   <w:num w:numId="34" w16cid:durableId="69468294">
-    <w:abstractNumId w:val="27"/>
+    <w:abstractNumId w:val="28"/>
   </w:num>
   <w:num w:numId="35" w16cid:durableId="1614632655">
-    <w:abstractNumId w:val="23"/>
+    <w:abstractNumId w:val="24"/>
   </w:num>
   <w:num w:numId="36" w16cid:durableId="1155683898">
     <w:abstractNumId w:val="3"/>
@@ -17622,25 +16582,34 @@
     <w:abstractNumId w:val="5"/>
   </w:num>
   <w:num w:numId="38" w16cid:durableId="2084138561">
-    <w:abstractNumId w:val="13"/>
+    <w:abstractNumId w:val="14"/>
   </w:num>
   <w:num w:numId="39" w16cid:durableId="2094205310">
-    <w:abstractNumId w:val="34"/>
+    <w:abstractNumId w:val="35"/>
   </w:num>
   <w:num w:numId="40" w16cid:durableId="1159228363">
-    <w:abstractNumId w:val="29"/>
+    <w:abstractNumId w:val="30"/>
   </w:num>
   <w:num w:numId="41" w16cid:durableId="514149011">
-    <w:abstractNumId w:val="15"/>
+    <w:abstractNumId w:val="16"/>
   </w:num>
   <w:num w:numId="42" w16cid:durableId="1478449399">
-    <w:abstractNumId w:val="19"/>
+    <w:abstractNumId w:val="20"/>
   </w:num>
   <w:num w:numId="43" w16cid:durableId="570316981">
-    <w:abstractNumId w:val="38"/>
+    <w:abstractNumId w:val="39"/>
   </w:num>
   <w:num w:numId="44" w16cid:durableId="1115753565">
     <w:abstractNumId w:val="8"/>
+  </w:num>
+  <w:num w:numId="45" w16cid:durableId="1879732698">
+    <w:abstractNumId w:val="44"/>
+  </w:num>
+  <w:num w:numId="46" w16cid:durableId="1144354124">
+    <w:abstractNumId w:val="11"/>
+  </w:num>
+  <w:num w:numId="47" w16cid:durableId="327056989">
+    <w:abstractNumId w:val="45"/>
   </w:num>
 </w:numbering>
 </file>

</xml_diff>